<commit_message>
feat: update project synopsis and initialize smart-pdf-editor extension package
</commit_message>
<xml_diff>
--- a/Ascent_AI_Project_Synopsis.docx
+++ b/Ascent_AI_Project_Synopsis.docx
@@ -680,1597 +680,1224 @@
     </w:p>
     <w:p>
       <w:pPr>
-        <w:spacing w:after="120"/>
-        <w:jc w:val="both"/>
-        <w:rPr>
-          <w:sz w:val="32"/>
-          <w:szCs w:val="32"/>
-        </w:rPr>
-      </w:pPr>
-      <w:r>
-        <w:rPr>
+        <w:keepNext/>
+        <w:spacing w:before="360" w:after="120"/>
+      </w:pPr>
+      <w:r>
+        <w:rPr>
+          <w:rFonts w:ascii="Arial" w:hAnsi="Arial"/>
           <w:b/>
-          <w:bCs/>
-          <w:sz w:val="32"/>
-          <w:szCs w:val="32"/>
-        </w:rPr>
-        <w:t>ASCENT.AI</w:t>
-      </w:r>
-      <w:r>
-        <w:t xml:space="preserve"> </w:t>
-      </w:r>
-      <w:r>
-        <w:rPr>
-          <w:sz w:val="32"/>
-          <w:szCs w:val="32"/>
-        </w:rPr>
-        <w:t>–</w:t>
-      </w:r>
-      <w:r>
-        <w:t xml:space="preserve"> </w:t>
-      </w:r>
-      <w:r>
-        <w:rPr>
-          <w:sz w:val="32"/>
-          <w:szCs w:val="32"/>
-        </w:rPr>
-        <w:t>From Idea to Implementation: An AI-Powered Project-Based Coding Education Platform</w:t>
+          <w:sz w:val="24"/>
+        </w:rPr>
+        <w:t>1. TITLE OF THE PROJECT:-</w:t>
       </w:r>
     </w:p>
     <w:p>
       <w:pPr>
-        <w:spacing w:before="200" w:after="100"/>
-        <w:rPr>
-          <w:sz w:val="36"/>
-          <w:szCs w:val="36"/>
-        </w:rPr>
-      </w:pPr>
-      <w:r>
-        <w:rPr>
-          <w:b/>
-          <w:sz w:val="36"/>
-          <w:szCs w:val="36"/>
-        </w:rPr>
-        <w:t xml:space="preserve">2. OBJECTIVE OF THE </w:t>
-      </w:r>
-      <w:proofErr w:type="gramStart"/>
-      <w:r>
-        <w:rPr>
-          <w:b/>
-          <w:sz w:val="36"/>
-          <w:szCs w:val="36"/>
-        </w:rPr>
-        <w:t>PROJECT :</w:t>
-      </w:r>
-      <w:proofErr w:type="gramEnd"/>
-      <w:r>
-        <w:rPr>
-          <w:b/>
-          <w:sz w:val="36"/>
-          <w:szCs w:val="36"/>
-        </w:rPr>
-        <w:t>-</w:t>
+        <w:spacing w:after="120" w:line="276" w:lineRule="auto"/>
+      </w:pPr>
+      <w:r>
+        <w:rPr>
+          <w:rFonts w:ascii="Arial" w:hAnsi="Arial"/>
+          <w:sz w:val="22"/>
+        </w:rPr>
+        <w:t>ASCENT.AI – From Idea to Implementation: An AI-Driven Educational Ecosystem for Project-Based Software Development and Active Pedagogy</w:t>
       </w:r>
     </w:p>
     <w:p>
       <w:pPr>
-        <w:spacing w:after="120"/>
-        <w:jc w:val="both"/>
-        <w:rPr>
-          <w:sz w:val="32"/>
-          <w:szCs w:val="32"/>
-        </w:rPr>
-      </w:pPr>
-      <w:r>
-        <w:rPr>
-          <w:sz w:val="32"/>
-          <w:szCs w:val="32"/>
-        </w:rPr>
-        <w:t xml:space="preserve">The primary objective of Ascent.ai is to develop an AI-powered coding education platform that helps learners move from </w:t>
-      </w:r>
-      <w:r>
-        <w:rPr>
-          <w:sz w:val="32"/>
-          <w:szCs w:val="32"/>
-        </w:rPr>
-        <w:t>an initial project idea to a working, explainable implementation. Instead of relying on generic tutorials, the platform teaches programming concepts at the exact point where they are required to build the learner's selected project.</w:t>
+        <w:keepNext/>
+        <w:spacing w:before="360" w:after="120"/>
+      </w:pPr>
+      <w:r>
+        <w:rPr>
+          <w:rFonts w:ascii="Arial" w:hAnsi="Arial"/>
+          <w:b/>
+          <w:sz w:val="24"/>
+        </w:rPr>
+        <w:t>2. OBJECTIVE OF THE PROJECT:-</w:t>
       </w:r>
     </w:p>
     <w:p>
       <w:pPr>
-        <w:spacing w:after="120"/>
-        <w:jc w:val="both"/>
-        <w:rPr>
-          <w:sz w:val="32"/>
-          <w:szCs w:val="32"/>
-        </w:rPr>
-      </w:pPr>
-      <w:r>
-        <w:rPr>
-          <w:sz w:val="32"/>
-          <w:szCs w:val="32"/>
-        </w:rPr>
-        <w:t>The system allows a lea</w:t>
-      </w:r>
-      <w:r>
-        <w:rPr>
-          <w:sz w:val="32"/>
-          <w:szCs w:val="32"/>
-        </w:rPr>
-        <w:t>rner to describe a project in natural language or select a project type and technology stack through a guided interface. The AI then analyzes the requested project, creates a practical roadmap of screens or pages, and converts the components of those scree</w:t>
-      </w:r>
-      <w:r>
-        <w:rPr>
-          <w:sz w:val="32"/>
-          <w:szCs w:val="32"/>
-        </w:rPr>
-        <w:t>ns into personalized learning modules.</w:t>
+        <w:spacing w:after="120" w:line="276" w:lineRule="auto"/>
+      </w:pPr>
+      <w:r>
+        <w:rPr>
+          <w:rFonts w:ascii="Arial" w:hAnsi="Arial"/>
+          <w:sz w:val="22"/>
+        </w:rPr>
+        <w:t>The primary objective of Ascent.ai is to engineer a state-of-the-art, AI-powered coding education platform that bridges the gap between passive tutorial completion and active, production-ready software implementation. The platform's objectives are detailed below:</w:t>
       </w:r>
     </w:p>
     <w:p>
       <w:pPr>
-        <w:spacing w:after="120"/>
-        <w:jc w:val="both"/>
-        <w:rPr>
-          <w:sz w:val="32"/>
-          <w:szCs w:val="32"/>
-        </w:rPr>
-      </w:pPr>
-      <w:r>
-        <w:rPr>
-          <w:sz w:val="32"/>
-          <w:szCs w:val="32"/>
-        </w:rPr>
-        <w:t>Another major objective is to follow a teach-then-build approach. Learners first understand a concept and then implement that concept themselves. Hints are intended to be provided before complete answers, and automate</w:t>
-      </w:r>
-      <w:r>
-        <w:rPr>
-          <w:sz w:val="32"/>
-          <w:szCs w:val="32"/>
-        </w:rPr>
-        <w:t>d tests can be used to verify progress. The ultimate objective is for the learner to finish with both improved coding knowledge and a functional project.</w:t>
+        <w:pStyle w:val="ListBullet"/>
+        <w:spacing w:after="80" w:line="276" w:lineRule="auto"/>
+      </w:pPr>
+      <w:r>
+        <w:rPr>
+          <w:rFonts w:ascii="Arial" w:hAnsi="Arial"/>
+          <w:b/>
+          <w:sz w:val="22"/>
+        </w:rPr>
+        <w:t xml:space="preserve">Mitigate 'Tutorial Hell': </w:t>
+      </w:r>
+      <w:r>
+        <w:rPr>
+          <w:rFonts w:ascii="Arial" w:hAnsi="Arial"/>
+          <w:sz w:val="22"/>
+        </w:rPr>
+        <w:t>Eliminate the common trap where students reproduce working code step-by-step from videos but fail to build independent applications afterward.</w:t>
       </w:r>
     </w:p>
     <w:p>
       <w:pPr>
-        <w:spacing w:before="200" w:after="100"/>
-        <w:rPr>
-          <w:sz w:val="36"/>
-          <w:szCs w:val="36"/>
-        </w:rPr>
-      </w:pPr>
-      <w:r>
-        <w:rPr>
+        <w:pStyle w:val="ListBullet"/>
+        <w:spacing w:after="80" w:line="276" w:lineRule="auto"/>
+      </w:pPr>
+      <w:r>
+        <w:rPr>
+          <w:rFonts w:ascii="Arial" w:hAnsi="Arial"/>
           <w:b/>
-          <w:sz w:val="36"/>
-          <w:szCs w:val="36"/>
-        </w:rPr>
-        <w:t xml:space="preserve">3. PROJECT </w:t>
-      </w:r>
-      <w:proofErr w:type="gramStart"/>
-      <w:r>
-        <w:rPr>
-          <w:b/>
-          <w:sz w:val="36"/>
-          <w:szCs w:val="36"/>
-        </w:rPr>
-        <w:t>DESCRIPTION :</w:t>
-      </w:r>
-      <w:proofErr w:type="gramEnd"/>
-      <w:r>
-        <w:rPr>
-          <w:b/>
-          <w:sz w:val="36"/>
-          <w:szCs w:val="36"/>
-        </w:rPr>
-        <w:t>-</w:t>
+          <w:sz w:val="22"/>
+        </w:rPr>
+        <w:t xml:space="preserve">Active 'Teach-Then-Build' Pedagogy: </w:t>
+      </w:r>
+      <w:r>
+        <w:rPr>
+          <w:rFonts w:ascii="Arial" w:hAnsi="Arial"/>
+          <w:sz w:val="22"/>
+        </w:rPr>
+        <w:t>Enforce a sequence where the educational concept is taught first, followed by hands-on execution by the learner, preventing the AI from writing the code for the student.</w:t>
       </w:r>
     </w:p>
     <w:p>
       <w:pPr>
-        <w:spacing w:after="120"/>
-        <w:jc w:val="both"/>
-        <w:rPr>
-          <w:sz w:val="32"/>
-          <w:szCs w:val="32"/>
-        </w:rPr>
-      </w:pPr>
-      <w:r>
-        <w:rPr>
-          <w:sz w:val="32"/>
-          <w:szCs w:val="32"/>
-        </w:rPr>
-        <w:t>Ascent.ai is an educational web application designed to solve a common probl</w:t>
-      </w:r>
-      <w:r>
-        <w:rPr>
-          <w:sz w:val="32"/>
-          <w:szCs w:val="32"/>
-        </w:rPr>
-        <w:t>em in self-taught programming known as tutorial hell. In conventional learning, students may understand individual tutorials but struggle to combine those concepts into a complete real-world application. Ascent.ai addresses this problem by connecting every</w:t>
-      </w:r>
-      <w:r>
-        <w:rPr>
-          <w:sz w:val="32"/>
-          <w:szCs w:val="32"/>
-        </w:rPr>
-        <w:t xml:space="preserve"> learning concept to a concrete part of a project the learner actually wants to build.</w:t>
+        <w:pStyle w:val="ListBullet"/>
+        <w:spacing w:after="80" w:line="276" w:lineRule="auto"/>
+      </w:pPr>
+      <w:r>
+        <w:rPr>
+          <w:rFonts w:ascii="Arial" w:hAnsi="Arial"/>
+          <w:b/>
+          <w:sz w:val="22"/>
+        </w:rPr>
+        <w:t xml:space="preserve">Dynamic, Screen-Based Curricula: </w:t>
+      </w:r>
+      <w:r>
+        <w:rPr>
+          <w:rFonts w:ascii="Arial" w:hAnsi="Arial"/>
+          <w:sz w:val="22"/>
+        </w:rPr>
+        <w:t>Generate a structured, non-linear roadmap based on a user's natural language project description, teaching relevant concepts in synchronization with physical frontend layout screens.</w:t>
       </w:r>
     </w:p>
     <w:p>
       <w:pPr>
-        <w:spacing w:after="120"/>
-        <w:jc w:val="both"/>
-        <w:rPr>
-          <w:sz w:val="32"/>
-          <w:szCs w:val="32"/>
-        </w:rPr>
-      </w:pPr>
-      <w:r>
-        <w:rPr>
-          <w:sz w:val="32"/>
-          <w:szCs w:val="32"/>
-        </w:rPr>
-        <w:t>The learner begins by entering a project idea such as an e-commerce website or another application and may specify the desired technology stack. The AI analyzes the requ</w:t>
-      </w:r>
-      <w:r>
-        <w:rPr>
-          <w:sz w:val="32"/>
-          <w:szCs w:val="32"/>
-        </w:rPr>
-        <w:t xml:space="preserve">est and proposes a realistic version of the </w:t>
-      </w:r>
-      <w:r>
-        <w:rPr>
-          <w:sz w:val="32"/>
-          <w:szCs w:val="32"/>
-        </w:rPr>
-        <w:lastRenderedPageBreak/>
-        <w:t>project. It then decomposes the application into a sequence of screens or pages. For each screen, the system identifies teachable components and generates learning modules covering the concepts required to implem</w:t>
-      </w:r>
-      <w:r>
-        <w:rPr>
-          <w:sz w:val="32"/>
-          <w:szCs w:val="32"/>
-        </w:rPr>
-        <w:t>ent them.</w:t>
+        <w:pStyle w:val="ListBullet"/>
+        <w:spacing w:after="80" w:line="276" w:lineRule="auto"/>
+      </w:pPr>
+      <w:r>
+        <w:rPr>
+          <w:rFonts w:ascii="Arial" w:hAnsi="Arial"/>
+          <w:b/>
+          <w:sz w:val="22"/>
+        </w:rPr>
+        <w:t xml:space="preserve">Automated Progression Gates: </w:t>
+      </w:r>
+      <w:r>
+        <w:rPr>
+          <w:rFonts w:ascii="Arial" w:hAnsi="Arial"/>
+          <w:sz w:val="22"/>
+        </w:rPr>
+        <w:t>Incorporate client-side and server-side unit-testing sandboxes that validate student submissions, ensuring core requirements are met before unlocking subsequent syllabus modules.</w:t>
       </w:r>
     </w:p>
     <w:p>
       <w:pPr>
-        <w:spacing w:after="120"/>
-        <w:jc w:val="both"/>
-        <w:rPr>
-          <w:sz w:val="32"/>
-          <w:szCs w:val="32"/>
-        </w:rPr>
-      </w:pPr>
-      <w:r>
-        <w:rPr>
-          <w:sz w:val="32"/>
-          <w:szCs w:val="32"/>
-        </w:rPr>
-        <w:t xml:space="preserve">The learner progresses through a screen-by-screen curriculum. Each module contains a concept explanation followed by hands-on implementation. The project gradually develops as the learner writes the code. A basic-to-advanced difficulty ladder is </w:t>
-      </w:r>
-      <w:r>
-        <w:rPr>
-          <w:sz w:val="32"/>
-          <w:szCs w:val="32"/>
-        </w:rPr>
-        <w:t>followed: first the screen can be rendered using simple or hardcoded data, then real state and APIs can be connected, and finally loading states, errors, and edge cases can be handled.</w:t>
+        <w:keepNext/>
+        <w:spacing w:before="360" w:after="120"/>
+      </w:pPr>
+      <w:r>
+        <w:rPr>
+          <w:rFonts w:ascii="Arial" w:hAnsi="Arial"/>
+          <w:b/>
+          <w:sz w:val="24"/>
+        </w:rPr>
+        <w:t>3. PROJECT DESCRIPTION:-</w:t>
       </w:r>
     </w:p>
     <w:p>
       <w:pPr>
-        <w:spacing w:after="120"/>
-        <w:jc w:val="both"/>
-        <w:rPr>
-          <w:sz w:val="32"/>
-          <w:szCs w:val="32"/>
-        </w:rPr>
-      </w:pPr>
-      <w:r>
-        <w:rPr>
-          <w:sz w:val="32"/>
-          <w:szCs w:val="32"/>
-        </w:rPr>
-        <w:t>The platform is intended to provide an in-browser coding environment wi</w:t>
-      </w:r>
-      <w:r>
-        <w:rPr>
-          <w:sz w:val="32"/>
-          <w:szCs w:val="32"/>
-        </w:rPr>
-        <w:t>th a live preview or sandbox so that learners can implement and test their work. The project flow continues screen by screen until all planned screens are completed and the learner has a finished project.</w:t>
+        <w:spacing w:after="120" w:line="276" w:lineRule="auto"/>
+      </w:pPr>
+      <w:r>
+        <w:rPr>
+          <w:rFonts w:ascii="Arial" w:hAnsi="Arial"/>
+          <w:sz w:val="22"/>
+        </w:rPr>
+        <w:t>Ascent.ai is an educational web portal that transforms how programming languages and full-stack frameworks are taught. Unlike traditional learning management systems that present static, predefined course flows, Ascent.ai treats the student's personal project idea as the root of the entire curriculum. Upon inputting a direct prompt (e.g., 'E-commerce platform using React') or selecting options via a guided wizard (project archetype, styling frameworks, database choices), the backend orchestrates a comprehensive learning roadmap.</w:t>
       </w:r>
     </w:p>
     <w:p>
       <w:pPr>
-        <w:spacing w:before="200" w:after="100"/>
-        <w:rPr>
-          <w:sz w:val="36"/>
-          <w:szCs w:val="36"/>
-        </w:rPr>
-      </w:pPr>
-      <w:r>
-        <w:rPr>
-          <w:b/>
-          <w:sz w:val="36"/>
-          <w:szCs w:val="36"/>
-        </w:rPr>
-        <w:t xml:space="preserve">4. SYSTEM </w:t>
-      </w:r>
-      <w:proofErr w:type="gramStart"/>
-      <w:r>
-        <w:rPr>
-          <w:b/>
-          <w:sz w:val="36"/>
-          <w:szCs w:val="36"/>
-        </w:rPr>
-        <w:t>OVERVIEW :</w:t>
-      </w:r>
-      <w:proofErr w:type="gramEnd"/>
-      <w:r>
-        <w:rPr>
-          <w:b/>
-          <w:sz w:val="36"/>
-          <w:szCs w:val="36"/>
-        </w:rPr>
-        <w:t>-</w:t>
+        <w:spacing w:after="120" w:line="276" w:lineRule="auto"/>
+      </w:pPr>
+      <w:r>
+        <w:rPr>
+          <w:rFonts w:ascii="Arial" w:hAnsi="Arial"/>
+          <w:sz w:val="22"/>
+        </w:rPr>
+        <w:t>The project is structured around 'vertical-slice development,' ensuring that learners construct a working prototype early in the cycle and deepen it over time. Progression follows a strict difficulty ladder within each page or screen:</w:t>
       </w:r>
     </w:p>
     <w:p>
       <w:pPr>
-        <w:spacing w:after="120"/>
-        <w:jc w:val="both"/>
-        <w:rPr>
-          <w:sz w:val="32"/>
-          <w:szCs w:val="32"/>
-        </w:rPr>
-      </w:pPr>
-      <w:r>
-        <w:rPr>
-          <w:sz w:val="32"/>
-          <w:szCs w:val="32"/>
-        </w:rPr>
-        <w:t>The Ascent.ai system begins w</w:t>
-      </w:r>
-      <w:r>
-        <w:rPr>
-          <w:sz w:val="32"/>
-          <w:szCs w:val="32"/>
-        </w:rPr>
-        <w:t>ith a landing screen containing a project prompt and quick-start options for common project types and technology stacks. The user's input is sent to the AI course-generation system. The AI plans the application by decomposing it into a roadmap of screens o</w:t>
-      </w:r>
-      <w:r>
-        <w:rPr>
-          <w:sz w:val="32"/>
-          <w:szCs w:val="32"/>
-        </w:rPr>
-        <w:t>r pages.</w:t>
+        <w:pStyle w:val="ListBullet"/>
+        <w:spacing w:after="80" w:line="276" w:lineRule="auto"/>
+      </w:pPr>
+      <w:r>
+        <w:rPr>
+          <w:rFonts w:ascii="Arial" w:hAnsi="Arial"/>
+          <w:b/>
+          <w:sz w:val="22"/>
+        </w:rPr>
+        <w:t xml:space="preserve">Visual Scaffolding: </w:t>
+      </w:r>
+      <w:r>
+        <w:rPr>
+          <w:rFonts w:ascii="Arial" w:hAnsi="Arial"/>
+          <w:sz w:val="22"/>
+        </w:rPr>
+        <w:t>The user begins by implementing a static mockup of the target page (e.g., hardcoded list rendering for a product dashboard) to understand UI/UX component structures.</w:t>
       </w:r>
     </w:p>
     <w:p>
       <w:pPr>
-        <w:spacing w:after="120"/>
-        <w:jc w:val="both"/>
-        <w:rPr>
-          <w:sz w:val="32"/>
-          <w:szCs w:val="32"/>
-        </w:rPr>
-      </w:pPr>
-      <w:r>
-        <w:rPr>
-          <w:sz w:val="32"/>
-          <w:szCs w:val="32"/>
-        </w:rPr>
-        <w:t xml:space="preserve">For every screen, the system generates the page structure and a basic explanation of the file structure. A component-selection process identifies the parts of the page that should become learning topics. These components are converted into </w:t>
-      </w:r>
-      <w:r>
-        <w:rPr>
-          <w:sz w:val="32"/>
-          <w:szCs w:val="32"/>
-        </w:rPr>
-        <w:t>learning modules, which form the syllabus for that screen. The learner studies each concept and implements it in the coding environment.</w:t>
+        <w:pStyle w:val="ListBullet"/>
+        <w:spacing w:after="80" w:line="276" w:lineRule="auto"/>
+      </w:pPr>
+      <w:r>
+        <w:rPr>
+          <w:rFonts w:ascii="Arial" w:hAnsi="Arial"/>
+          <w:b/>
+          <w:sz w:val="22"/>
+        </w:rPr>
+        <w:t xml:space="preserve">Dynamic State &amp; Integration: </w:t>
+      </w:r>
+      <w:r>
+        <w:rPr>
+          <w:rFonts w:ascii="Arial" w:hAnsi="Arial"/>
+          <w:sz w:val="22"/>
+        </w:rPr>
+        <w:t>The module introduces reactivity, hooks, and dynamic data integration (e.g., wiring mock state hooks, managing lists, and handling user inputs).</w:t>
       </w:r>
     </w:p>
     <w:p>
       <w:pPr>
-        <w:spacing w:after="120"/>
-        <w:jc w:val="both"/>
-        <w:rPr>
-          <w:sz w:val="32"/>
-          <w:szCs w:val="32"/>
-        </w:rPr>
-      </w:pPr>
-      <w:r>
-        <w:rPr>
-          <w:sz w:val="32"/>
-          <w:szCs w:val="32"/>
-        </w:rPr>
-        <w:t>After all modules for a screen are completed, the system records the learner's progress and moves to the next planned s</w:t>
-      </w:r>
-      <w:r>
-        <w:rPr>
-          <w:sz w:val="32"/>
-          <w:szCs w:val="32"/>
-        </w:rPr>
-        <w:t>creen. This process repeats until all screens have been completed. At the end, the complete project is ready as a practical outcome of the learning process.</w:t>
+        <w:pStyle w:val="ListBullet"/>
+        <w:spacing w:after="80" w:line="276" w:lineRule="auto"/>
+      </w:pPr>
+      <w:r>
+        <w:rPr>
+          <w:rFonts w:ascii="Arial" w:hAnsi="Arial"/>
+          <w:b/>
+          <w:sz w:val="22"/>
+        </w:rPr>
+        <w:t xml:space="preserve">Robustness &amp; Validation: </w:t>
+      </w:r>
+      <w:r>
+        <w:rPr>
+          <w:rFonts w:ascii="Arial" w:hAnsi="Arial"/>
+          <w:sz w:val="22"/>
+        </w:rPr>
+        <w:t>The module wraps the features in network logic, handling loading spinners, error states, and edge-case validations.</w:t>
       </w:r>
     </w:p>
     <w:p>
       <w:pPr>
-        <w:spacing w:before="200" w:after="100"/>
-        <w:rPr>
-          <w:sz w:val="36"/>
-          <w:szCs w:val="36"/>
-        </w:rPr>
-      </w:pPr>
-      <w:r>
-        <w:rPr>
-          <w:b/>
-          <w:sz w:val="36"/>
-          <w:szCs w:val="36"/>
-        </w:rPr>
-        <w:lastRenderedPageBreak/>
-        <w:br/>
-      </w:r>
-      <w:r>
-        <w:rPr>
-          <w:b/>
-          <w:sz w:val="36"/>
-          <w:szCs w:val="36"/>
-        </w:rPr>
-        <w:t xml:space="preserve">5. SYSTEM </w:t>
-      </w:r>
-      <w:proofErr w:type="gramStart"/>
-      <w:r>
-        <w:rPr>
-          <w:b/>
-          <w:sz w:val="36"/>
-          <w:szCs w:val="36"/>
-        </w:rPr>
-        <w:t>ARCHITECTURE :</w:t>
-      </w:r>
-      <w:proofErr w:type="gramEnd"/>
-      <w:r>
-        <w:rPr>
-          <w:b/>
-          <w:sz w:val="36"/>
-          <w:szCs w:val="36"/>
-        </w:rPr>
-        <w:t>-</w:t>
+        <w:spacing w:after="120" w:line="276" w:lineRule="auto"/>
+      </w:pPr>
+      <w:r>
+        <w:rPr>
+          <w:rFonts w:ascii="Arial" w:hAnsi="Arial"/>
+          <w:sz w:val="22"/>
+        </w:rPr>
+        <w:t>The web app utilizes an in-browser coding environment (such as StackBlitz WebContainers or CodeSandbox Sandpack) which executes live code changes, provides instant visual feedback, and runs automated tests that gate module completion. The project loops through this lifecycle screen by screen until the entire planned project is complete.</w:t>
       </w:r>
     </w:p>
     <w:p>
       <w:pPr>
-        <w:spacing w:after="120"/>
-        <w:jc w:val="both"/>
-        <w:rPr>
-          <w:sz w:val="32"/>
-          <w:szCs w:val="32"/>
-        </w:rPr>
-      </w:pPr>
-      <w:r>
-        <w:rPr>
-          <w:sz w:val="32"/>
-          <w:szCs w:val="32"/>
-        </w:rPr>
-        <w:t>The architecture of Ascent.ai can be represented through a central AI cou</w:t>
-      </w:r>
-      <w:r>
-        <w:rPr>
-          <w:sz w:val="32"/>
-          <w:szCs w:val="32"/>
-        </w:rPr>
-        <w:t>rse-generation system connected to two major external parties: the learner and an external Large Language Model (LLM) service.</w:t>
+        <w:keepNext/>
+        <w:spacing w:before="360" w:after="120"/>
+      </w:pPr>
+      <w:r>
+        <w:rPr>
+          <w:rFonts w:ascii="Arial" w:hAnsi="Arial"/>
+          <w:b/>
+          <w:sz w:val="24"/>
+        </w:rPr>
+        <w:t>4. SYSTEM OVERVIEW:-</w:t>
       </w:r>
     </w:p>
     <w:p>
       <w:pPr>
-        <w:spacing w:after="60"/>
-        <w:ind w:left="360" w:hanging="216"/>
-        <w:rPr>
-          <w:sz w:val="32"/>
-          <w:szCs w:val="32"/>
-        </w:rPr>
-      </w:pPr>
-      <w:r>
-        <w:rPr>
-          <w:sz w:val="32"/>
-          <w:szCs w:val="32"/>
-        </w:rPr>
-        <w:t>• User Interface Layer – Provides the landing page, project prompt/form, roadmap, learning modules, coding workspace, progress in</w:t>
-      </w:r>
-      <w:r>
-        <w:rPr>
-          <w:sz w:val="32"/>
-          <w:szCs w:val="32"/>
-        </w:rPr>
-        <w:t>formation, and project preview.</w:t>
+        <w:spacing w:after="120" w:line="276" w:lineRule="auto"/>
+      </w:pPr>
+      <w:r>
+        <w:rPr>
+          <w:rFonts w:ascii="Arial" w:hAnsi="Arial"/>
+          <w:sz w:val="22"/>
+        </w:rPr>
+        <w:t>The system data flow and processing loop is designed as a series of interconnected services managed within a single workspace. The key processes include:</w:t>
       </w:r>
     </w:p>
     <w:p>
       <w:pPr>
-        <w:spacing w:after="60"/>
-        <w:ind w:left="360" w:hanging="216"/>
-        <w:rPr>
-          <w:sz w:val="32"/>
-          <w:szCs w:val="32"/>
-        </w:rPr>
-      </w:pPr>
-      <w:r>
-        <w:rPr>
-          <w:sz w:val="32"/>
-          <w:szCs w:val="32"/>
-        </w:rPr>
-        <w:t>• Application and Course-Generation Layer – Captures the user's project request, manages the project roadmap, generates pages, selects teachable components, creates learning modules, and controls the learning sequence.</w:t>
+        <w:pStyle w:val="ListBullet"/>
+        <w:spacing w:after="80" w:line="276" w:lineRule="auto"/>
+      </w:pPr>
+      <w:r>
+        <w:rPr>
+          <w:rFonts w:ascii="Arial" w:hAnsi="Arial"/>
+          <w:b/>
+          <w:sz w:val="22"/>
+        </w:rPr>
+        <w:t xml:space="preserve">Input Intake Handler: </w:t>
+      </w:r>
+      <w:r>
+        <w:rPr>
+          <w:rFonts w:ascii="Arial" w:hAnsi="Arial"/>
+          <w:sz w:val="22"/>
+        </w:rPr>
+        <w:t>Captures the user prompt or guided wizard configuration, validating options and preparing metadata (target language, frameworks).</w:t>
       </w:r>
     </w:p>
     <w:p>
       <w:pPr>
-        <w:spacing w:after="60"/>
-        <w:ind w:left="360" w:hanging="216"/>
-        <w:rPr>
-          <w:sz w:val="32"/>
-          <w:szCs w:val="32"/>
-        </w:rPr>
-      </w:pPr>
-      <w:r>
-        <w:rPr>
-          <w:sz w:val="32"/>
-          <w:szCs w:val="32"/>
-        </w:rPr>
-        <w:t>• AI/</w:t>
-      </w:r>
-      <w:r>
-        <w:rPr>
-          <w:sz w:val="32"/>
-          <w:szCs w:val="32"/>
-        </w:rPr>
-        <w:t>LLM Layer – Provides project generation, component analysis, and personalized learning-content generation through an external AI model API.</w:t>
+        <w:pStyle w:val="ListBullet"/>
+        <w:spacing w:after="80" w:line="276" w:lineRule="auto"/>
+      </w:pPr>
+      <w:r>
+        <w:rPr>
+          <w:rFonts w:ascii="Arial" w:hAnsi="Arial"/>
+          <w:b/>
+          <w:sz w:val="22"/>
+        </w:rPr>
+        <w:t xml:space="preserve">Roadmap Planner &amp; Orchestrator: </w:t>
+      </w:r>
+      <w:r>
+        <w:rPr>
+          <w:rFonts w:ascii="Arial" w:hAnsi="Arial"/>
+          <w:sz w:val="22"/>
+        </w:rPr>
+        <w:t>Communicates with the Large Language Model service to plan the application screens and structure the sequence of lessons.</w:t>
       </w:r>
     </w:p>
     <w:p>
       <w:pPr>
-        <w:spacing w:after="60"/>
-        <w:ind w:left="360" w:hanging="216"/>
-        <w:rPr>
-          <w:sz w:val="32"/>
-          <w:szCs w:val="32"/>
-        </w:rPr>
-      </w:pPr>
-      <w:r>
-        <w:rPr>
-          <w:sz w:val="32"/>
-          <w:szCs w:val="32"/>
-        </w:rPr>
-        <w:t>• Execution and Testing Layer – Provides the in-browser coding editor, live preview or sandbox, and automated checks</w:t>
-      </w:r>
-      <w:r>
-        <w:rPr>
-          <w:sz w:val="32"/>
-          <w:szCs w:val="32"/>
-        </w:rPr>
-        <w:t xml:space="preserve"> intended to validate learner progress.</w:t>
+        <w:pStyle w:val="ListBullet"/>
+        <w:spacing w:after="80" w:line="276" w:lineRule="auto"/>
+      </w:pPr>
+      <w:r>
+        <w:rPr>
+          <w:rFonts w:ascii="Arial" w:hAnsi="Arial"/>
+          <w:b/>
+          <w:sz w:val="22"/>
+        </w:rPr>
+        <w:t xml:space="preserve">Webpage Generator: </w:t>
+      </w:r>
+      <w:r>
+        <w:rPr>
+          <w:rFonts w:ascii="Arial" w:hAnsi="Arial"/>
+          <w:sz w:val="22"/>
+        </w:rPr>
+        <w:t>Creates the starter folder layout, HTML/JSX scaffolding, and descriptions of the visual output for the active screen.</w:t>
       </w:r>
     </w:p>
     <w:p>
       <w:pPr>
-        <w:spacing w:after="60"/>
-        <w:ind w:left="360" w:hanging="216"/>
-        <w:rPr>
-          <w:sz w:val="32"/>
-          <w:szCs w:val="32"/>
-        </w:rPr>
-      </w:pPr>
-      <w:r>
-        <w:rPr>
-          <w:sz w:val="32"/>
-          <w:szCs w:val="32"/>
-        </w:rPr>
-        <w:t>• Content Store – Stores generated pages, components, learning modules, and related course content.</w:t>
+        <w:pStyle w:val="ListBullet"/>
+        <w:spacing w:after="80" w:line="276" w:lineRule="auto"/>
+      </w:pPr>
+      <w:r>
+        <w:rPr>
+          <w:rFonts w:ascii="Arial" w:hAnsi="Arial"/>
+          <w:b/>
+          <w:sz w:val="22"/>
+        </w:rPr>
+        <w:t xml:space="preserve">Component Decomposer: </w:t>
+      </w:r>
+      <w:r>
+        <w:rPr>
+          <w:rFonts w:ascii="Arial" w:hAnsi="Arial"/>
+          <w:sz w:val="22"/>
+        </w:rPr>
+        <w:t>Scans the generated layout structure and extracts teachable DOM units (buttons, lists, search inputs, tables) to map them to learning objectives.</w:t>
       </w:r>
     </w:p>
     <w:p>
       <w:pPr>
-        <w:spacing w:after="60"/>
-        <w:ind w:left="360" w:hanging="216"/>
-        <w:rPr>
-          <w:sz w:val="32"/>
-          <w:szCs w:val="32"/>
-        </w:rPr>
-      </w:pPr>
-      <w:r>
-        <w:rPr>
-          <w:sz w:val="32"/>
-          <w:szCs w:val="32"/>
-        </w:rPr>
-        <w:t>• Progress Store – Records completed modules and concepts and supports checking whether the current screen or the co</w:t>
-      </w:r>
-      <w:r>
-        <w:rPr>
-          <w:sz w:val="32"/>
-          <w:szCs w:val="32"/>
-        </w:rPr>
-        <w:t>mplete project has been finished.</w:t>
+        <w:pStyle w:val="ListBullet"/>
+        <w:spacing w:after="80" w:line="276" w:lineRule="auto"/>
+      </w:pPr>
+      <w:r>
+        <w:rPr>
+          <w:rFonts w:ascii="Arial" w:hAnsi="Arial"/>
+          <w:b/>
+          <w:sz w:val="22"/>
+        </w:rPr>
+        <w:t xml:space="preserve">Module compiler: </w:t>
+      </w:r>
+      <w:r>
+        <w:rPr>
+          <w:rFonts w:ascii="Arial" w:hAnsi="Arial"/>
+          <w:sz w:val="22"/>
+        </w:rPr>
+        <w:t>Generates conceptual explanations, step-by-step instructions, and automated test specifications for each component.</w:t>
       </w:r>
     </w:p>
     <w:p>
       <w:pPr>
-        <w:spacing w:after="120"/>
-        <w:jc w:val="both"/>
-        <w:rPr>
-          <w:sz w:val="32"/>
-          <w:szCs w:val="32"/>
-        </w:rPr>
-      </w:pPr>
-      <w:r>
-        <w:rPr>
-          <w:sz w:val="32"/>
-          <w:szCs w:val="32"/>
-        </w:rPr>
-        <w:t>The Level-1 data flow begins with capturing the user's prompt or form selection, generating a page, selecting its teachable components, generating modules, storing the generated content, delivering the modules to the learn</w:t>
-      </w:r>
-      <w:r>
-        <w:rPr>
-          <w:sz w:val="32"/>
-          <w:szCs w:val="32"/>
-        </w:rPr>
-        <w:t>er, tracking progress, and checking whether another screen remains. If another screen exists, the process loops; otherwise, the project is marked complete.</w:t>
+        <w:pStyle w:val="ListBullet"/>
+        <w:spacing w:after="80" w:line="276" w:lineRule="auto"/>
+      </w:pPr>
+      <w:r>
+        <w:rPr>
+          <w:rFonts w:ascii="Arial" w:hAnsi="Arial"/>
+          <w:b/>
+          <w:sz w:val="22"/>
+        </w:rPr>
+        <w:t xml:space="preserve">Sandbox Code Editor &amp; Evaluator: </w:t>
+      </w:r>
+      <w:r>
+        <w:rPr>
+          <w:rFonts w:ascii="Arial" w:hAnsi="Arial"/>
+          <w:sz w:val="22"/>
+        </w:rPr>
+        <w:t>Hosts the visual coding workspace, compiling code in real-time, executing client-side test assertions, and querying the backend server to securely log progress records.</w:t>
       </w:r>
     </w:p>
     <w:p>
       <w:pPr>
-        <w:spacing w:before="200" w:after="100"/>
-        <w:rPr>
-          <w:sz w:val="36"/>
-          <w:szCs w:val="36"/>
-        </w:rPr>
-      </w:pPr>
-      <w:r>
-        <w:rPr>
+        <w:keepNext/>
+        <w:spacing w:before="360" w:after="120"/>
+      </w:pPr>
+      <w:r>
+        <w:rPr>
+          <w:rFonts w:ascii="Arial" w:hAnsi="Arial"/>
           <w:b/>
-        </w:rPr>
-        <w:lastRenderedPageBreak/>
-        <w:br/>
-      </w:r>
-      <w:r>
-        <w:rPr>
-          <w:b/>
-          <w:sz w:val="36"/>
-          <w:szCs w:val="36"/>
-        </w:rPr>
-        <w:t xml:space="preserve">6. SOFTWARE </w:t>
-      </w:r>
-      <w:proofErr w:type="gramStart"/>
-      <w:r>
-        <w:rPr>
-          <w:b/>
-          <w:sz w:val="36"/>
-          <w:szCs w:val="36"/>
-        </w:rPr>
-        <w:t>REQUIREMENTS :</w:t>
-      </w:r>
-      <w:proofErr w:type="gramEnd"/>
-      <w:r>
-        <w:rPr>
-          <w:b/>
-          <w:sz w:val="36"/>
-          <w:szCs w:val="36"/>
-        </w:rPr>
-        <w:t>-</w:t>
+          <w:sz w:val="24"/>
+        </w:rPr>
+        <w:t>5. SYSTEM ARCHITECTURE:-</w:t>
       </w:r>
     </w:p>
     <w:p>
       <w:pPr>
-        <w:spacing w:after="60"/>
-        <w:ind w:left="360" w:hanging="216"/>
-        <w:rPr>
-          <w:sz w:val="32"/>
-          <w:szCs w:val="32"/>
-        </w:rPr>
-      </w:pPr>
-      <w:r>
-        <w:rPr>
-          <w:sz w:val="32"/>
-          <w:szCs w:val="32"/>
-        </w:rPr>
-        <w:t xml:space="preserve">• Web browser capable of supporting the platform's user interface and </w:t>
-      </w:r>
-      <w:r>
-        <w:rPr>
-          <w:sz w:val="32"/>
-          <w:szCs w:val="32"/>
-        </w:rPr>
-        <w:t>in-browser coding environment.</w:t>
+        <w:spacing w:after="120" w:line="276" w:lineRule="auto"/>
+      </w:pPr>
+      <w:r>
+        <w:rPr>
+          <w:rFonts w:ascii="Arial" w:hAnsi="Arial"/>
+          <w:sz w:val="22"/>
+        </w:rPr>
+        <w:t>Ascent.ai is built using a Modular Monolith architecture to ensure low deployment overhead during prototyping while maintaining clear separation of boundaries for microservices scaling. The architecture is decomposed into the following layers:</w:t>
       </w:r>
     </w:p>
     <w:p>
       <w:pPr>
-        <w:spacing w:after="60"/>
-        <w:ind w:left="360" w:hanging="216"/>
-        <w:rPr>
-          <w:sz w:val="32"/>
-          <w:szCs w:val="32"/>
-        </w:rPr>
-      </w:pPr>
-      <w:r>
-        <w:rPr>
-          <w:sz w:val="32"/>
-          <w:szCs w:val="32"/>
-        </w:rPr>
-        <w:t>• In-browser code editor with live preview or sandbox support for building and testing projects.</w:t>
+        <w:pStyle w:val="ListBullet"/>
+        <w:spacing w:after="80" w:line="276" w:lineRule="auto"/>
+      </w:pPr>
+      <w:r>
+        <w:rPr>
+          <w:rFonts w:ascii="Arial" w:hAnsi="Arial"/>
+          <w:b/>
+          <w:sz w:val="22"/>
+        </w:rPr>
+        <w:t xml:space="preserve">User Interface Layer (Presentation): </w:t>
+      </w:r>
+      <w:r>
+        <w:rPr>
+          <w:rFonts w:ascii="Arial" w:hAnsi="Arial"/>
+          <w:sz w:val="22"/>
+        </w:rPr>
+        <w:t>Built using React and custom Vanilla CSS (featuring glassmorphism, responsive split panels, and dark-mode themes). Houses the sidebar syllabus, markdown lesson pane, monaco-editor coding pane, and visual web-preview iframe.</w:t>
       </w:r>
     </w:p>
     <w:p>
       <w:pPr>
-        <w:spacing w:after="60"/>
-        <w:ind w:left="360" w:hanging="216"/>
-        <w:rPr>
-          <w:sz w:val="32"/>
-          <w:szCs w:val="32"/>
-        </w:rPr>
-      </w:pPr>
-      <w:r>
-        <w:rPr>
-          <w:sz w:val="32"/>
-          <w:szCs w:val="32"/>
-        </w:rPr>
-        <w:t>• Node.js/React-compatible sandbox tooling may be used for browser-based project execution, as indicated in the project design.</w:t>
+        <w:pStyle w:val="ListBullet"/>
+        <w:spacing w:after="80" w:line="276" w:lineRule="auto"/>
+      </w:pPr>
+      <w:r>
+        <w:rPr>
+          <w:rFonts w:ascii="Arial" w:hAnsi="Arial"/>
+          <w:b/>
+          <w:sz w:val="22"/>
+        </w:rPr>
+        <w:t xml:space="preserve">Business Logic Layer (Express BFF): </w:t>
+      </w:r>
+      <w:r>
+        <w:rPr>
+          <w:rFonts w:ascii="Arial" w:hAnsi="Arial"/>
+          <w:sz w:val="22"/>
+        </w:rPr>
+        <w:t>Handles user authentication, rate-limiting, progress logging, and routes API requests. Separates prompts, parsing utilities, and module compilers.</w:t>
       </w:r>
     </w:p>
     <w:p>
       <w:pPr>
-        <w:spacing w:after="60"/>
-        <w:ind w:left="360" w:hanging="216"/>
-        <w:rPr>
-          <w:sz w:val="32"/>
-          <w:szCs w:val="32"/>
-        </w:rPr>
-      </w:pPr>
-      <w:r>
-        <w:rPr>
-          <w:sz w:val="32"/>
-          <w:szCs w:val="32"/>
-        </w:rPr>
-        <w:t>• External Large Language Model (LLM) API for project, component, and learning-module generation.</w:t>
+        <w:pStyle w:val="ListBullet"/>
+        <w:spacing w:after="80" w:line="276" w:lineRule="auto"/>
+      </w:pPr>
+      <w:r>
+        <w:rPr>
+          <w:rFonts w:ascii="Arial" w:hAnsi="Arial"/>
+          <w:b/>
+          <w:sz w:val="22"/>
+        </w:rPr>
+        <w:t xml:space="preserve">AI Generation Engine: </w:t>
+      </w:r>
+      <w:r>
+        <w:rPr>
+          <w:rFonts w:ascii="Arial" w:hAnsi="Arial"/>
+          <w:sz w:val="22"/>
+        </w:rPr>
+        <w:t>Manages API integration with Anthropic Claude or OpenAI GPT-4, utilizing Redis job queues to process long-running course generation requests asynchronously.</w:t>
       </w:r>
     </w:p>
     <w:p>
       <w:pPr>
-        <w:spacing w:after="60"/>
-        <w:ind w:left="360" w:hanging="216"/>
-        <w:rPr>
-          <w:sz w:val="32"/>
-          <w:szCs w:val="32"/>
-        </w:rPr>
-      </w:pPr>
-      <w:r>
-        <w:rPr>
-          <w:sz w:val="32"/>
-          <w:szCs w:val="32"/>
-        </w:rPr>
-        <w:t>• Database or persistent content storage for generated pages, components, modules, and learner progress.</w:t>
+        <w:pStyle w:val="ListBullet"/>
+        <w:spacing w:after="80" w:line="276" w:lineRule="auto"/>
+      </w:pPr>
+      <w:r>
+        <w:rPr>
+          <w:rFonts w:ascii="Arial" w:hAnsi="Arial"/>
+          <w:b/>
+          <w:sz w:val="22"/>
+        </w:rPr>
+        <w:t xml:space="preserve">Secure Code Execution Layer: </w:t>
+      </w:r>
+      <w:r>
+        <w:rPr>
+          <w:rFonts w:ascii="Arial" w:hAnsi="Arial"/>
+          <w:sz w:val="22"/>
+        </w:rPr>
+        <w:t>Uses client-side WebContainers to execute compiler actions safely in the browser, paired with a backend Node.js sandbox that reruns test suites to prevent client-side progress spoofing.</w:t>
       </w:r>
     </w:p>
     <w:p>
       <w:pPr>
-        <w:spacing w:after="60"/>
-        <w:ind w:left="360" w:hanging="216"/>
-        <w:rPr>
-          <w:sz w:val="32"/>
-          <w:szCs w:val="32"/>
-        </w:rPr>
-      </w:pPr>
-      <w:r>
-        <w:rPr>
-          <w:sz w:val="32"/>
-          <w:szCs w:val="32"/>
-        </w:rPr>
-        <w:t>• Web application development environment and interne</w:t>
-      </w:r>
-      <w:r>
-        <w:rPr>
-          <w:sz w:val="32"/>
-          <w:szCs w:val="32"/>
-        </w:rPr>
-        <w:t>t connectivity for accessing the AI service and platform.</w:t>
+        <w:pStyle w:val="ListBullet"/>
+        <w:spacing w:after="80" w:line="276" w:lineRule="auto"/>
+      </w:pPr>
+      <w:r>
+        <w:rPr>
+          <w:rFonts w:ascii="Arial" w:hAnsi="Arial"/>
+          <w:b/>
+          <w:sz w:val="22"/>
+        </w:rPr>
+        <w:t xml:space="preserve">Database Layer (PostgreSQL &amp; Redis): </w:t>
+      </w:r>
+      <w:r>
+        <w:rPr>
+          <w:rFonts w:ascii="Arial" w:hAnsi="Arial"/>
+          <w:sz w:val="22"/>
+        </w:rPr>
+        <w:t>Features relational models linking Users, Projects, Pages, Components, Modules, and ProgressRecords, alongside Redis cache for queue management.</w:t>
       </w:r>
     </w:p>
     <w:p>
       <w:pPr>
-        <w:spacing w:before="200" w:after="100"/>
-        <w:rPr>
-          <w:sz w:val="36"/>
-          <w:szCs w:val="36"/>
-        </w:rPr>
-      </w:pPr>
-      <w:r>
-        <w:rPr>
+        <w:keepNext/>
+        <w:spacing w:before="360" w:after="120"/>
+      </w:pPr>
+      <w:r>
+        <w:rPr>
+          <w:rFonts w:ascii="Arial" w:hAnsi="Arial"/>
           <w:b/>
-          <w:sz w:val="36"/>
-          <w:szCs w:val="36"/>
-        </w:rPr>
-        <w:t xml:space="preserve">7. HARDWARE </w:t>
-      </w:r>
-      <w:proofErr w:type="gramStart"/>
-      <w:r>
-        <w:rPr>
-          <w:b/>
-          <w:sz w:val="36"/>
-          <w:szCs w:val="36"/>
-        </w:rPr>
-        <w:t>REQUIREMENTS :</w:t>
-      </w:r>
-      <w:proofErr w:type="gramEnd"/>
-      <w:r>
-        <w:rPr>
-          <w:b/>
-          <w:sz w:val="36"/>
-          <w:szCs w:val="36"/>
-        </w:rPr>
-        <w:t>-</w:t>
+          <w:sz w:val="24"/>
+        </w:rPr>
+        <w:t>6. SOFTWARE REQUIREMENT:-</w:t>
       </w:r>
     </w:p>
     <w:p>
       <w:pPr>
-        <w:spacing w:after="60"/>
-        <w:ind w:left="360" w:hanging="216"/>
-        <w:rPr>
-          <w:sz w:val="32"/>
-          <w:szCs w:val="32"/>
-        </w:rPr>
-      </w:pPr>
-      <w:r>
-        <w:rPr>
-          <w:sz w:val="32"/>
-          <w:szCs w:val="32"/>
-        </w:rPr>
-        <w:t>• A computer or laptop suitable for web development and running a modern web browser.</w:t>
+        <w:pStyle w:val="ListBullet"/>
+        <w:spacing w:after="80" w:line="276" w:lineRule="auto"/>
+      </w:pPr>
+      <w:r>
+        <w:rPr>
+          <w:rFonts w:ascii="Arial" w:hAnsi="Arial"/>
+          <w:b/>
+          <w:sz w:val="22"/>
+        </w:rPr>
+        <w:t xml:space="preserve">Operating System: </w:t>
+      </w:r>
+      <w:r>
+        <w:rPr>
+          <w:rFonts w:ascii="Arial" w:hAnsi="Arial"/>
+          <w:sz w:val="22"/>
+        </w:rPr>
+        <w:t>Cross-Platform compatibility (Windows 10/11, macOS, Linux).</w:t>
       </w:r>
     </w:p>
     <w:p>
       <w:pPr>
-        <w:spacing w:after="60"/>
-        <w:ind w:left="360" w:hanging="216"/>
-        <w:rPr>
-          <w:sz w:val="32"/>
-          <w:szCs w:val="32"/>
-        </w:rPr>
-      </w:pPr>
-      <w:r>
-        <w:rPr>
-          <w:sz w:val="32"/>
-          <w:szCs w:val="32"/>
-        </w:rPr>
-        <w:t>• Adequate memory and processor capacity for the browser, coding editor, live previe</w:t>
-      </w:r>
-      <w:r>
-        <w:rPr>
-          <w:sz w:val="32"/>
-          <w:szCs w:val="32"/>
-        </w:rPr>
-        <w:t>w, and development tools.</w:t>
+        <w:pStyle w:val="ListBullet"/>
+        <w:spacing w:after="80" w:line="276" w:lineRule="auto"/>
+      </w:pPr>
+      <w:r>
+        <w:rPr>
+          <w:rFonts w:ascii="Arial" w:hAnsi="Arial"/>
+          <w:b/>
+          <w:sz w:val="22"/>
+        </w:rPr>
+        <w:t xml:space="preserve">Runtime Environment: </w:t>
+      </w:r>
+      <w:r>
+        <w:rPr>
+          <w:rFonts w:ascii="Arial" w:hAnsi="Arial"/>
+          <w:sz w:val="22"/>
+        </w:rPr>
+        <w:t>Node.js (v18.x or above) and Python 3.10.x.</w:t>
       </w:r>
     </w:p>
     <w:p>
       <w:pPr>
-        <w:spacing w:after="60"/>
-        <w:ind w:left="360" w:hanging="216"/>
-        <w:rPr>
-          <w:sz w:val="32"/>
-          <w:szCs w:val="32"/>
-        </w:rPr>
-      </w:pPr>
-      <w:r>
-        <w:rPr>
-          <w:sz w:val="32"/>
-          <w:szCs w:val="32"/>
-        </w:rPr>
-        <w:t>• Stable internet connection for communication with the AI/LLM service and other web services.</w:t>
+        <w:pStyle w:val="ListBullet"/>
+        <w:spacing w:after="80" w:line="276" w:lineRule="auto"/>
+      </w:pPr>
+      <w:r>
+        <w:rPr>
+          <w:rFonts w:ascii="Arial" w:hAnsi="Arial"/>
+          <w:b/>
+          <w:sz w:val="22"/>
+        </w:rPr>
+        <w:t xml:space="preserve">Backend Framework: </w:t>
+      </w:r>
+      <w:r>
+        <w:rPr>
+          <w:rFonts w:ascii="Arial" w:hAnsi="Arial"/>
+          <w:sz w:val="22"/>
+        </w:rPr>
+        <w:t>Express.js with TypeScript support.</w:t>
       </w:r>
     </w:p>
     <w:p>
       <w:pPr>
-        <w:spacing w:after="120"/>
-        <w:jc w:val="both"/>
-        <w:rPr>
-          <w:sz w:val="32"/>
-          <w:szCs w:val="32"/>
-        </w:rPr>
-      </w:pPr>
-      <w:r>
-        <w:rPr>
-          <w:sz w:val="32"/>
-          <w:szCs w:val="32"/>
-        </w:rPr>
-        <w:t>The source project brief does not specify exact processor, RAM, storage, or operating-system minimums; these can be finalized during im</w:t>
-      </w:r>
-      <w:r>
-        <w:rPr>
-          <w:sz w:val="32"/>
-          <w:szCs w:val="32"/>
-        </w:rPr>
-        <w:t>plementation.</w:t>
+        <w:pStyle w:val="ListBullet"/>
+        <w:spacing w:after="80" w:line="276" w:lineRule="auto"/>
+      </w:pPr>
+      <w:r>
+        <w:rPr>
+          <w:rFonts w:ascii="Arial" w:hAnsi="Arial"/>
+          <w:b/>
+          <w:sz w:val="22"/>
+        </w:rPr>
+        <w:t xml:space="preserve">Frontend Library: </w:t>
+      </w:r>
+      <w:r>
+        <w:rPr>
+          <w:rFonts w:ascii="Arial" w:hAnsi="Arial"/>
+          <w:sz w:val="22"/>
+        </w:rPr>
+        <w:t>React 19.x with Vite compilation server.</w:t>
       </w:r>
     </w:p>
     <w:p>
       <w:pPr>
-        <w:spacing w:before="200" w:after="100"/>
-        <w:rPr>
-          <w:sz w:val="36"/>
-          <w:szCs w:val="36"/>
-        </w:rPr>
-      </w:pPr>
-      <w:r>
-        <w:rPr>
+        <w:pStyle w:val="ListBullet"/>
+        <w:spacing w:after="80" w:line="276" w:lineRule="auto"/>
+      </w:pPr>
+      <w:r>
+        <w:rPr>
+          <w:rFonts w:ascii="Arial" w:hAnsi="Arial"/>
           <w:b/>
-          <w:sz w:val="36"/>
-          <w:szCs w:val="36"/>
-        </w:rPr>
-        <w:t xml:space="preserve">8. </w:t>
-      </w:r>
-      <w:proofErr w:type="gramStart"/>
-      <w:r>
-        <w:rPr>
-          <w:b/>
-          <w:sz w:val="36"/>
-          <w:szCs w:val="36"/>
-        </w:rPr>
-        <w:t>ADVANTAGES :</w:t>
-      </w:r>
-      <w:proofErr w:type="gramEnd"/>
-      <w:r>
-        <w:rPr>
-          <w:b/>
-          <w:sz w:val="36"/>
-          <w:szCs w:val="36"/>
-        </w:rPr>
-        <w:t>-</w:t>
+          <w:sz w:val="22"/>
+        </w:rPr>
+        <w:t xml:space="preserve">Database Management: </w:t>
+      </w:r>
+      <w:r>
+        <w:rPr>
+          <w:rFonts w:ascii="Arial" w:hAnsi="Arial"/>
+          <w:sz w:val="22"/>
+        </w:rPr>
+        <w:t>PostgreSQL (v15.0 or above) and Redis (v7.0 or above).</w:t>
       </w:r>
     </w:p>
     <w:p>
       <w:pPr>
-        <w:spacing w:after="60"/>
-        <w:ind w:left="360" w:hanging="216"/>
-        <w:rPr>
-          <w:sz w:val="32"/>
-          <w:szCs w:val="32"/>
-        </w:rPr>
-      </w:pPr>
-      <w:r>
-        <w:rPr>
-          <w:sz w:val="32"/>
-          <w:szCs w:val="32"/>
-        </w:rPr>
-        <w:t>• Reduces dependency on generic tutorials by connecting learning directly to a real project.</w:t>
+        <w:pStyle w:val="ListBullet"/>
+        <w:spacing w:after="80" w:line="276" w:lineRule="auto"/>
+      </w:pPr>
+      <w:r>
+        <w:rPr>
+          <w:rFonts w:ascii="Arial" w:hAnsi="Arial"/>
+          <w:b/>
+          <w:sz w:val="22"/>
+        </w:rPr>
+        <w:t xml:space="preserve">Third-Party Integrations: </w:t>
+      </w:r>
+      <w:r>
+        <w:rPr>
+          <w:rFonts w:ascii="Arial" w:hAnsi="Arial"/>
+          <w:sz w:val="22"/>
+        </w:rPr>
+        <w:t>Anthropic/OpenAI API Keys; StackBlitz WebContainers SDK / Sandpack SDK.</w:t>
       </w:r>
     </w:p>
     <w:p>
       <w:pPr>
-        <w:spacing w:after="60"/>
-        <w:ind w:left="360" w:hanging="216"/>
-        <w:rPr>
-          <w:sz w:val="32"/>
-          <w:szCs w:val="32"/>
-        </w:rPr>
-      </w:pPr>
-      <w:r>
-        <w:rPr>
-          <w:sz w:val="32"/>
-          <w:szCs w:val="32"/>
-        </w:rPr>
-        <w:t>• Follows a teach-then-build approach so learners understand concepts before implementing them.</w:t>
+        <w:keepNext/>
+        <w:spacing w:before="360" w:after="120"/>
+      </w:pPr>
+      <w:r>
+        <w:rPr>
+          <w:rFonts w:ascii="Arial" w:hAnsi="Arial"/>
+          <w:b/>
+          <w:sz w:val="24"/>
+        </w:rPr>
+        <w:t>7. HARDWARE REQUIREMENT:-</w:t>
       </w:r>
     </w:p>
     <w:p>
       <w:pPr>
-        <w:spacing w:after="60"/>
-        <w:ind w:left="360" w:hanging="216"/>
-        <w:rPr>
-          <w:sz w:val="32"/>
-          <w:szCs w:val="32"/>
-        </w:rPr>
-      </w:pPr>
-      <w:r>
-        <w:rPr>
-          <w:sz w:val="32"/>
-          <w:szCs w:val="32"/>
-        </w:rPr>
-        <w:lastRenderedPageBreak/>
-        <w:t>• Supports open-ended project select</w:t>
-      </w:r>
-      <w:r>
-        <w:rPr>
-          <w:sz w:val="32"/>
-          <w:szCs w:val="32"/>
-        </w:rPr>
-        <w:t>ion instead of limiting learners to a fixed project menu.</w:t>
+        <w:pStyle w:val="ListBullet"/>
+        <w:spacing w:after="80" w:line="276" w:lineRule="auto"/>
+      </w:pPr>
+      <w:r>
+        <w:rPr>
+          <w:rFonts w:ascii="Arial" w:hAnsi="Arial"/>
+          <w:b/>
+          <w:sz w:val="22"/>
+        </w:rPr>
+        <w:t xml:space="preserve">Processor: </w:t>
+      </w:r>
+      <w:r>
+        <w:rPr>
+          <w:rFonts w:ascii="Arial" w:hAnsi="Arial"/>
+          <w:sz w:val="22"/>
+        </w:rPr>
+        <w:t>Multi-core CPU (Intel Core i5/AMD Ryzen 5, 2.4 GHz minimum or equivalent).</w:t>
       </w:r>
     </w:p>
     <w:p>
       <w:pPr>
-        <w:spacing w:after="60"/>
-        <w:ind w:left="360" w:hanging="216"/>
-        <w:rPr>
-          <w:sz w:val="32"/>
-          <w:szCs w:val="32"/>
-        </w:rPr>
-      </w:pPr>
-      <w:r>
-        <w:rPr>
-          <w:sz w:val="32"/>
-          <w:szCs w:val="32"/>
-        </w:rPr>
-        <w:t>• Provides visible screen-by-screen progress, making a large project easier to understand and complete.</w:t>
+        <w:pStyle w:val="ListBullet"/>
+        <w:spacing w:after="80" w:line="276" w:lineRule="auto"/>
+      </w:pPr>
+      <w:r>
+        <w:rPr>
+          <w:rFonts w:ascii="Arial" w:hAnsi="Arial"/>
+          <w:b/>
+          <w:sz w:val="22"/>
+        </w:rPr>
+        <w:t xml:space="preserve">System Memory (RAM): </w:t>
+      </w:r>
+      <w:r>
+        <w:rPr>
+          <w:rFonts w:ascii="Arial" w:hAnsi="Arial"/>
+          <w:sz w:val="22"/>
+        </w:rPr>
+        <w:t>8 GB minimum (16 GB highly recommended to run Docker containers, in-browser sandboxes, and developer pipelines simultaneously).</w:t>
       </w:r>
     </w:p>
     <w:p>
       <w:pPr>
-        <w:spacing w:after="60"/>
-        <w:ind w:left="360" w:hanging="216"/>
-        <w:rPr>
-          <w:sz w:val="32"/>
-          <w:szCs w:val="32"/>
-        </w:rPr>
-      </w:pPr>
-      <w:r>
-        <w:rPr>
-          <w:sz w:val="32"/>
-          <w:szCs w:val="32"/>
-        </w:rPr>
-        <w:t>• Uses hints and required attempts as guardrails against simply copying AI-generated solutions</w:t>
-      </w:r>
-      <w:r>
-        <w:rPr>
-          <w:sz w:val="32"/>
-          <w:szCs w:val="32"/>
-        </w:rPr>
-        <w:t>.</w:t>
+        <w:pStyle w:val="ListBullet"/>
+        <w:spacing w:after="80" w:line="276" w:lineRule="auto"/>
+      </w:pPr>
+      <w:r>
+        <w:rPr>
+          <w:rFonts w:ascii="Arial" w:hAnsi="Arial"/>
+          <w:b/>
+          <w:sz w:val="22"/>
+        </w:rPr>
+        <w:t xml:space="preserve">Storage: </w:t>
+      </w:r>
+      <w:r>
+        <w:rPr>
+          <w:rFonts w:ascii="Arial" w:hAnsi="Arial"/>
+          <w:sz w:val="22"/>
+        </w:rPr>
+        <w:t>SSD with at least 5 GB of free space for node_modules and local project storage.</w:t>
       </w:r>
     </w:p>
     <w:p>
       <w:pPr>
-        <w:spacing w:after="60"/>
-        <w:ind w:left="360" w:hanging="216"/>
-        <w:rPr>
-          <w:sz w:val="32"/>
-          <w:szCs w:val="32"/>
-        </w:rPr>
-      </w:pPr>
-      <w:r>
-        <w:rPr>
-          <w:sz w:val="32"/>
-          <w:szCs w:val="32"/>
-        </w:rPr>
-        <w:t>• Can use automated tests to verify implementation and gate progress.</w:t>
+        <w:pStyle w:val="ListBullet"/>
+        <w:spacing w:after="80" w:line="276" w:lineRule="auto"/>
+      </w:pPr>
+      <w:r>
+        <w:rPr>
+          <w:rFonts w:ascii="Arial" w:hAnsi="Arial"/>
+          <w:b/>
+          <w:sz w:val="22"/>
+        </w:rPr>
+        <w:t xml:space="preserve">Network Interface: </w:t>
+      </w:r>
+      <w:r>
+        <w:rPr>
+          <w:rFonts w:ascii="Arial" w:hAnsi="Arial"/>
+          <w:sz w:val="22"/>
+        </w:rPr>
+        <w:t>Broadband internet connection with a minimum download speed of 10 Mbps for stable API communication and dependency compilation.</w:t>
       </w:r>
     </w:p>
     <w:p>
       <w:pPr>
-        <w:spacing w:after="60"/>
-        <w:ind w:left="360" w:hanging="216"/>
-        <w:rPr>
-          <w:sz w:val="32"/>
-          <w:szCs w:val="32"/>
-        </w:rPr>
-      </w:pPr>
-      <w:r>
-        <w:rPr>
-          <w:sz w:val="32"/>
-          <w:szCs w:val="32"/>
-        </w:rPr>
-        <w:t>• Introduces practical learning through vertical-slice development, allowing learners to see an end-to-end result early.</w:t>
+        <w:keepNext/>
+        <w:spacing w:before="360" w:after="120"/>
+      </w:pPr>
+      <w:r>
+        <w:rPr>
+          <w:rFonts w:ascii="Arial" w:hAnsi="Arial"/>
+          <w:b/>
+          <w:sz w:val="24"/>
+        </w:rPr>
+        <w:t>8. ADVANTAGES:-</w:t>
       </w:r>
     </w:p>
     <w:p>
       <w:pPr>
-        <w:spacing w:after="60"/>
-        <w:ind w:left="360" w:hanging="216"/>
-        <w:rPr>
-          <w:sz w:val="32"/>
-          <w:szCs w:val="32"/>
-        </w:rPr>
-      </w:pPr>
-      <w:r>
-        <w:rPr>
-          <w:sz w:val="32"/>
-          <w:szCs w:val="32"/>
-        </w:rPr>
-        <w:t>• Can produce a real, deployed, explainable project rather than</w:t>
-      </w:r>
-      <w:r>
-        <w:rPr>
-          <w:sz w:val="32"/>
-          <w:szCs w:val="32"/>
-        </w:rPr>
-        <w:t xml:space="preserve"> only a course certificate, which is useful for portfolio and job-oriented learning.</w:t>
+        <w:pStyle w:val="ListBullet"/>
+        <w:spacing w:after="80" w:line="276" w:lineRule="auto"/>
+      </w:pPr>
+      <w:r>
+        <w:rPr>
+          <w:rFonts w:ascii="Arial" w:hAnsi="Arial"/>
+          <w:b/>
+          <w:sz w:val="22"/>
+        </w:rPr>
+        <w:t xml:space="preserve">Active Pedagogy over Passive Reading: </w:t>
+      </w:r>
+      <w:r>
+        <w:rPr>
+          <w:rFonts w:ascii="Arial" w:hAnsi="Arial"/>
+          <w:sz w:val="22"/>
+        </w:rPr>
+        <w:t>Drives high cognitive retention by requiring learners to construct 100% of the implementation code themselves, avoiding passive tutorial replication.</w:t>
       </w:r>
     </w:p>
     <w:p>
       <w:pPr>
-        <w:spacing w:before="200" w:after="100"/>
-        <w:rPr>
-          <w:sz w:val="36"/>
-          <w:szCs w:val="36"/>
-        </w:rPr>
-      </w:pPr>
-      <w:r>
-        <w:rPr>
+        <w:pStyle w:val="ListBullet"/>
+        <w:spacing w:after="80" w:line="276" w:lineRule="auto"/>
+      </w:pPr>
+      <w:r>
+        <w:rPr>
+          <w:rFonts w:ascii="Arial" w:hAnsi="Arial"/>
           <w:b/>
-          <w:sz w:val="36"/>
-          <w:szCs w:val="36"/>
-        </w:rPr>
-        <w:t xml:space="preserve">9. </w:t>
-      </w:r>
-      <w:proofErr w:type="gramStart"/>
-      <w:r>
-        <w:rPr>
-          <w:b/>
-          <w:sz w:val="36"/>
-          <w:szCs w:val="36"/>
-        </w:rPr>
-        <w:t>APPLICATIONS :</w:t>
-      </w:r>
-      <w:proofErr w:type="gramEnd"/>
-      <w:r>
-        <w:rPr>
-          <w:b/>
-          <w:sz w:val="36"/>
-          <w:szCs w:val="36"/>
-        </w:rPr>
-        <w:t>-</w:t>
+          <w:sz w:val="22"/>
+        </w:rPr>
+        <w:t xml:space="preserve">Highly Personalized Syllabus: </w:t>
+      </w:r>
+      <w:r>
+        <w:rPr>
+          <w:rFonts w:ascii="Arial" w:hAnsi="Arial"/>
+          <w:sz w:val="22"/>
+        </w:rPr>
+        <w:t>Enables open-ended prompt choices instead of restricting learners to pre-designed, generic coding paths.</w:t>
       </w:r>
     </w:p>
     <w:p>
       <w:pPr>
-        <w:spacing w:after="60"/>
-        <w:ind w:left="360" w:hanging="216"/>
-        <w:rPr>
-          <w:sz w:val="32"/>
-          <w:szCs w:val="32"/>
-        </w:rPr>
-      </w:pPr>
-      <w:r>
-        <w:rPr>
-          <w:sz w:val="32"/>
-          <w:szCs w:val="32"/>
-        </w:rPr>
-        <w:t>• Project-based learning for students studying web development and programming.</w:t>
+        <w:pStyle w:val="ListBullet"/>
+        <w:spacing w:after="80" w:line="276" w:lineRule="auto"/>
+      </w:pPr>
+      <w:r>
+        <w:rPr>
+          <w:rFonts w:ascii="Arial" w:hAnsi="Arial"/>
+          <w:b/>
+          <w:sz w:val="22"/>
+        </w:rPr>
+        <w:t xml:space="preserve">Gatekeeping via Automated Testing: </w:t>
+      </w:r>
+      <w:r>
+        <w:rPr>
+          <w:rFonts w:ascii="Arial" w:hAnsi="Arial"/>
+          <w:sz w:val="22"/>
+        </w:rPr>
+        <w:t>Uses unit tests to check syntax correctness, ensuring progress is gated based on working code, not eyeballed evaluations.</w:t>
       </w:r>
     </w:p>
     <w:p>
       <w:pPr>
-        <w:spacing w:after="60"/>
-        <w:ind w:left="360" w:hanging="216"/>
-        <w:rPr>
-          <w:sz w:val="32"/>
-          <w:szCs w:val="32"/>
-        </w:rPr>
-      </w:pPr>
-      <w:r>
-        <w:rPr>
-          <w:sz w:val="32"/>
-          <w:szCs w:val="32"/>
-        </w:rPr>
-        <w:t>• Skill development for learners who understand individual programming c</w:t>
-      </w:r>
-      <w:r>
-        <w:rPr>
-          <w:sz w:val="32"/>
-          <w:szCs w:val="32"/>
-        </w:rPr>
-        <w:t>oncepts but have difficulty building complete applications.</w:t>
+        <w:pStyle w:val="ListBullet"/>
+        <w:spacing w:after="80" w:line="276" w:lineRule="auto"/>
+      </w:pPr>
+      <w:r>
+        <w:rPr>
+          <w:rFonts w:ascii="Arial" w:hAnsi="Arial"/>
+          <w:b/>
+          <w:sz w:val="22"/>
+        </w:rPr>
+        <w:t xml:space="preserve">Vertical-Slice Progress Motivation: </w:t>
+      </w:r>
+      <w:r>
+        <w:rPr>
+          <w:rFonts w:ascii="Arial" w:hAnsi="Arial"/>
+          <w:sz w:val="22"/>
+        </w:rPr>
+        <w:t>Delivers visual feedback by keeping sections organized around tangible screen panels, helping learners maintain interest.</w:t>
       </w:r>
     </w:p>
     <w:p>
       <w:pPr>
-        <w:spacing w:after="60"/>
-        <w:ind w:left="360" w:hanging="216"/>
-        <w:rPr>
-          <w:sz w:val="32"/>
-          <w:szCs w:val="32"/>
-        </w:rPr>
-      </w:pPr>
-      <w:r>
-        <w:rPr>
-          <w:sz w:val="32"/>
-          <w:szCs w:val="32"/>
-        </w:rPr>
-        <w:t>• Practical preparation for academic projects, portfolios, internships, and entry-level software development roles.</w:t>
+        <w:pStyle w:val="ListBullet"/>
+        <w:spacing w:after="80" w:line="276" w:lineRule="auto"/>
+      </w:pPr>
+      <w:r>
+        <w:rPr>
+          <w:rFonts w:ascii="Arial" w:hAnsi="Arial"/>
+          <w:b/>
+          <w:sz w:val="22"/>
+        </w:rPr>
+        <w:t xml:space="preserve">Secure Verification Loop: </w:t>
+      </w:r>
+      <w:r>
+        <w:rPr>
+          <w:rFonts w:ascii="Arial" w:hAnsi="Arial"/>
+          <w:sz w:val="22"/>
+        </w:rPr>
+        <w:t>Combines client sandboxes with server-side validation to ensure academic honesty and robustness.</w:t>
       </w:r>
     </w:p>
     <w:p>
       <w:pPr>
-        <w:spacing w:after="60"/>
-        <w:ind w:left="360" w:hanging="216"/>
-        <w:rPr>
-          <w:sz w:val="32"/>
-          <w:szCs w:val="32"/>
-        </w:rPr>
-      </w:pPr>
-      <w:r>
-        <w:rPr>
-          <w:sz w:val="32"/>
-          <w:szCs w:val="32"/>
-        </w:rPr>
-        <w:t>• Guided development of applications such as e-commerce platforms, streaming app</w:t>
-      </w:r>
-      <w:r>
-        <w:rPr>
-          <w:sz w:val="32"/>
-          <w:szCs w:val="32"/>
-        </w:rPr>
-        <w:t>lications, dashboards, and other user-defined systems.</w:t>
+        <w:keepNext/>
+        <w:spacing w:before="360" w:after="120"/>
+      </w:pPr>
+      <w:r>
+        <w:rPr>
+          <w:rFonts w:ascii="Arial" w:hAnsi="Arial"/>
+          <w:b/>
+          <w:sz w:val="24"/>
+        </w:rPr>
+        <w:t>9. APPLICATIONS:-</w:t>
       </w:r>
     </w:p>
     <w:p>
       <w:pPr>
-        <w:spacing w:after="60"/>
-        <w:ind w:left="360" w:hanging="216"/>
-        <w:rPr>
-          <w:sz w:val="32"/>
-          <w:szCs w:val="32"/>
-        </w:rPr>
-      </w:pPr>
-      <w:r>
-        <w:rPr>
-          <w:sz w:val="32"/>
-          <w:szCs w:val="32"/>
-        </w:rPr>
-        <w:t>• Personalized learning environments where the learning path changes according to the selected project and learner progress.</w:t>
+        <w:pStyle w:val="ListBullet"/>
+        <w:spacing w:after="80" w:line="276" w:lineRule="auto"/>
+      </w:pPr>
+      <w:r>
+        <w:rPr>
+          <w:rFonts w:ascii="Arial" w:hAnsi="Arial"/>
+          <w:b/>
+          <w:sz w:val="22"/>
+        </w:rPr>
+        <w:t xml:space="preserve">Academic Minor &amp; Major Projects: </w:t>
+      </w:r>
+      <w:r>
+        <w:rPr>
+          <w:rFonts w:ascii="Arial" w:hAnsi="Arial"/>
+          <w:sz w:val="22"/>
+        </w:rPr>
+        <w:t>Provides students in engineering colleges with a guided tool to develop their academic deliverables while simultaneously learning their stack.</w:t>
       </w:r>
     </w:p>
     <w:p>
       <w:pPr>
-        <w:spacing w:before="200" w:after="100"/>
-        <w:rPr>
-          <w:sz w:val="36"/>
-          <w:szCs w:val="36"/>
-        </w:rPr>
-      </w:pPr>
-      <w:r>
-        <w:rPr>
+        <w:pStyle w:val="ListBullet"/>
+        <w:spacing w:after="80" w:line="276" w:lineRule="auto"/>
+      </w:pPr>
+      <w:r>
+        <w:rPr>
+          <w:rFonts w:ascii="Arial" w:hAnsi="Arial"/>
           <w:b/>
-          <w:sz w:val="36"/>
-          <w:szCs w:val="36"/>
-        </w:rPr>
-        <w:t xml:space="preserve">10. FUTURE SCOPE OF THE </w:t>
-      </w:r>
-      <w:proofErr w:type="gramStart"/>
-      <w:r>
-        <w:rPr>
-          <w:b/>
-          <w:sz w:val="36"/>
-          <w:szCs w:val="36"/>
-        </w:rPr>
-        <w:t>PROJECT :</w:t>
-      </w:r>
-      <w:proofErr w:type="gramEnd"/>
-      <w:r>
-        <w:rPr>
-          <w:b/>
-          <w:sz w:val="36"/>
-          <w:szCs w:val="36"/>
-        </w:rPr>
-        <w:t>-</w:t>
+          <w:sz w:val="22"/>
+        </w:rPr>
+        <w:t xml:space="preserve">Career Shift &amp; Professional Upskilling: </w:t>
+      </w:r>
+      <w:r>
+        <w:rPr>
+          <w:rFonts w:ascii="Arial" w:hAnsi="Arial"/>
+          <w:sz w:val="22"/>
+        </w:rPr>
+        <w:t>Helps junior developers learn modern web development patterns by building actual portfolio-ready systems.</w:t>
       </w:r>
     </w:p>
     <w:p>
       <w:pPr>
-        <w:spacing w:after="120"/>
-        <w:jc w:val="both"/>
-        <w:rPr>
-          <w:sz w:val="32"/>
-          <w:szCs w:val="32"/>
-        </w:rPr>
-      </w:pPr>
-      <w:r>
-        <w:rPr>
-          <w:sz w:val="32"/>
-          <w:szCs w:val="32"/>
-        </w:rPr>
-        <w:t xml:space="preserve">Ascent.ai can be expanded by improving </w:t>
-      </w:r>
-      <w:r>
-        <w:rPr>
-          <w:sz w:val="32"/>
-          <w:szCs w:val="32"/>
-        </w:rPr>
-        <w:t>personalization according to learner performance, learning history, and weak areas. The platform can also adopt a hybrid content architecture combining a curated library of verified concepts with dynamically generated project-specific learning material.</w:t>
+        <w:pStyle w:val="ListBullet"/>
+        <w:spacing w:after="80" w:line="276" w:lineRule="auto"/>
+      </w:pPr>
+      <w:r>
+        <w:rPr>
+          <w:rFonts w:ascii="Arial" w:hAnsi="Arial"/>
+          <w:b/>
+          <w:sz w:val="22"/>
+        </w:rPr>
+        <w:t xml:space="preserve">Interactive Coding Bootcamps: </w:t>
+      </w:r>
+      <w:r>
+        <w:rPr>
+          <w:rFonts w:ascii="Arial" w:hAnsi="Arial"/>
+          <w:sz w:val="22"/>
+        </w:rPr>
+        <w:t>Acts as a virtual lab environment for coding bootcamps to scale lesson generation and automated test verification.</w:t>
       </w:r>
     </w:p>
     <w:p>
       <w:pPr>
-        <w:spacing w:after="120"/>
-        <w:jc w:val="both"/>
-        <w:rPr>
-          <w:sz w:val="32"/>
-          <w:szCs w:val="32"/>
-        </w:rPr>
-      </w:pPr>
-      <w:r>
-        <w:rPr>
-          <w:sz w:val="32"/>
-          <w:szCs w:val="32"/>
-        </w:rPr>
-        <w:lastRenderedPageBreak/>
-        <w:t>Fu</w:t>
-      </w:r>
-      <w:r>
-        <w:rPr>
-          <w:sz w:val="32"/>
-          <w:szCs w:val="32"/>
-        </w:rPr>
-        <w:t>ture versions can provide deeper automated testing, richer in-browser execution, deployment support, project versioning, repository integration, and more advanced feedback. The roadmap and lesson content can also be adapted dynamically according to the lea</w:t>
-      </w:r>
-      <w:r>
-        <w:rPr>
-          <w:sz w:val="32"/>
-          <w:szCs w:val="32"/>
-        </w:rPr>
-        <w:t>rner's previous performance.</w:t>
+        <w:pStyle w:val="ListBullet"/>
+        <w:spacing w:after="80" w:line="276" w:lineRule="auto"/>
+      </w:pPr>
+      <w:r>
+        <w:rPr>
+          <w:rFonts w:ascii="Arial" w:hAnsi="Arial"/>
+          <w:b/>
+          <w:sz w:val="22"/>
+        </w:rPr>
+        <w:t xml:space="preserve">Rapid Scaffolding &amp; Prototyping: </w:t>
+      </w:r>
+      <w:r>
+        <w:rPr>
+          <w:rFonts w:ascii="Arial" w:hAnsi="Arial"/>
+          <w:sz w:val="22"/>
+        </w:rPr>
+        <w:t>Can be utilized by developers to plan complex screen files, structures, and schemas based on custom system roadmaps.</w:t>
       </w:r>
     </w:p>
     <w:p>
       <w:pPr>
-        <w:spacing w:after="120"/>
-        <w:jc w:val="both"/>
-        <w:rPr>
-          <w:sz w:val="32"/>
-          <w:szCs w:val="32"/>
-        </w:rPr>
-      </w:pPr>
-      <w:r>
-        <w:rPr>
-          <w:sz w:val="32"/>
-          <w:szCs w:val="32"/>
-        </w:rPr>
-        <w:t>The platform can further expand its supported technologies and project categories. Additional modules can focus on backend development, databases, APIs, authentication, deployment, and advanced application architecture. The sys</w:t>
-      </w:r>
-      <w:r>
-        <w:rPr>
-          <w:sz w:val="32"/>
-          <w:szCs w:val="32"/>
-        </w:rPr>
-        <w:t>tem can also provide stronger portfolio-oriented outcomes by helping learners produce deployed and explainable projects.</w:t>
+        <w:keepNext/>
+        <w:spacing w:before="360" w:after="120"/>
+      </w:pPr>
+      <w:r>
+        <w:rPr>
+          <w:rFonts w:ascii="Arial" w:hAnsi="Arial"/>
+          <w:b/>
+          <w:sz w:val="24"/>
+        </w:rPr>
+        <w:t>10. FUTURE SCOPE OF THE PROJECT:-</w:t>
       </w:r>
     </w:p>
     <w:p>
       <w:pPr>
-        <w:spacing w:before="200" w:after="100"/>
-        <w:rPr>
-          <w:sz w:val="36"/>
-          <w:szCs w:val="36"/>
-        </w:rPr>
-      </w:pPr>
-      <w:r>
-        <w:rPr>
+        <w:pStyle w:val="ListBullet"/>
+        <w:spacing w:after="80" w:line="276" w:lineRule="auto"/>
+      </w:pPr>
+      <w:r>
+        <w:rPr>
+          <w:rFonts w:ascii="Arial" w:hAnsi="Arial"/>
           <w:b/>
-          <w:sz w:val="36"/>
-          <w:szCs w:val="36"/>
-        </w:rPr>
-        <w:t xml:space="preserve">11. </w:t>
-      </w:r>
-      <w:proofErr w:type="gramStart"/>
-      <w:r>
-        <w:rPr>
-          <w:b/>
-          <w:sz w:val="36"/>
-          <w:szCs w:val="36"/>
-        </w:rPr>
-        <w:t>CONCLUSION :</w:t>
-      </w:r>
-      <w:proofErr w:type="gramEnd"/>
-      <w:r>
-        <w:rPr>
-          <w:b/>
-          <w:sz w:val="36"/>
-          <w:szCs w:val="36"/>
-        </w:rPr>
-        <w:t>-</w:t>
+          <w:sz w:val="22"/>
+        </w:rPr>
+        <w:t xml:space="preserve">Adaptive Difficulty Controller: </w:t>
+      </w:r>
+      <w:r>
+        <w:rPr>
+          <w:rFonts w:ascii="Arial" w:hAnsi="Arial"/>
+          <w:sz w:val="22"/>
+        </w:rPr>
+        <w:t>Implement an LLM feedback loop that analyzes student errors, styling mistakes, and completion speeds to dynamically modify hints and curriculum pacing.</w:t>
       </w:r>
     </w:p>
     <w:p>
       <w:pPr>
-        <w:spacing w:after="120"/>
-        <w:jc w:val="both"/>
-        <w:rPr>
-          <w:sz w:val="32"/>
-          <w:szCs w:val="32"/>
-        </w:rPr>
-      </w:pPr>
-      <w:r>
-        <w:rPr>
-          <w:sz w:val="32"/>
-          <w:szCs w:val="32"/>
-        </w:rPr>
-        <w:t>Ascent.ai presents a project-based approach to coding education in which learning and implementation progress togethe</w:t>
-      </w:r>
-      <w:r>
-        <w:rPr>
-          <w:sz w:val="32"/>
-          <w:szCs w:val="32"/>
-        </w:rPr>
-        <w:t>r. The platform starts with the learner's own project idea and transforms it into a structured roadmap of screens, components, concepts, and hands-on modules.</w:t>
+        <w:pStyle w:val="ListBullet"/>
+        <w:spacing w:after="80" w:line="276" w:lineRule="auto"/>
+      </w:pPr>
+      <w:r>
+        <w:rPr>
+          <w:rFonts w:ascii="Arial" w:hAnsi="Arial"/>
+          <w:b/>
+          <w:sz w:val="22"/>
+        </w:rPr>
+        <w:t xml:space="preserve">Hybrid Content Architecture: </w:t>
+      </w:r>
+      <w:r>
+        <w:rPr>
+          <w:rFonts w:ascii="Arial" w:hAnsi="Arial"/>
+          <w:sz w:val="22"/>
+        </w:rPr>
+        <w:t>Combine an open-source library of pre-compiled, verified modules with generative components to reduce API hosting costs and improve explanation accuracy.</w:t>
       </w:r>
     </w:p>
     <w:p>
       <w:pPr>
-        <w:spacing w:after="120"/>
-        <w:jc w:val="both"/>
-        <w:rPr>
-          <w:sz w:val="32"/>
-          <w:szCs w:val="32"/>
-        </w:rPr>
-      </w:pPr>
-      <w:r>
-        <w:rPr>
-          <w:sz w:val="32"/>
-          <w:szCs w:val="32"/>
-        </w:rPr>
-        <w:t>By teaching concepts before asking learners to implement them, providing hints and automated vali</w:t>
-      </w:r>
-      <w:r>
-        <w:rPr>
-          <w:sz w:val="32"/>
-          <w:szCs w:val="32"/>
-        </w:rPr>
-        <w:t>dation, and allowing the project to grow screen by screen, Ascent.ai aims to reduce the gap between learning programming concepts and actually building software. The final outcome is not only knowledge but also a functional project that demonstrates what t</w:t>
-      </w:r>
-      <w:r>
-        <w:rPr>
-          <w:sz w:val="32"/>
-          <w:szCs w:val="32"/>
-        </w:rPr>
-        <w:t>he learner has learned and built.</w:t>
+        <w:pStyle w:val="ListBullet"/>
+        <w:spacing w:after="80" w:line="276" w:lineRule="auto"/>
+      </w:pPr>
+      <w:r>
+        <w:rPr>
+          <w:rFonts w:ascii="Arial" w:hAnsi="Arial"/>
+          <w:b/>
+          <w:sz w:val="22"/>
+        </w:rPr>
+        <w:t xml:space="preserve">Collaborative Multiplayer Coding: </w:t>
+      </w:r>
+      <w:r>
+        <w:rPr>
+          <w:rFonts w:ascii="Arial" w:hAnsi="Arial"/>
+          <w:sz w:val="22"/>
+        </w:rPr>
+        <w:t>Integrate WebRTC-based live coding rooms, allowing multiple students or student-mentor teams to collaborate in the same sandbox.</w:t>
       </w:r>
     </w:p>
     <w:p>
       <w:pPr>
-        <w:spacing w:before="200" w:after="100"/>
-        <w:rPr>
-          <w:sz w:val="36"/>
-          <w:szCs w:val="36"/>
-        </w:rPr>
-      </w:pPr>
-      <w:r>
-        <w:rPr>
+        <w:pStyle w:val="ListBullet"/>
+        <w:spacing w:after="80" w:line="276" w:lineRule="auto"/>
+      </w:pPr>
+      <w:r>
+        <w:rPr>
+          <w:rFonts w:ascii="Arial" w:hAnsi="Arial"/>
           <w:b/>
-          <w:sz w:val="36"/>
-          <w:szCs w:val="36"/>
-        </w:rPr>
-        <w:t xml:space="preserve">12. </w:t>
-      </w:r>
-      <w:proofErr w:type="gramStart"/>
-      <w:r>
-        <w:rPr>
-          <w:b/>
-          <w:sz w:val="36"/>
-          <w:szCs w:val="36"/>
-        </w:rPr>
-        <w:t>REFERENCES :</w:t>
-      </w:r>
-      <w:proofErr w:type="gramEnd"/>
-      <w:r>
-        <w:rPr>
-          <w:b/>
-          <w:sz w:val="36"/>
-          <w:szCs w:val="36"/>
-        </w:rPr>
-        <w:t>-</w:t>
+          <w:sz w:val="22"/>
+        </w:rPr>
+        <w:t xml:space="preserve">Automated Git Sync &amp; Cloud Deployment: </w:t>
+      </w:r>
+      <w:r>
+        <w:rPr>
+          <w:rFonts w:ascii="Arial" w:hAnsi="Arial"/>
+          <w:sz w:val="22"/>
+        </w:rPr>
+        <w:t>Extend the sandbox to commit progress directly to GitHub and deploy the final build to hosting providers (Vercel, Netlify, Render).</w:t>
       </w:r>
     </w:p>
     <w:p>
       <w:pPr>
-        <w:spacing w:after="60"/>
-        <w:ind w:left="360" w:hanging="216"/>
-        <w:rPr>
-          <w:sz w:val="32"/>
-          <w:szCs w:val="32"/>
-        </w:rPr>
-      </w:pPr>
-      <w:r>
-        <w:rPr>
-          <w:sz w:val="32"/>
-          <w:szCs w:val="32"/>
-        </w:rPr>
-        <w:t>• Project Design Brief: ed-tech platform concept and product-flow documentation.</w:t>
+        <w:keepNext/>
+        <w:spacing w:before="360" w:after="120"/>
+      </w:pPr>
+      <w:r>
+        <w:rPr>
+          <w:rFonts w:ascii="Arial" w:hAnsi="Arial"/>
+          <w:b/>
+          <w:sz w:val="24"/>
+        </w:rPr>
+        <w:t>11. CONCLUSION:-</w:t>
       </w:r>
     </w:p>
     <w:p>
       <w:pPr>
-        <w:spacing w:after="60"/>
-        <w:ind w:left="360" w:hanging="216"/>
-        <w:rPr>
-          <w:sz w:val="32"/>
-          <w:szCs w:val="32"/>
-        </w:rPr>
-      </w:pPr>
-      <w:r>
-        <w:rPr>
-          <w:sz w:val="32"/>
-          <w:szCs w:val="32"/>
-        </w:rPr>
-        <w:t>• CodeCrafters – referenced in the project brief for project-based software learning.</w:t>
+        <w:spacing w:after="120" w:line="276" w:lineRule="auto"/>
+      </w:pPr>
+      <w:r>
+        <w:rPr>
+          <w:rFonts w:ascii="Arial" w:hAnsi="Arial"/>
+          <w:sz w:val="22"/>
+        </w:rPr>
+        <w:t>Ascent.ai presents a project-based approach to programming education. By structuring the learning path directly around the student's personal project prompt, it ensures that every coding concept has a concrete application and immediate utility. The vertical-slice progression, paired with visual feedback and automated testing gates, prevents passive copying and guarantees that the learner develops a deep, working understanding of full-stack engineering.</w:t>
       </w:r>
     </w:p>
     <w:p>
       <w:pPr>
-        <w:spacing w:after="60"/>
-        <w:ind w:left="360" w:hanging="216"/>
-        <w:rPr>
-          <w:sz w:val="32"/>
-          <w:szCs w:val="32"/>
-        </w:rPr>
-      </w:pPr>
-      <w:r>
-        <w:rPr>
-          <w:sz w:val="32"/>
-          <w:szCs w:val="32"/>
-        </w:rPr>
-        <w:t xml:space="preserve">• Boot.dev – referenced in the </w:t>
-      </w:r>
-      <w:r>
-        <w:rPr>
-          <w:sz w:val="32"/>
-          <w:szCs w:val="32"/>
-        </w:rPr>
-        <w:t>project brief for AI-assisted and gamified coding education.</w:t>
+        <w:spacing w:after="120" w:line="276" w:lineRule="auto"/>
+      </w:pPr>
+      <w:r>
+        <w:rPr>
+          <w:rFonts w:ascii="Arial" w:hAnsi="Arial"/>
+          <w:sz w:val="22"/>
+        </w:rPr>
+        <w:t>Ultimately, Ascent.ai shifts the focus of computer science education from certificates to working, explainable software. It bridges the gap between learning programming languages and compiling real, interactive systems, making it an excellent candidate for academic minor projects and self-guided engineering laboratories.</w:t>
       </w:r>
     </w:p>
     <w:p>
       <w:pPr>
-        <w:spacing w:after="60"/>
-        <w:ind w:left="360" w:hanging="216"/>
-        <w:rPr>
-          <w:sz w:val="32"/>
-          <w:szCs w:val="32"/>
-        </w:rPr>
-      </w:pPr>
-      <w:r>
-        <w:rPr>
-          <w:sz w:val="32"/>
-          <w:szCs w:val="32"/>
-        </w:rPr>
-        <w:t>• Codecademy AI Builder – referenced in the project brief as a comparable AI-powered learning product.</w:t>
+        <w:keepNext/>
+        <w:spacing w:before="360" w:after="120"/>
+      </w:pPr>
+      <w:r>
+        <w:rPr>
+          <w:rFonts w:ascii="Arial" w:hAnsi="Arial"/>
+          <w:b/>
+          <w:sz w:val="24"/>
+        </w:rPr>
+        <w:t>12. REFERENCES:-</w:t>
       </w:r>
     </w:p>
     <w:p>
       <w:pPr>
-        <w:spacing w:after="60"/>
-        <w:ind w:left="360" w:hanging="216"/>
-        <w:rPr>
-          <w:sz w:val="32"/>
-          <w:szCs w:val="32"/>
-        </w:rPr>
-      </w:pPr>
-      <w:r>
-        <w:rPr>
-          <w:sz w:val="32"/>
-          <w:szCs w:val="32"/>
-        </w:rPr>
-        <w:lastRenderedPageBreak/>
-        <w:t>• Documentation and research resources related to Large Language Models, AI-assisted educati</w:t>
-      </w:r>
-      <w:r>
-        <w:rPr>
-          <w:sz w:val="32"/>
-          <w:szCs w:val="32"/>
-        </w:rPr>
-        <w:t>on, browser-based code execution, and software project learning.</w:t>
+        <w:pStyle w:val="ListBullet"/>
+        <w:spacing w:after="80" w:line="276" w:lineRule="auto"/>
+      </w:pPr>
+      <w:r>
+        <w:rPr>
+          <w:rFonts w:ascii="Arial" w:hAnsi="Arial"/>
+          <w:b/>
+          <w:sz w:val="22"/>
+        </w:rPr>
+        <w:t xml:space="preserve">Active Pedagogy in CS Education: </w:t>
+      </w:r>
+      <w:r>
+        <w:rPr>
+          <w:rFonts w:ascii="Arial" w:hAnsi="Arial"/>
+          <w:sz w:val="22"/>
+        </w:rPr>
+        <w:t>Prince, M. (2004). 'Does Active Learning Work? A Review of the Research.' Journal of Engineering Education, 93(3), 223-231.</w:t>
       </w:r>
     </w:p>
     <w:p>
       <w:pPr>
-        <w:spacing w:after="60"/>
-        <w:ind w:left="360" w:hanging="216"/>
-        <w:rPr>
-          <w:sz w:val="32"/>
-          <w:szCs w:val="32"/>
-        </w:rPr>
-      </w:pPr>
+        <w:pStyle w:val="ListBullet"/>
+        <w:spacing w:after="80" w:line="276" w:lineRule="auto"/>
+      </w:pPr>
+      <w:r>
+        <w:rPr>
+          <w:rFonts w:ascii="Arial" w:hAnsi="Arial"/>
+          <w:b/>
+          <w:sz w:val="22"/>
+        </w:rPr>
+        <w:t xml:space="preserve">Reference Models: </w:t>
+      </w:r>
+      <w:r>
+        <w:rPr>
+          <w:rFonts w:ascii="Arial" w:hAnsi="Arial"/>
+          <w:sz w:val="22"/>
+        </w:rPr>
+        <w:t>CodeCrafters System Architecture (Git-based automated tests); Boot.dev Socratic tutoring methods.</w:t>
+      </w:r>
+    </w:p>
+    <w:p>
+      <w:pPr>
+        <w:pStyle w:val="ListBullet"/>
+        <w:spacing w:after="80" w:line="276" w:lineRule="auto"/>
+      </w:pPr>
+      <w:r>
+        <w:rPr>
+          <w:rFonts w:ascii="Arial" w:hAnsi="Arial"/>
+          <w:b/>
+          <w:sz w:val="22"/>
+        </w:rPr>
+        <w:t xml:space="preserve">In-Browser Execution: </w:t>
+      </w:r>
+      <w:r>
+        <w:rPr>
+          <w:rFonts w:ascii="Arial" w:hAnsi="Arial"/>
+          <w:sz w:val="22"/>
+        </w:rPr>
+        <w:t>StackBlitz WebContainers SDK documentation (Run Node.js directly in Web Assembly browsers).</w:t>
+      </w:r>
+    </w:p>
+    <w:p>
+      <w:pPr>
+        <w:pStyle w:val="ListBullet"/>
+        <w:spacing w:after="80" w:line="276" w:lineRule="auto"/>
+      </w:pPr>
+      <w:r>
+        <w:rPr>
+          <w:rFonts w:ascii="Arial" w:hAnsi="Arial"/>
+          <w:b/>
+          <w:sz w:val="22"/>
+        </w:rPr>
+        <w:t xml:space="preserve">AI-Generated Education Systems: </w:t>
+      </w:r>
+      <w:r>
+        <w:rPr>
+          <w:rFonts w:ascii="Arial" w:hAnsi="Arial"/>
+          <w:sz w:val="22"/>
+        </w:rPr>
+        <w:t>Codecademy AI Builder concept briefs (Reverse-engineering syllabus paths from AI prototypes).</w:t>
+      </w:r>
     </w:p>
     <w:sectPr>
       <w:pgSz w:w="12240" w:h="15840"/>

</xml_diff>

<commit_message>
feat: add UI prototypes, product requirements, and design documentation for Ascent AI IDE
</commit_message>
<xml_diff>
--- a/Ascent_AI_Project_Synopsis.docx
+++ b/Ascent_AI_Project_Synopsis.docx
@@ -1,6 +1,6 @@
 
 <file path=word/document.xml><?xml version="1.0" encoding="utf-8"?>
-<w:document xmlns:wpc="http://schemas.microsoft.com/office/word/2010/wordprocessingCanvas" xmlns:cx="http://schemas.microsoft.com/office/drawing/2014/chartex" xmlns:cx1="http://schemas.microsoft.com/office/drawing/2015/9/8/chartex" xmlns:cx2="http://schemas.microsoft.com/office/drawing/2015/10/21/chartex" xmlns:cx3="http://schemas.microsoft.com/office/drawing/2016/5/9/chartex" xmlns:cx4="http://schemas.microsoft.com/office/drawing/2016/5/10/chartex" xmlns:cx5="http://schemas.microsoft.com/office/drawing/2016/5/11/chartex" xmlns:cx6="http://schemas.microsoft.com/office/drawing/2016/5/12/chartex" xmlns:cx7="http://schemas.microsoft.com/office/drawing/2016/5/13/chartex" xmlns:cx8="http://schemas.microsoft.com/office/drawing/2016/5/14/chartex" xmlns:mc="http://schemas.openxmlformats.org/markup-compatibility/2006" xmlns:aink="http://schemas.microsoft.com/office/drawing/2016/ink" xmlns:am3d="http://schemas.microsoft.com/office/drawing/2017/model3d" xmlns:o="urn:schemas-microsoft-com:office:office" xmlns:r="http://schemas.openxmlformats.org/officeDocument/2006/relationships" xmlns:m="http://schemas.openxmlformats.org/officeDocument/2006/math" xmlns:v="urn:schemas-microsoft-com:vml" xmlns:wp14="http://schemas.microsoft.com/office/word/2010/wordprocessingDrawing" xmlns:wp="http://schemas.openxmlformats.org/drawingml/2006/wordprocessingDrawing" xmlns:w10="urn:schemas-microsoft-com:office:word" xmlns:w="http://schemas.openxmlformats.org/wordprocessingml/2006/main" xmlns:w14="http://schemas.microsoft.com/office/word/2010/wordml" xmlns:w15="http://schemas.microsoft.com/office/word/2012/wordml" xmlns:w16cid="http://schemas.microsoft.com/office/word/2016/wordml/cid" xmlns:w16se="http://schemas.microsoft.com/office/word/2015/wordml/symex" xmlns:wpg="http://schemas.microsoft.com/office/word/2010/wordprocessingGroup" xmlns:wpi="http://schemas.microsoft.com/office/word/2010/wordprocessingInk" xmlns:wne="http://schemas.microsoft.com/office/word/2006/wordml" xmlns:wps="http://schemas.microsoft.com/office/word/2010/wordprocessingShape" mc:Ignorable="w14 w15 w16se w16cid wp14">
+<w:document xmlns:wpc="http://schemas.microsoft.com/office/word/2010/wordprocessingCanvas" xmlns:mc="http://schemas.openxmlformats.org/markup-compatibility/2006" xmlns:o="urn:schemas-microsoft-com:office:office" xmlns:r="http://schemas.openxmlformats.org/officeDocument/2006/relationships" xmlns:m="http://schemas.openxmlformats.org/officeDocument/2006/math" xmlns:v="urn:schemas-microsoft-com:vml" xmlns:wp14="http://schemas.microsoft.com/office/word/2010/wordprocessingDrawing" xmlns:wp="http://schemas.openxmlformats.org/drawingml/2006/wordprocessingDrawing" xmlns:w10="urn:schemas-microsoft-com:office:word" xmlns:w="http://schemas.openxmlformats.org/wordprocessingml/2006/main" xmlns:w14="http://schemas.microsoft.com/office/word/2010/wordml" xmlns:w15="http://schemas.microsoft.com/office/word/2012/wordml" xmlns:w16se="http://schemas.microsoft.com/office/word/2015/wordml/symex" xmlns:w16cid="http://schemas.microsoft.com/office/word/2016/wordml/cid" xmlns:w16="http://schemas.microsoft.com/office/word/2018/wordml" xmlns:w16cex="http://schemas.microsoft.com/office/word/2018/wordml/cex" xmlns:w16sdtdh="http://schemas.microsoft.com/office/word/2020/wordml/sdtdatahash" xmlns:wne="http://schemas.microsoft.com/office/word/2006/wordml" xmlns:wpg="http://schemas.microsoft.com/office/word/2010/wordprocessingGroup" xmlns:wps="http://schemas.microsoft.com/office/word/2010/wordprocessingShape" mc:Ignorable="w14 w15 w16se w16cid w16 w16cex w16sdtdh wp14">
   <w:body>
     <w:p>
       <w:pPr>
@@ -8,7 +8,7 @@
         <w:spacing w:line="240" w:lineRule="auto"/>
         <w:jc w:val="center"/>
         <w:rPr>
-          <w:rFonts w:ascii="Times New Roman" w:eastAsia="Times New Roman" w:hAnsi="Times New Roman" w:cs="Times New Roman"/>
+          <w:rFonts w:ascii="Times New Roman" w:hAnsi="Times New Roman" w:eastAsia="Times New Roman" w:cs="Times New Roman"/>
           <w:b/>
           <w:bCs/>
           <w:sz w:val="40"/>
@@ -27,7 +27,7 @@
       </w:pPr>
       <w:r>
         <w:rPr>
-          <w:rFonts w:ascii="Times New Roman" w:eastAsia="Times New Roman" w:hAnsi="Times New Roman" w:cs="Times New Roman"/>
+          <w:rFonts w:ascii="Times New Roman" w:hAnsi="Times New Roman" w:eastAsia="Times New Roman" w:cs="Times New Roman"/>
           <w:b/>
           <w:bCs/>
           <w:sz w:val="40"/>
@@ -43,7 +43,7 @@
         <w:spacing w:line="240" w:lineRule="auto"/>
         <w:jc w:val="center"/>
         <w:rPr>
-          <w:rFonts w:ascii="Times New Roman" w:eastAsia="Times New Roman" w:hAnsi="Times New Roman" w:cs="Times New Roman"/>
+          <w:rFonts w:ascii="Times New Roman" w:hAnsi="Times New Roman" w:eastAsia="Times New Roman" w:cs="Times New Roman"/>
           <w:b/>
           <w:bCs/>
           <w:sz w:val="40"/>
@@ -60,7 +60,7 @@
       </w:pPr>
       <w:r>
         <w:rPr>
-          <w:rFonts w:ascii="Times New Roman" w:eastAsia="Times New Roman" w:hAnsi="Times New Roman" w:cs="Times New Roman"/>
+          <w:rFonts w:ascii="Times New Roman" w:hAnsi="Times New Roman" w:eastAsia="Times New Roman" w:cs="Times New Roman"/>
           <w:b/>
           <w:bCs/>
           <w:sz w:val="40"/>
@@ -76,7 +76,7 @@
         <w:spacing w:line="240" w:lineRule="auto"/>
         <w:jc w:val="center"/>
         <w:rPr>
-          <w:rFonts w:ascii="Times New Roman" w:eastAsia="Times New Roman" w:hAnsi="Times New Roman" w:cs="Times New Roman"/>
+          <w:rFonts w:ascii="Times New Roman" w:hAnsi="Times New Roman" w:eastAsia="Times New Roman" w:cs="Times New Roman"/>
           <w:b/>
           <w:bCs/>
           <w:sz w:val="40"/>
@@ -92,28 +92,23 @@
         <w:jc w:val="center"/>
       </w:pPr>
       <w:r>
-        <w:rPr>
-          <w:noProof/>
-        </w:rPr>
         <w:drawing>
-          <wp:inline distT="0" distB="0" distL="0" distR="0" wp14:anchorId="638D3B8E" wp14:editId="3C32A9C0">
-            <wp:extent cx="2695651" cy="1990831"/>
-            <wp:effectExtent l="0" t="0" r="9449" b="9419"/>
-            <wp:docPr id="1" name="image1.png"/>
-            <wp:cNvGraphicFramePr/>
+          <wp:inline distT="0" distB="0" distL="0" distR="0">
+            <wp:extent cx="2695575" cy="1990725"/>
+            <wp:effectExtent l="0" t="0" r="9525" b="9525"/>
+            <wp:docPr id="100000" name="Picture 100000"/>
+            <wp:cNvGraphicFramePr>
+              <a:graphicFrameLocks xmlns:a="http://schemas.openxmlformats.org/drawingml/2006/main" noChangeAspect="1"/>
+            </wp:cNvGraphicFramePr>
             <a:graphic xmlns:a="http://schemas.openxmlformats.org/drawingml/2006/main">
               <a:graphicData uri="http://schemas.openxmlformats.org/drawingml/2006/picture">
                 <pic:pic xmlns:pic="http://schemas.openxmlformats.org/drawingml/2006/picture">
                   <pic:nvPicPr>
-                    <pic:cNvPr id="0" name=""/>
+                    <pic:cNvPr id="100000" name="image100000"/>
                     <pic:cNvPicPr/>
                   </pic:nvPicPr>
                   <pic:blipFill>
-                    <a:blip r:embed="rId6">
-                      <a:lum/>
-                      <a:alphaModFix/>
-                    </a:blip>
-                    <a:srcRect/>
+                    <a:blip r:embed="rId9"/>
                     <a:stretch>
                       <a:fillRect/>
                     </a:stretch>
@@ -121,16 +116,11 @@
                   <pic:spPr>
                     <a:xfrm>
                       <a:off x="0" y="0"/>
-                      <a:ext cx="2695651" cy="1990831"/>
+                      <a:ext cx="2695575" cy="1990725"/>
                     </a:xfrm>
                     <a:prstGeom prst="rect">
                       <a:avLst/>
                     </a:prstGeom>
-                    <a:noFill/>
-                    <a:ln>
-                      <a:noFill/>
-                      <a:prstDash/>
-                    </a:ln>
                   </pic:spPr>
                 </pic:pic>
               </a:graphicData>
@@ -147,7 +137,7 @@
       </w:pPr>
       <w:r>
         <w:rPr>
-          <w:rFonts w:ascii="Times New Roman" w:eastAsia="Times New Roman" w:hAnsi="Times New Roman" w:cs="Times New Roman"/>
+          <w:rFonts w:ascii="Times New Roman" w:hAnsi="Times New Roman" w:eastAsia="Times New Roman" w:cs="Times New Roman"/>
           <w:b/>
           <w:bCs/>
           <w:sz w:val="40"/>
@@ -158,7 +148,7 @@
       </w:r>
       <w:r>
         <w:rPr>
-          <w:rFonts w:ascii="Times New Roman" w:eastAsia="Times New Roman" w:hAnsi="Times New Roman" w:cs="Times New Roman"/>
+          <w:rFonts w:ascii="Times New Roman" w:hAnsi="Times New Roman" w:eastAsia="Times New Roman" w:cs="Times New Roman"/>
           <w:b/>
           <w:bCs/>
           <w:sz w:val="40"/>
@@ -169,7 +159,7 @@
       </w:r>
       <w:r>
         <w:rPr>
-          <w:rFonts w:ascii="Times New Roman" w:eastAsia="Times New Roman" w:hAnsi="Times New Roman" w:cs="Times New Roman"/>
+          <w:rFonts w:ascii="Times New Roman" w:hAnsi="Times New Roman" w:eastAsia="Times New Roman" w:cs="Times New Roman"/>
           <w:b/>
           <w:bCs/>
           <w:sz w:val="40"/>
@@ -180,7 +170,7 @@
       </w:r>
       <w:r>
         <w:rPr>
-          <w:rFonts w:ascii="Times New Roman" w:eastAsia="Times New Roman" w:hAnsi="Times New Roman" w:cs="Times New Roman"/>
+          <w:rFonts w:ascii="Times New Roman" w:hAnsi="Times New Roman" w:eastAsia="Times New Roman" w:cs="Times New Roman"/>
           <w:b/>
           <w:bCs/>
           <w:sz w:val="40"/>
@@ -198,7 +188,7 @@
       </w:pPr>
       <w:r>
         <w:rPr>
-          <w:rFonts w:ascii="Times New Roman" w:eastAsia="Times New Roman" w:hAnsi="Times New Roman" w:cs="Times New Roman"/>
+          <w:rFonts w:ascii="Times New Roman" w:hAnsi="Times New Roman" w:eastAsia="Times New Roman" w:cs="Times New Roman"/>
           <w:b/>
           <w:bCs/>
           <w:sz w:val="40"/>
@@ -207,22 +197,20 @@
         </w:rPr>
         <w:t xml:space="preserve">PROJECT </w:t>
       </w:r>
-      <w:proofErr w:type="gramStart"/>
-      <w:r>
-        <w:rPr>
-          <w:rFonts w:ascii="Times New Roman" w:eastAsia="Times New Roman" w:hAnsi="Times New Roman" w:cs="Times New Roman"/>
+      <w:r>
+        <w:rPr>
+          <w:rFonts w:ascii="Times New Roman" w:hAnsi="Times New Roman" w:eastAsia="Times New Roman" w:cs="Times New Roman"/>
           <w:b/>
           <w:bCs/>
           <w:sz w:val="40"/>
           <w:szCs w:val="40"/>
           <w:u w:val="single"/>
         </w:rPr>
-        <w:t>-  (</w:t>
-      </w:r>
-      <w:proofErr w:type="gramEnd"/>
-      <w:r>
-        <w:rPr>
-          <w:rFonts w:ascii="Times New Roman" w:eastAsia="Times New Roman" w:hAnsi="Times New Roman" w:cs="Times New Roman"/>
+        <w:t xml:space="preserve">-  (</w:t>
+      </w:r>
+      <w:r>
+        <w:rPr>
+          <w:rFonts w:ascii="Times New Roman" w:hAnsi="Times New Roman" w:eastAsia="Times New Roman" w:cs="Times New Roman"/>
           <w:b/>
           <w:bCs/>
           <w:sz w:val="40"/>
@@ -233,7 +221,7 @@
       </w:r>
       <w:r>
         <w:rPr>
-          <w:rFonts w:ascii="Times New Roman" w:eastAsia="Times New Roman" w:hAnsi="Times New Roman" w:cs="Times New Roman"/>
+          <w:rFonts w:ascii="Times New Roman" w:hAnsi="Times New Roman" w:eastAsia="Times New Roman" w:cs="Times New Roman"/>
           <w:b/>
           <w:bCs/>
           <w:sz w:val="40"/>
@@ -255,7 +243,7 @@
       </w:pPr>
       <w:r>
         <w:rPr>
-          <w:rFonts w:ascii="Times New Roman" w:eastAsia="Times New Roman" w:hAnsi="Times New Roman" w:cs="Times New Roman"/>
+          <w:rFonts w:ascii="Times New Roman" w:hAnsi="Times New Roman" w:eastAsia="Times New Roman" w:cs="Times New Roman"/>
           <w:b/>
           <w:bCs/>
           <w:sz w:val="40"/>
@@ -265,61 +253,48 @@
         <w:t>ON</w:t>
       </w:r>
       <w:r>
-        <w:rPr>
-          <w:rFonts w:ascii="Times New Roman" w:eastAsia="Times New Roman" w:hAnsi="Times New Roman" w:cs="Times New Roman"/>
+        <w:br w:type="textWrapping"/>
+      </w:r>
+      <w:r>
+        <w:rPr>
+          <w:rFonts w:ascii="Times New Roman" w:hAnsi="Times New Roman" w:eastAsia="Arial" w:cs="Arial"/>
           <w:b/>
           <w:bCs/>
           <w:sz w:val="40"/>
           <w:szCs w:val="40"/>
-          <w:u w:val="single"/>
-        </w:rPr>
-        <w:br/>
-      </w:r>
-      <w:r>
-        <w:rPr>
-          <w:rFonts w:ascii="Times New Roman" w:hAnsi="Times New Roman"/>
+        </w:rPr>
+        <w:t>ASCENT.AI</w:t>
+      </w:r>
+      <w:r>
+        <w:br w:type="textWrapping"/>
+      </w:r>
+      <w:r>
+        <w:rPr>
+          <w:rFonts w:ascii="Times New Roman" w:hAnsi="Times New Roman" w:eastAsia="Arial" w:cs="Arial"/>
           <w:b/>
           <w:bCs/>
           <w:sz w:val="40"/>
           <w:szCs w:val="40"/>
         </w:rPr>
-        <w:t>ASCENT.AI</w:t>
-      </w:r>
-      <w:r>
-        <w:rPr>
-          <w:rFonts w:ascii="Times New Roman" w:hAnsi="Times New Roman"/>
-          <w:b/>
-          <w:bCs/>
+        <w:t>(</w:t>
+      </w:r>
+      <w:r>
+        <w:rPr>
+          <w:rFonts w:ascii="Times New Roman" w:hAnsi="Times New Roman" w:eastAsia="Arial" w:cs="Arial"/>
           <w:sz w:val="40"/>
           <w:szCs w:val="40"/>
         </w:rPr>
-        <w:br/>
-        <w:t>(</w:t>
-      </w:r>
-      <w:r>
-        <w:rPr>
-          <w:rFonts w:ascii="Times New Roman" w:hAnsi="Times New Roman"/>
-          <w:sz w:val="40"/>
-          <w:szCs w:val="40"/>
-        </w:rPr>
-        <w:t>From Idea to Implementation</w:t>
-      </w:r>
-      <w:r>
-        <w:rPr>
-          <w:rFonts w:ascii="Times New Roman" w:hAnsi="Times New Roman"/>
-          <w:sz w:val="40"/>
-          <w:szCs w:val="40"/>
-        </w:rPr>
-        <w:t>)</w:t>
+        <w:t>From Idea to Implementation)</w:t>
       </w:r>
     </w:p>
     <w:p>
       <w:pPr>
         <w:pStyle w:val="NormalWeb"/>
-        <w:spacing w:before="480" w:beforeAutospacing="0" w:after="0" w:afterAutospacing="0" w:line="0" w:lineRule="auto"/>
-      </w:pPr>
-      <w:r>
-        <w:rPr>
+        <w:spacing w:before="480" w:after="0" w:line="0" w:lineRule="auto"/>
+      </w:pPr>
+      <w:r>
+        <w:rPr>
+          <w:rFonts w:ascii="Times New Roman" w:hAnsi="Times New Roman" w:eastAsia="Times New Roman" w:cs="Times New Roman"/>
           <w:color w:val="000000"/>
           <w:sz w:val="36"/>
           <w:szCs w:val="36"/>
@@ -328,6 +303,7 @@
       </w:r>
       <w:r>
         <w:rPr>
+          <w:rFonts w:ascii="Times New Roman" w:hAnsi="Times New Roman" w:eastAsia="Times New Roman" w:cs="Times New Roman"/>
           <w:color w:val="000000"/>
           <w:sz w:val="36"/>
           <w:szCs w:val="36"/>
@@ -336,360 +312,629 @@
       </w:r>
     </w:p>
     <w:p>
-      <w:r>
-        <w:rPr>
-          <w:rFonts w:eastAsia="Times New Roman" w:cs="Times New Roman"/>
+      <w:pPr>
+        <w:spacing w:after="200" w:line="276" w:lineRule="auto"/>
+      </w:pPr>
+      <w:r>
+        <w:br w:type="textWrapping"/>
+      </w:r>
+      <w:r>
+        <w:br w:type="textWrapping"/>
+      </w:r>
+      <w:r>
+        <w:br w:type="textWrapping"/>
+      </w:r>
+      <w:r>
+        <w:br w:type="textWrapping"/>
+      </w:r>
+      <w:r>
+        <w:br w:type="textWrapping"/>
+      </w:r>
+    </w:p>
+    <w:p>
+      <w:r>
+        <w:br w:type="page"/>
+      </w:r>
+    </w:p>
+    <w:p>
+      <w:pPr>
+        <w:spacing w:before="200" w:after="100"/>
+        <w:jc w:val="center"/>
+        <w:rPr>
+          <w:sz w:val="36"/>
+          <w:szCs w:val="36"/>
+        </w:rPr>
+      </w:pPr>
+      <w:r>
+        <w:lastRenderedPageBreak/>
+        <w:rPr>
+          <w:rFonts w:ascii="Times New Roman" w:hAnsi="Times New Roman" w:eastAsia="ＭＳ 明朝" w:cs="Mangal" w:eastAsiaTheme="minorEastAsia" w:csTheme="minorBidi"/>
           <w:b/>
           <w:bCs/>
-          <w:sz w:val="40"/>
-          <w:szCs w:val="40"/>
-          <w:u w:val="single"/>
-        </w:rPr>
-        <w:br/>
-      </w:r>
-      <w:r>
-        <w:rPr>
-          <w:rFonts w:eastAsia="Times New Roman" w:cs="Times New Roman"/>
-          <w:b/>
-          <w:bCs/>
-          <w:sz w:val="40"/>
-          <w:szCs w:val="40"/>
-          <w:u w:val="single"/>
-        </w:rPr>
-        <w:br/>
-      </w:r>
-      <w:r>
-        <w:rPr>
-          <w:rFonts w:eastAsia="Times New Roman" w:cs="Times New Roman"/>
-          <w:b/>
-          <w:bCs/>
-          <w:sz w:val="40"/>
-          <w:szCs w:val="40"/>
-          <w:u w:val="single"/>
-        </w:rPr>
-        <w:br/>
-      </w:r>
-      <w:r>
-        <w:rPr>
-          <w:rFonts w:eastAsia="Times New Roman" w:cs="Times New Roman"/>
-          <w:b/>
-          <w:bCs/>
-          <w:sz w:val="40"/>
-          <w:szCs w:val="40"/>
-          <w:u w:val="single"/>
-        </w:rPr>
-        <w:br/>
-      </w:r>
-      <w:r>
-        <w:rPr>
-          <w:rFonts w:eastAsia="Times New Roman" w:cs="Times New Roman"/>
-          <w:b/>
-          <w:bCs/>
-          <w:sz w:val="40"/>
-          <w:szCs w:val="40"/>
-          <w:u w:val="single"/>
-        </w:rPr>
-        <w:br/>
-      </w:r>
-      <w:r>
-        <w:br w:type="page"/>
+          <w:sz w:val="36"/>
+          <w:szCs w:val="36"/>
+        </w:rPr>
+        <w:t>TABLE OF CONTENT</w:t>
       </w:r>
     </w:p>
     <w:p>
       <w:pPr>
-        <w:spacing w:before="200" w:after="100"/>
-        <w:jc w:val="center"/>
+        <w:spacing w:after="120"/>
+        <w:jc w:val="both"/>
         <w:rPr>
           <w:sz w:val="36"/>
           <w:szCs w:val="36"/>
         </w:rPr>
       </w:pPr>
       <w:r>
+        <w:br w:type="textWrapping"/>
+      </w:r>
+      <w:r>
+        <w:br w:type="textWrapping"/>
+      </w:r>
+      <w:r>
+        <w:rPr>
+          <w:rFonts w:ascii="Times New Roman" w:hAnsi="Times New Roman" w:eastAsia="ＭＳ 明朝" w:cs="Mangal" w:eastAsiaTheme="minorEastAsia" w:csTheme="minorBidi"/>
+          <w:sz w:val="36"/>
+          <w:szCs w:val="36"/>
+        </w:rPr>
+        <w:t>1. Title of the project</w:t>
+      </w:r>
+    </w:p>
+    <w:p>
+      <w:pPr>
+        <w:spacing w:after="120"/>
+        <w:jc w:val="both"/>
+        <w:rPr>
+          <w:sz w:val="36"/>
+          <w:szCs w:val="36"/>
+        </w:rPr>
+      </w:pPr>
+      <w:r>
+        <w:rPr>
+          <w:rFonts w:ascii="Times New Roman" w:hAnsi="Times New Roman" w:eastAsia="ＭＳ 明朝" w:cs="Mangal" w:eastAsiaTheme="minorEastAsia" w:csTheme="minorBidi"/>
+          <w:sz w:val="36"/>
+          <w:szCs w:val="36"/>
+        </w:rPr>
+        <w:t>2. Objective of the project</w:t>
+      </w:r>
+    </w:p>
+    <w:p>
+      <w:pPr>
+        <w:spacing w:after="120"/>
+        <w:jc w:val="both"/>
+        <w:rPr>
+          <w:sz w:val="36"/>
+          <w:szCs w:val="36"/>
+        </w:rPr>
+      </w:pPr>
+      <w:r>
+        <w:rPr>
+          <w:rFonts w:ascii="Times New Roman" w:hAnsi="Times New Roman" w:eastAsia="ＭＳ 明朝" w:cs="Mangal" w:eastAsiaTheme="minorEastAsia" w:csTheme="minorBidi"/>
+          <w:sz w:val="36"/>
+          <w:szCs w:val="36"/>
+        </w:rPr>
+        <w:t>3. Project description</w:t>
+      </w:r>
+    </w:p>
+    <w:p>
+      <w:pPr>
+        <w:spacing w:after="120"/>
+        <w:jc w:val="both"/>
+        <w:rPr>
+          <w:sz w:val="36"/>
+          <w:szCs w:val="36"/>
+        </w:rPr>
+      </w:pPr>
+      <w:r>
+        <w:rPr>
+          <w:rFonts w:ascii="Times New Roman" w:hAnsi="Times New Roman" w:eastAsia="ＭＳ 明朝" w:cs="Mangal" w:eastAsiaTheme="minorEastAsia" w:csTheme="minorBidi"/>
+          <w:sz w:val="36"/>
+          <w:szCs w:val="36"/>
+        </w:rPr>
+        <w:t>4. System overview</w:t>
+      </w:r>
+    </w:p>
+    <w:p>
+      <w:pPr>
+        <w:spacing w:after="120"/>
+        <w:jc w:val="both"/>
+        <w:rPr>
+          <w:sz w:val="36"/>
+          <w:szCs w:val="36"/>
+        </w:rPr>
+      </w:pPr>
+      <w:r>
+        <w:rPr>
+          <w:rFonts w:ascii="Times New Roman" w:hAnsi="Times New Roman" w:eastAsia="ＭＳ 明朝" w:cs="Mangal" w:eastAsiaTheme="minorEastAsia" w:csTheme="minorBidi"/>
+          <w:sz w:val="36"/>
+          <w:szCs w:val="36"/>
+        </w:rPr>
+        <w:t>5. System architecture</w:t>
+      </w:r>
+    </w:p>
+    <w:p>
+      <w:pPr>
+        <w:spacing w:after="120"/>
+        <w:jc w:val="both"/>
+        <w:rPr>
+          <w:sz w:val="36"/>
+          <w:szCs w:val="36"/>
+        </w:rPr>
+      </w:pPr>
+      <w:r>
+        <w:rPr>
+          <w:rFonts w:ascii="Times New Roman" w:hAnsi="Times New Roman" w:eastAsia="ＭＳ 明朝" w:cs="Mangal" w:eastAsiaTheme="minorEastAsia" w:csTheme="minorBidi"/>
+          <w:sz w:val="36"/>
+          <w:szCs w:val="36"/>
+        </w:rPr>
+        <w:t>6. Software requirement</w:t>
+      </w:r>
+    </w:p>
+    <w:p>
+      <w:pPr>
+        <w:spacing w:after="120"/>
+        <w:jc w:val="both"/>
+        <w:rPr>
+          <w:sz w:val="36"/>
+          <w:szCs w:val="36"/>
+        </w:rPr>
+      </w:pPr>
+      <w:r>
+        <w:rPr>
+          <w:rFonts w:ascii="Times New Roman" w:hAnsi="Times New Roman" w:eastAsia="ＭＳ 明朝" w:cs="Mangal" w:eastAsiaTheme="minorEastAsia" w:csTheme="minorBidi"/>
+          <w:sz w:val="36"/>
+          <w:szCs w:val="36"/>
+        </w:rPr>
+        <w:t>7. Hardware requirement</w:t>
+      </w:r>
+    </w:p>
+    <w:p>
+      <w:pPr>
+        <w:spacing w:after="120"/>
+        <w:jc w:val="both"/>
+        <w:rPr>
+          <w:sz w:val="36"/>
+          <w:szCs w:val="36"/>
+        </w:rPr>
+      </w:pPr>
+      <w:r>
+        <w:rPr>
+          <w:rFonts w:ascii="Times New Roman" w:hAnsi="Times New Roman" w:eastAsia="ＭＳ 明朝" w:cs="Mangal" w:eastAsiaTheme="minorEastAsia" w:csTheme="minorBidi"/>
+          <w:sz w:val="36"/>
+          <w:szCs w:val="36"/>
+        </w:rPr>
+        <w:t>8. Advantages</w:t>
+      </w:r>
+    </w:p>
+    <w:p>
+      <w:pPr>
+        <w:spacing w:after="120"/>
+        <w:jc w:val="both"/>
+        <w:rPr>
+          <w:sz w:val="36"/>
+          <w:szCs w:val="36"/>
+        </w:rPr>
+      </w:pPr>
+      <w:r>
+        <w:rPr>
+          <w:rFonts w:ascii="Times New Roman" w:hAnsi="Times New Roman" w:eastAsia="ＭＳ 明朝" w:cs="Mangal" w:eastAsiaTheme="minorEastAsia" w:csTheme="minorBidi"/>
+          <w:sz w:val="36"/>
+          <w:szCs w:val="36"/>
+        </w:rPr>
+        <w:t>9. Applications</w:t>
+      </w:r>
+    </w:p>
+    <w:p>
+      <w:pPr>
+        <w:spacing w:after="120"/>
+        <w:jc w:val="both"/>
+        <w:rPr>
+          <w:sz w:val="36"/>
+          <w:szCs w:val="36"/>
+        </w:rPr>
+      </w:pPr>
+      <w:r>
+        <w:rPr>
+          <w:rFonts w:ascii="Times New Roman" w:hAnsi="Times New Roman" w:eastAsia="ＭＳ 明朝" w:cs="Mangal" w:eastAsiaTheme="minorEastAsia" w:csTheme="minorBidi"/>
+          <w:sz w:val="36"/>
+          <w:szCs w:val="36"/>
+        </w:rPr>
+        <w:t>10. Future scope of the project</w:t>
+      </w:r>
+    </w:p>
+    <w:p>
+      <w:pPr>
+        <w:spacing w:after="120"/>
+        <w:jc w:val="both"/>
+        <w:rPr>
+          <w:sz w:val="36"/>
+          <w:szCs w:val="36"/>
+        </w:rPr>
+      </w:pPr>
+      <w:r>
+        <w:rPr>
+          <w:rFonts w:ascii="Times New Roman" w:hAnsi="Times New Roman" w:eastAsia="ＭＳ 明朝" w:cs="Mangal" w:eastAsiaTheme="minorEastAsia" w:csTheme="minorBidi"/>
+          <w:sz w:val="36"/>
+          <w:szCs w:val="36"/>
+        </w:rPr>
+        <w:t>11. Conclusion</w:t>
+      </w:r>
+    </w:p>
+    <w:p>
+      <w:pPr>
+        <w:spacing w:after="120"/>
+        <w:jc w:val="both"/>
+        <w:rPr>
+          <w:sz w:val="36"/>
+          <w:szCs w:val="36"/>
+        </w:rPr>
+      </w:pPr>
+      <w:r>
+        <w:rPr>
+          <w:rFonts w:ascii="Times New Roman" w:hAnsi="Times New Roman" w:eastAsia="ＭＳ 明朝" w:cs="Mangal" w:eastAsiaTheme="minorEastAsia" w:csTheme="minorBidi"/>
+          <w:sz w:val="36"/>
+          <w:szCs w:val="36"/>
+        </w:rPr>
+        <w:t>12. References</w:t>
+      </w:r>
+    </w:p>
+    <w:p>
+      <w:pPr>
+        <w:pageBreakBefore/>
+        <w:spacing w:after="200" w:line="276" w:lineRule="auto"/>
+      </w:pPr>
+      <w:r>
+        <w:lastRenderedPageBreak/>
+        <w:rPr>
+          <w:sz w:val="36"/>
+          <w:szCs w:val="36"/>
+        </w:rPr>
+      </w:r>
+    </w:p>
+    <w:p>
+      <w:pPr>
+        <w:spacing w:before="200" w:after="100"/>
         <w:rPr>
           <w:b/>
           <w:sz w:val="36"/>
           <w:szCs w:val="36"/>
         </w:rPr>
+      </w:pPr>
+      <w:r>
         <w:lastRenderedPageBreak/>
-        <w:t>TABLE OF CONTENT</w:t>
+        <w:rPr>
+          <w:rFonts w:ascii="Times New Roman" w:hAnsi="Times New Roman" w:eastAsia="ＭＳ 明朝" w:cs="Mangal" w:eastAsiaTheme="minorEastAsia" w:csTheme="minorBidi"/>
+          <w:b/>
+          <w:bCs/>
+          <w:sz w:val="36"/>
+          <w:szCs w:val="36"/>
+        </w:rPr>
+        <w:t xml:space="preserve">1. TITLE OF THE </w:t>
+      </w:r>
+      <w:r>
+        <w:rPr>
+          <w:rFonts w:ascii="Times New Roman" w:hAnsi="Times New Roman" w:eastAsia="ＭＳ 明朝" w:cs="Mangal" w:eastAsiaTheme="minorEastAsia" w:csTheme="minorBidi"/>
+          <w:b/>
+          <w:bCs/>
+          <w:sz w:val="36"/>
+          <w:szCs w:val="36"/>
+        </w:rPr>
+        <w:t>PROJECT</w:t>
+      </w:r>
+      <w:r>
+        <w:rPr>
+          <w:rFonts w:ascii="Times New Roman" w:hAnsi="Times New Roman" w:eastAsia="ＭＳ 明朝" w:cs="Mangal" w:eastAsiaTheme="minorEastAsia" w:csTheme="minorBidi"/>
+          <w:b/>
+          <w:bCs/>
+          <w:sz w:val="36"/>
+          <w:szCs w:val="36"/>
+        </w:rPr>
+        <w:t>:-</w:t>
       </w:r>
     </w:p>
     <w:p>
       <w:pPr>
-        <w:spacing w:after="120"/>
-        <w:jc w:val="both"/>
-        <w:rPr>
-          <w:sz w:val="36"/>
-          <w:szCs w:val="36"/>
-        </w:rPr>
-      </w:pPr>
-      <w:r>
-        <w:rPr>
-          <w:sz w:val="36"/>
-          <w:szCs w:val="36"/>
-        </w:rPr>
-        <w:br/>
-      </w:r>
-      <w:r>
-        <w:rPr>
-          <w:sz w:val="36"/>
-          <w:szCs w:val="36"/>
-        </w:rPr>
-        <w:br/>
-      </w:r>
-      <w:r>
-        <w:rPr>
-          <w:sz w:val="36"/>
-          <w:szCs w:val="36"/>
-        </w:rPr>
-        <w:t>1. Title of the project</w:t>
+        <w:keepNext/>
+        <w:spacing w:before="360" w:after="120"/>
+      </w:pPr>
+      <w:r>
+        <w:rPr>
+          <w:rFonts w:ascii="Arial" w:hAnsi="Arial" w:eastAsia="ＭＳ 明朝" w:cs="Mangal" w:eastAsiaTheme="minorEastAsia" w:csTheme="minorBidi"/>
+          <w:b/>
+          <w:bCs/>
+          <w:sz w:val="24"/>
+          <w:szCs w:val="22"/>
+        </w:rPr>
+        <w:t>1. TITLE OF THE PROJECT:-</w:t>
       </w:r>
     </w:p>
     <w:p>
       <w:pPr>
-        <w:spacing w:after="120"/>
-        <w:jc w:val="both"/>
-        <w:rPr>
-          <w:sz w:val="36"/>
-          <w:szCs w:val="36"/>
-        </w:rPr>
-      </w:pPr>
-      <w:r>
-        <w:rPr>
-          <w:sz w:val="36"/>
-          <w:szCs w:val="36"/>
-        </w:rPr>
-        <w:t>2. Objective of the project</w:t>
+        <w:spacing w:after="120" w:line="276" w:lineRule="auto"/>
+      </w:pPr>
+      <w:r>
+        <w:rPr>
+          <w:rFonts w:ascii="Arial" w:hAnsi="Arial" w:eastAsia="ＭＳ 明朝" w:cs="Mangal" w:eastAsiaTheme="minorEastAsia" w:csTheme="minorBidi"/>
+          <w:sz w:val="22"/>
+          <w:szCs w:val="22"/>
+        </w:rPr>
+        <w:t>ASCENT.AI – From Idea to Implementation: An AI-Driven Educational Ecosystem for Project-Based Software Development and Active Pedagogy</w:t>
       </w:r>
     </w:p>
     <w:p>
       <w:pPr>
-        <w:spacing w:after="120"/>
-        <w:jc w:val="both"/>
-        <w:rPr>
-          <w:sz w:val="36"/>
-          <w:szCs w:val="36"/>
-        </w:rPr>
-      </w:pPr>
-      <w:r>
-        <w:rPr>
-          <w:sz w:val="36"/>
-          <w:szCs w:val="36"/>
-        </w:rPr>
-        <w:t>3. Project description</w:t>
+        <w:keepNext/>
+        <w:spacing w:before="360" w:after="120"/>
+      </w:pPr>
+      <w:r>
+        <w:rPr>
+          <w:rFonts w:ascii="Arial" w:hAnsi="Arial" w:eastAsia="ＭＳ 明朝" w:cs="Mangal" w:eastAsiaTheme="minorEastAsia" w:csTheme="minorBidi"/>
+          <w:b/>
+          <w:bCs/>
+          <w:sz w:val="24"/>
+          <w:szCs w:val="22"/>
+        </w:rPr>
+        <w:t>2. OBJECTIVE OF THE PROJECT:-</w:t>
       </w:r>
     </w:p>
     <w:p>
       <w:pPr>
-        <w:spacing w:after="120"/>
-        <w:jc w:val="both"/>
-        <w:rPr>
-          <w:sz w:val="36"/>
-          <w:szCs w:val="36"/>
-        </w:rPr>
-      </w:pPr>
-      <w:r>
-        <w:rPr>
-          <w:sz w:val="36"/>
-          <w:szCs w:val="36"/>
-        </w:rPr>
-        <w:t>4. System overview</w:t>
+        <w:spacing w:after="120" w:line="276" w:lineRule="auto"/>
+      </w:pPr>
+      <w:r>
+        <w:rPr>
+          <w:rFonts w:ascii="Arial" w:hAnsi="Arial" w:eastAsia="ＭＳ 明朝" w:cs="Mangal" w:eastAsiaTheme="minorEastAsia" w:csTheme="minorBidi"/>
+          <w:sz w:val="22"/>
+          <w:szCs w:val="22"/>
+        </w:rPr>
+        <w:t>The primary objective of Ascent.ai is to engineer a state-of-the-art, AI-powered coding education platform that bridges the gap between passive tutorial completion and active, production-ready software implementation. The platform's objectives are detailed below:</w:t>
       </w:r>
     </w:p>
     <w:p>
       <w:pPr>
-        <w:spacing w:after="120"/>
-        <w:jc w:val="both"/>
-        <w:rPr>
-          <w:sz w:val="36"/>
-          <w:szCs w:val="36"/>
-        </w:rPr>
-      </w:pPr>
-      <w:r>
-        <w:rPr>
-          <w:sz w:val="36"/>
-          <w:szCs w:val="36"/>
-        </w:rPr>
-        <w:t>5. System architecture</w:t>
+        <w:pStyle w:val="ListBullet"/>
+        <w:spacing w:after="80" w:line="276" w:lineRule="auto"/>
+        <w:ind w:left="360" w:hanging="360"/>
+      </w:pPr>
+      <w:r>
+        <w:rPr>
+          <w:rFonts w:ascii="Arial" w:hAnsi="Arial" w:eastAsia="ＭＳ 明朝" w:cs="Mangal" w:eastAsiaTheme="minorEastAsia" w:csTheme="minorBidi"/>
+          <w:b/>
+          <w:bCs/>
+          <w:sz w:val="22"/>
+          <w:szCs w:val="22"/>
+        </w:rPr>
+        <w:t xml:space="preserve">Mitigate 'Tutorial Hell': </w:t>
+      </w:r>
+      <w:r>
+        <w:rPr>
+          <w:rFonts w:ascii="Arial" w:hAnsi="Arial" w:eastAsia="ＭＳ 明朝" w:cs="Mangal" w:eastAsiaTheme="minorEastAsia" w:csTheme="minorBidi"/>
+          <w:sz w:val="22"/>
+          <w:szCs w:val="22"/>
+        </w:rPr>
+        <w:t>Eliminate the common trap where students reproduce working code step-by-step from videos but fail to build independent applications afterward.</w:t>
       </w:r>
     </w:p>
     <w:p>
       <w:pPr>
-        <w:spacing w:after="120"/>
-        <w:jc w:val="both"/>
-        <w:rPr>
-          <w:sz w:val="36"/>
-          <w:szCs w:val="36"/>
-        </w:rPr>
-      </w:pPr>
-      <w:r>
-        <w:rPr>
-          <w:sz w:val="36"/>
-          <w:szCs w:val="36"/>
-        </w:rPr>
-        <w:t>6. Software requirement</w:t>
+        <w:pStyle w:val="ListBullet"/>
+        <w:spacing w:after="80" w:line="276" w:lineRule="auto"/>
+        <w:ind w:left="360" w:hanging="360"/>
+      </w:pPr>
+      <w:r>
+        <w:rPr>
+          <w:rFonts w:ascii="Arial" w:hAnsi="Arial" w:eastAsia="ＭＳ 明朝" w:cs="Mangal" w:eastAsiaTheme="minorEastAsia" w:csTheme="minorBidi"/>
+          <w:b/>
+          <w:bCs/>
+          <w:sz w:val="22"/>
+          <w:szCs w:val="22"/>
+        </w:rPr>
+        <w:t xml:space="preserve">Active 'Teach-Then-Build' Pedagogy: </w:t>
+      </w:r>
+      <w:r>
+        <w:rPr>
+          <w:rFonts w:ascii="Arial" w:hAnsi="Arial" w:eastAsia="ＭＳ 明朝" w:cs="Mangal" w:eastAsiaTheme="minorEastAsia" w:csTheme="minorBidi"/>
+          <w:sz w:val="22"/>
+          <w:szCs w:val="22"/>
+        </w:rPr>
+        <w:t>Enforce a sequence where the educational concept is taught first, followed by hands-on execution by the learner, preventing the AI from writing the code for the student.</w:t>
       </w:r>
     </w:p>
     <w:p>
       <w:pPr>
-        <w:spacing w:after="120"/>
-        <w:jc w:val="both"/>
-        <w:rPr>
-          <w:sz w:val="36"/>
-          <w:szCs w:val="36"/>
-        </w:rPr>
-      </w:pPr>
-      <w:r>
-        <w:rPr>
-          <w:sz w:val="36"/>
-          <w:szCs w:val="36"/>
-        </w:rPr>
-        <w:t>7. Hardware requirement</w:t>
+        <w:pStyle w:val="ListBullet"/>
+        <w:spacing w:after="80" w:line="276" w:lineRule="auto"/>
+        <w:ind w:left="360" w:hanging="360"/>
+      </w:pPr>
+      <w:r>
+        <w:rPr>
+          <w:rFonts w:ascii="Arial" w:hAnsi="Arial" w:eastAsia="ＭＳ 明朝" w:cs="Mangal" w:eastAsiaTheme="minorEastAsia" w:csTheme="minorBidi"/>
+          <w:b/>
+          <w:bCs/>
+          <w:sz w:val="22"/>
+          <w:szCs w:val="22"/>
+        </w:rPr>
+        <w:t xml:space="preserve">Dynamic, Screen-Based Curricula: </w:t>
+      </w:r>
+      <w:r>
+        <w:rPr>
+          <w:rFonts w:ascii="Arial" w:hAnsi="Arial" w:eastAsia="ＭＳ 明朝" w:cs="Mangal" w:eastAsiaTheme="minorEastAsia" w:csTheme="minorBidi"/>
+          <w:sz w:val="22"/>
+          <w:szCs w:val="22"/>
+        </w:rPr>
+        <w:t>Generate a structured, non-linear roadmap based on a user's natural language project description, teaching relevant concepts in synchronization with physical frontend layout screens.</w:t>
       </w:r>
     </w:p>
     <w:p>
       <w:pPr>
-        <w:spacing w:after="120"/>
-        <w:jc w:val="both"/>
-        <w:rPr>
-          <w:sz w:val="36"/>
-          <w:szCs w:val="36"/>
-        </w:rPr>
-      </w:pPr>
-      <w:r>
-        <w:rPr>
-          <w:sz w:val="36"/>
-          <w:szCs w:val="36"/>
-        </w:rPr>
-        <w:t>8. Advantages</w:t>
+        <w:pStyle w:val="ListBullet"/>
+        <w:spacing w:after="80" w:line="276" w:lineRule="auto"/>
+        <w:ind w:left="360" w:hanging="360"/>
+      </w:pPr>
+      <w:r>
+        <w:rPr>
+          <w:rFonts w:ascii="Arial" w:hAnsi="Arial" w:eastAsia="ＭＳ 明朝" w:cs="Mangal" w:eastAsiaTheme="minorEastAsia" w:csTheme="minorBidi"/>
+          <w:b/>
+          <w:bCs/>
+          <w:sz w:val="22"/>
+          <w:szCs w:val="22"/>
+        </w:rPr>
+        <w:t xml:space="preserve">Automated Progression Gates: </w:t>
+      </w:r>
+      <w:r>
+        <w:rPr>
+          <w:rFonts w:ascii="Arial" w:hAnsi="Arial" w:eastAsia="ＭＳ 明朝" w:cs="Mangal" w:eastAsiaTheme="minorEastAsia" w:csTheme="minorBidi"/>
+          <w:sz w:val="22"/>
+          <w:szCs w:val="22"/>
+        </w:rPr>
+        <w:t>Incorporate client-side and server-side unit-testing sandboxes that validate student submissions, ensuring core requirements are met before unlocking subsequent syllabus modules.</w:t>
       </w:r>
     </w:p>
     <w:p>
       <w:pPr>
-        <w:spacing w:after="120"/>
-        <w:jc w:val="both"/>
-        <w:rPr>
-          <w:sz w:val="36"/>
-          <w:szCs w:val="36"/>
-        </w:rPr>
-      </w:pPr>
-      <w:r>
-        <w:rPr>
-          <w:sz w:val="36"/>
-          <w:szCs w:val="36"/>
-        </w:rPr>
-        <w:t>9. Applications</w:t>
+        <w:keepNext/>
+        <w:spacing w:before="360" w:after="120"/>
+      </w:pPr>
+      <w:r>
+        <w:rPr>
+          <w:rFonts w:ascii="Arial" w:hAnsi="Arial" w:eastAsia="ＭＳ 明朝" w:cs="Mangal" w:eastAsiaTheme="minorEastAsia" w:csTheme="minorBidi"/>
+          <w:b/>
+          <w:bCs/>
+          <w:sz w:val="24"/>
+          <w:szCs w:val="22"/>
+        </w:rPr>
+        <w:t>3. PROJECT DESCRIPTION:-</w:t>
       </w:r>
     </w:p>
     <w:p>
       <w:pPr>
-        <w:spacing w:after="120"/>
-        <w:jc w:val="both"/>
-        <w:rPr>
-          <w:sz w:val="36"/>
-          <w:szCs w:val="36"/>
-        </w:rPr>
-      </w:pPr>
-      <w:r>
-        <w:rPr>
-          <w:sz w:val="36"/>
-          <w:szCs w:val="36"/>
-        </w:rPr>
-        <w:t>10. Future scope of the project</w:t>
+        <w:spacing w:after="120" w:line="276" w:lineRule="auto"/>
+      </w:pPr>
+      <w:r>
+        <w:rPr>
+          <w:rFonts w:ascii="Arial" w:hAnsi="Arial" w:eastAsia="ＭＳ 明朝" w:cs="Mangal" w:eastAsiaTheme="minorEastAsia" w:csTheme="minorBidi"/>
+          <w:sz w:val="22"/>
+          <w:szCs w:val="22"/>
+        </w:rPr>
+        <w:t>Ascent.ai is an educational web portal that transforms how programming languages and full-stack frameworks are taught. Unlike traditional learning management systems that present static, predefined course flows, Ascent.ai treats the student's personal project idea as the root of the entire curriculum. Upon inputting a direct prompt (e.g., 'E-commerce platform using React') or selecting options via a guided wizard (project archetype, styling frameworks, database choices), the backend orchestrates a comprehensive learning roadmap.</w:t>
       </w:r>
     </w:p>
     <w:p>
       <w:pPr>
-        <w:spacing w:after="120"/>
-        <w:jc w:val="both"/>
-        <w:rPr>
-          <w:sz w:val="36"/>
-          <w:szCs w:val="36"/>
-        </w:rPr>
-      </w:pPr>
-      <w:r>
-        <w:rPr>
-          <w:sz w:val="36"/>
-          <w:szCs w:val="36"/>
-        </w:rPr>
-        <w:t>11. Conclusion</w:t>
+        <w:spacing w:after="120" w:line="276" w:lineRule="auto"/>
+      </w:pPr>
+      <w:r>
+        <w:rPr>
+          <w:rFonts w:ascii="Arial" w:hAnsi="Arial" w:eastAsia="ＭＳ 明朝" w:cs="Mangal" w:eastAsiaTheme="minorEastAsia" w:csTheme="minorBidi"/>
+          <w:sz w:val="22"/>
+          <w:szCs w:val="22"/>
+        </w:rPr>
+        <w:t>The project is structured around 'vertical-slice development,' ensuring that learners construct a working prototype early in the cycle and deepen it over time. Progression follows a strict difficulty ladder within each page or screen:</w:t>
       </w:r>
     </w:p>
     <w:p>
       <w:pPr>
-        <w:spacing w:after="120"/>
-        <w:jc w:val="both"/>
-        <w:rPr>
-          <w:sz w:val="36"/>
-          <w:szCs w:val="36"/>
-        </w:rPr>
-      </w:pPr>
-      <w:r>
-        <w:rPr>
-          <w:sz w:val="36"/>
-          <w:szCs w:val="36"/>
-        </w:rPr>
-        <w:t>12. References</w:t>
+        <w:pStyle w:val="ListBullet"/>
+        <w:spacing w:after="80" w:line="276" w:lineRule="auto"/>
+        <w:ind w:left="360" w:hanging="360"/>
+      </w:pPr>
+      <w:r>
+        <w:rPr>
+          <w:rFonts w:ascii="Arial" w:hAnsi="Arial" w:eastAsia="ＭＳ 明朝" w:cs="Mangal" w:eastAsiaTheme="minorEastAsia" w:csTheme="minorBidi"/>
+          <w:b/>
+          <w:bCs/>
+          <w:sz w:val="22"/>
+          <w:szCs w:val="22"/>
+        </w:rPr>
+        <w:t xml:space="preserve">Visual Scaffolding: </w:t>
+      </w:r>
+      <w:r>
+        <w:rPr>
+          <w:rFonts w:ascii="Arial" w:hAnsi="Arial" w:eastAsia="ＭＳ 明朝" w:cs="Mangal" w:eastAsiaTheme="minorEastAsia" w:csTheme="minorBidi"/>
+          <w:sz w:val="22"/>
+          <w:szCs w:val="22"/>
+        </w:rPr>
+        <w:t>The user begins by implementing a static mockup of the target page (e.g., hardcoded list rendering for a product dashboard) to understand UI/UX component structures.</w:t>
       </w:r>
     </w:p>
     <w:p>
-      <w:r>
-        <w:rPr>
-          <w:sz w:val="36"/>
-          <w:szCs w:val="36"/>
-        </w:rPr>
-        <w:br w:type="page"/>
+      <w:pPr>
+        <w:pStyle w:val="ListBullet"/>
+        <w:spacing w:after="80" w:line="276" w:lineRule="auto"/>
+        <w:ind w:left="360" w:hanging="360"/>
+      </w:pPr>
+      <w:r>
+        <w:rPr>
+          <w:rFonts w:ascii="Arial" w:hAnsi="Arial" w:eastAsia="ＭＳ 明朝" w:cs="Mangal" w:eastAsiaTheme="minorEastAsia" w:csTheme="minorBidi"/>
+          <w:b/>
+          <w:bCs/>
+          <w:sz w:val="22"/>
+          <w:szCs w:val="22"/>
+        </w:rPr>
+        <w:t xml:space="preserve">Dynamic State &amp; Integration: </w:t>
+      </w:r>
+      <w:r>
+        <w:rPr>
+          <w:rFonts w:ascii="Arial" w:hAnsi="Arial" w:eastAsia="ＭＳ 明朝" w:cs="Mangal" w:eastAsiaTheme="minorEastAsia" w:csTheme="minorBidi"/>
+          <w:sz w:val="22"/>
+          <w:szCs w:val="22"/>
+        </w:rPr>
+        <w:t>The module introduces reactivity, hooks, and dynamic data integration (e.g., wiring mock state hooks, managing lists, and handling user inputs).</w:t>
       </w:r>
     </w:p>
     <w:p>
       <w:pPr>
-        <w:spacing w:before="200" w:after="100"/>
-        <w:rPr>
+        <w:pStyle w:val="ListBullet"/>
+        <w:spacing w:after="80" w:line="276" w:lineRule="auto"/>
+        <w:ind w:left="360" w:hanging="360"/>
+      </w:pPr>
+      <w:r>
+        <w:rPr>
+          <w:rFonts w:ascii="Arial" w:hAnsi="Arial" w:eastAsia="ＭＳ 明朝" w:cs="Mangal" w:eastAsiaTheme="minorEastAsia" w:csTheme="minorBidi"/>
           <w:b/>
-          <w:sz w:val="36"/>
-          <w:szCs w:val="36"/>
-        </w:rPr>
-      </w:pPr>
-      <w:r>
-        <w:rPr>
-          <w:b/>
-          <w:sz w:val="36"/>
-          <w:szCs w:val="36"/>
-        </w:rPr>
-        <w:lastRenderedPageBreak/>
-        <w:t xml:space="preserve">1. TITLE OF THE </w:t>
-      </w:r>
-      <w:proofErr w:type="gramStart"/>
-      <w:r>
-        <w:rPr>
-          <w:b/>
-          <w:sz w:val="36"/>
-          <w:szCs w:val="36"/>
-        </w:rPr>
-        <w:t>PROJECT</w:t>
-      </w:r>
-      <w:r>
-        <w:rPr>
-          <w:b/>
-          <w:sz w:val="36"/>
-          <w:szCs w:val="36"/>
-        </w:rPr>
-        <w:t>:-</w:t>
-      </w:r>
-      <w:proofErr w:type="gramEnd"/>
+          <w:bCs/>
+          <w:sz w:val="22"/>
+          <w:szCs w:val="22"/>
+        </w:rPr>
+        <w:t xml:space="preserve">Robustness &amp; Validation: </w:t>
+      </w:r>
+      <w:r>
+        <w:rPr>
+          <w:rFonts w:ascii="Arial" w:hAnsi="Arial" w:eastAsia="ＭＳ 明朝" w:cs="Mangal" w:eastAsiaTheme="minorEastAsia" w:csTheme="minorBidi"/>
+          <w:sz w:val="22"/>
+          <w:szCs w:val="22"/>
+        </w:rPr>
+        <w:t>The module wraps the features in network logic, handling loading spinners, error states, and edge-case validations.</w:t>
+      </w:r>
     </w:p>
     <w:p>
       <w:pPr>
+        <w:spacing w:after="120" w:line="276" w:lineRule="auto"/>
+      </w:pPr>
+      <w:r>
+        <w:rPr>
+          <w:rFonts w:ascii="Arial" w:hAnsi="Arial" w:eastAsia="ＭＳ 明朝" w:cs="Mangal" w:eastAsiaTheme="minorEastAsia" w:csTheme="minorBidi"/>
+          <w:sz w:val="22"/>
+          <w:szCs w:val="22"/>
+        </w:rPr>
+        <w:t>The web app utilizes an in-browser coding environment (such as StackBlitz WebContainers or CodeSandbox Sandpack) which executes live code changes, provides instant visual feedback, and runs automated tests that gate module completion. The project loops through this lifecycle screen by screen until the entire planned project is complete.</w:t>
+      </w:r>
+    </w:p>
+    <w:p>
+      <w:pPr>
         <w:keepNext/>
         <w:spacing w:before="360" w:after="120"/>
       </w:pPr>
       <w:r>
         <w:rPr>
-          <w:rFonts w:ascii="Arial" w:hAnsi="Arial"/>
+          <w:rFonts w:ascii="Arial" w:hAnsi="Arial" w:eastAsia="ＭＳ 明朝" w:cs="Mangal" w:eastAsiaTheme="minorEastAsia" w:csTheme="minorBidi"/>
           <w:b/>
+          <w:bCs/>
           <w:sz w:val="24"/>
-        </w:rPr>
-        <w:t>1. TITLE OF THE PROJECT:-</w:t>
+          <w:szCs w:val="22"/>
+        </w:rPr>
+        <w:t>4. SYSTEM OVERVIEW:-</w:t>
       </w:r>
     </w:p>
     <w:p>
@@ -698,24 +943,177 @@
       </w:pPr>
       <w:r>
         <w:rPr>
-          <w:rFonts w:ascii="Arial" w:hAnsi="Arial"/>
+          <w:rFonts w:ascii="Arial" w:hAnsi="Arial" w:eastAsia="ＭＳ 明朝" w:cs="Mangal" w:eastAsiaTheme="minorEastAsia" w:csTheme="minorBidi"/>
           <w:sz w:val="22"/>
-        </w:rPr>
-        <w:t>ASCENT.AI – From Idea to Implementation: An AI-Driven Educational Ecosystem for Project-Based Software Development and Active Pedagogy</w:t>
+          <w:szCs w:val="22"/>
+        </w:rPr>
+        <w:t>The system data flow and processing loop is designed as a series of interconnected services managed within a single workspace. The key processes include:</w:t>
       </w:r>
     </w:p>
     <w:p>
       <w:pPr>
+        <w:pStyle w:val="ListBullet"/>
+        <w:spacing w:after="80" w:line="276" w:lineRule="auto"/>
+        <w:ind w:left="360" w:hanging="360"/>
+      </w:pPr>
+      <w:r>
+        <w:rPr>
+          <w:rFonts w:ascii="Arial" w:hAnsi="Arial" w:eastAsia="ＭＳ 明朝" w:cs="Mangal" w:eastAsiaTheme="minorEastAsia" w:csTheme="minorBidi"/>
+          <w:b/>
+          <w:bCs/>
+          <w:sz w:val="22"/>
+          <w:szCs w:val="22"/>
+        </w:rPr>
+        <w:t xml:space="preserve">Input Intake Handler: </w:t>
+      </w:r>
+      <w:r>
+        <w:rPr>
+          <w:rFonts w:ascii="Arial" w:hAnsi="Arial" w:eastAsia="ＭＳ 明朝" w:cs="Mangal" w:eastAsiaTheme="minorEastAsia" w:csTheme="minorBidi"/>
+          <w:sz w:val="22"/>
+          <w:szCs w:val="22"/>
+        </w:rPr>
+        <w:t>Captures the user prompt or guided wizard configuration, validating options and preparing metadata (target language, frameworks).</w:t>
+      </w:r>
+    </w:p>
+    <w:p>
+      <w:pPr>
+        <w:pStyle w:val="ListBullet"/>
+        <w:spacing w:after="80" w:line="276" w:lineRule="auto"/>
+        <w:ind w:left="360" w:hanging="360"/>
+      </w:pPr>
+      <w:r>
+        <w:rPr>
+          <w:rFonts w:ascii="Arial" w:hAnsi="Arial" w:eastAsia="ＭＳ 明朝" w:cs="Mangal" w:eastAsiaTheme="minorEastAsia" w:csTheme="minorBidi"/>
+          <w:b/>
+          <w:bCs/>
+          <w:sz w:val="22"/>
+          <w:szCs w:val="22"/>
+        </w:rPr>
+        <w:t xml:space="preserve">Roadmap Planner &amp; Orchestrator: </w:t>
+      </w:r>
+      <w:r>
+        <w:rPr>
+          <w:rFonts w:ascii="Arial" w:hAnsi="Arial" w:eastAsia="ＭＳ 明朝" w:cs="Mangal" w:eastAsiaTheme="minorEastAsia" w:csTheme="minorBidi"/>
+          <w:sz w:val="22"/>
+          <w:szCs w:val="22"/>
+        </w:rPr>
+        <w:t>Communicates with the Large Language Model service to plan the application screens and structure the sequence of lessons.</w:t>
+      </w:r>
+    </w:p>
+    <w:p>
+      <w:pPr>
+        <w:pStyle w:val="ListBullet"/>
+        <w:spacing w:after="80" w:line="276" w:lineRule="auto"/>
+        <w:ind w:left="360" w:hanging="360"/>
+      </w:pPr>
+      <w:r>
+        <w:rPr>
+          <w:rFonts w:ascii="Arial" w:hAnsi="Arial" w:eastAsia="ＭＳ 明朝" w:cs="Mangal" w:eastAsiaTheme="minorEastAsia" w:csTheme="minorBidi"/>
+          <w:b/>
+          <w:bCs/>
+          <w:sz w:val="22"/>
+          <w:szCs w:val="22"/>
+        </w:rPr>
+        <w:t xml:space="preserve">Webpage Generator: </w:t>
+      </w:r>
+      <w:r>
+        <w:rPr>
+          <w:rFonts w:ascii="Arial" w:hAnsi="Arial" w:eastAsia="ＭＳ 明朝" w:cs="Mangal" w:eastAsiaTheme="minorEastAsia" w:csTheme="minorBidi"/>
+          <w:sz w:val="22"/>
+          <w:szCs w:val="22"/>
+        </w:rPr>
+        <w:t>Creates the starter folder layout, HTML/JSX scaffolding, and descriptions of the visual output for the active screen.</w:t>
+      </w:r>
+    </w:p>
+    <w:p>
+      <w:pPr>
+        <w:pStyle w:val="ListBullet"/>
+        <w:spacing w:after="80" w:line="276" w:lineRule="auto"/>
+        <w:ind w:left="360" w:hanging="360"/>
+      </w:pPr>
+      <w:r>
+        <w:rPr>
+          <w:rFonts w:ascii="Arial" w:hAnsi="Arial" w:eastAsia="ＭＳ 明朝" w:cs="Mangal" w:eastAsiaTheme="minorEastAsia" w:csTheme="minorBidi"/>
+          <w:b/>
+          <w:bCs/>
+          <w:sz w:val="22"/>
+          <w:szCs w:val="22"/>
+        </w:rPr>
+        <w:t xml:space="preserve">Component Decomposer: </w:t>
+      </w:r>
+      <w:r>
+        <w:rPr>
+          <w:rFonts w:ascii="Arial" w:hAnsi="Arial" w:eastAsia="ＭＳ 明朝" w:cs="Mangal" w:eastAsiaTheme="minorEastAsia" w:csTheme="minorBidi"/>
+          <w:sz w:val="22"/>
+          <w:szCs w:val="22"/>
+        </w:rPr>
+        <w:t>Scans the generated layout structure and extracts teachable DOM units (buttons, lists, search inputs, tables) to map them to learning objectives.</w:t>
+      </w:r>
+    </w:p>
+    <w:p>
+      <w:pPr>
+        <w:pStyle w:val="ListBullet"/>
+        <w:spacing w:after="80" w:line="276" w:lineRule="auto"/>
+        <w:ind w:left="360" w:hanging="360"/>
+      </w:pPr>
+      <w:r>
+        <w:rPr>
+          <w:rFonts w:ascii="Arial" w:hAnsi="Arial" w:eastAsia="ＭＳ 明朝" w:cs="Mangal" w:eastAsiaTheme="minorEastAsia" w:csTheme="minorBidi"/>
+          <w:b/>
+          <w:bCs/>
+          <w:sz w:val="22"/>
+          <w:szCs w:val="22"/>
+        </w:rPr>
+        <w:t xml:space="preserve">Module compiler: </w:t>
+      </w:r>
+      <w:r>
+        <w:rPr>
+          <w:rFonts w:ascii="Arial" w:hAnsi="Arial" w:eastAsia="ＭＳ 明朝" w:cs="Mangal" w:eastAsiaTheme="minorEastAsia" w:csTheme="minorBidi"/>
+          <w:sz w:val="22"/>
+          <w:szCs w:val="22"/>
+        </w:rPr>
+        <w:t>Generates conceptual explanations, step-by-step instructions, and automated test specifications for each component.</w:t>
+      </w:r>
+    </w:p>
+    <w:p>
+      <w:pPr>
+        <w:pStyle w:val="ListBullet"/>
+        <w:spacing w:after="80" w:line="276" w:lineRule="auto"/>
+        <w:ind w:left="360" w:hanging="360"/>
+      </w:pPr>
+      <w:r>
+        <w:rPr>
+          <w:rFonts w:ascii="Arial" w:hAnsi="Arial" w:eastAsia="ＭＳ 明朝" w:cs="Mangal" w:eastAsiaTheme="minorEastAsia" w:csTheme="minorBidi"/>
+          <w:b/>
+          <w:bCs/>
+          <w:sz w:val="22"/>
+          <w:szCs w:val="22"/>
+        </w:rPr>
+        <w:t xml:space="preserve">Sandbox Code Editor &amp; Evaluator: </w:t>
+      </w:r>
+      <w:r>
+        <w:rPr>
+          <w:rFonts w:ascii="Arial" w:hAnsi="Arial" w:eastAsia="ＭＳ 明朝" w:cs="Mangal" w:eastAsiaTheme="minorEastAsia" w:csTheme="minorBidi"/>
+          <w:sz w:val="22"/>
+          <w:szCs w:val="22"/>
+        </w:rPr>
+        <w:t>Hosts the visual coding workspace, compiling code in real-time, executing client-side test assertions, and querying the backend server to securely log progress records.</w:t>
+      </w:r>
+    </w:p>
+    <w:p>
+      <w:pPr>
         <w:keepNext/>
         <w:spacing w:before="360" w:after="120"/>
       </w:pPr>
       <w:r>
         <w:rPr>
-          <w:rFonts w:ascii="Arial" w:hAnsi="Arial"/>
+          <w:rFonts w:ascii="Arial" w:hAnsi="Arial" w:eastAsia="ＭＳ 明朝" w:cs="Mangal" w:eastAsiaTheme="minorEastAsia" w:csTheme="minorBidi"/>
           <w:b/>
+          <w:bCs/>
           <w:sz w:val="24"/>
-        </w:rPr>
-        <w:t>2. OBJECTIVE OF THE PROJECT:-</w:t>
+          <w:szCs w:val="22"/>
+        </w:rPr>
+        <w:t>5. SYSTEM ARCHITECTURE:-</w:t>
       </w:r>
     </w:p>
     <w:p>
@@ -724,207 +1122,302 @@
       </w:pPr>
       <w:r>
         <w:rPr>
-          <w:rFonts w:ascii="Arial" w:hAnsi="Arial"/>
+          <w:rFonts w:ascii="Arial" w:hAnsi="Arial" w:eastAsia="ＭＳ 明朝" w:cs="Mangal" w:eastAsiaTheme="minorEastAsia" w:csTheme="minorBidi"/>
           <w:sz w:val="22"/>
-        </w:rPr>
-        <w:t>The primary objective of Ascent.ai is to engineer a state-of-the-art, AI-powered coding education platform that bridges the gap between passive tutorial completion and active, production-ready software implementation. The platform's objectives are detailed below:</w:t>
+          <w:szCs w:val="22"/>
+        </w:rPr>
+        <w:t>Ascent.ai is built using a Modular Monolith architecture to ensure low deployment overhead during prototyping while maintaining clear separation of boundaries for microservices scaling. The architecture is decomposed into the following layers:</w:t>
       </w:r>
     </w:p>
     <w:p>
       <w:pPr>
         <w:pStyle w:val="ListBullet"/>
         <w:spacing w:after="80" w:line="276" w:lineRule="auto"/>
-      </w:pPr>
-      <w:r>
-        <w:rPr>
-          <w:rFonts w:ascii="Arial" w:hAnsi="Arial"/>
+        <w:ind w:left="360" w:hanging="360"/>
+      </w:pPr>
+      <w:r>
+        <w:rPr>
+          <w:rFonts w:ascii="Arial" w:hAnsi="Arial" w:eastAsia="ＭＳ 明朝" w:cs="Mangal" w:eastAsiaTheme="minorEastAsia" w:csTheme="minorBidi"/>
           <w:b/>
+          <w:bCs/>
           <w:sz w:val="22"/>
-        </w:rPr>
-        <w:t xml:space="preserve">Mitigate 'Tutorial Hell': </w:t>
-      </w:r>
-      <w:r>
-        <w:rPr>
-          <w:rFonts w:ascii="Arial" w:hAnsi="Arial"/>
+          <w:szCs w:val="22"/>
+        </w:rPr>
+        <w:t xml:space="preserve">User Interface Layer (Presentation): </w:t>
+      </w:r>
+      <w:r>
+        <w:rPr>
+          <w:rFonts w:ascii="Arial" w:hAnsi="Arial" w:eastAsia="ＭＳ 明朝" w:cs="Mangal" w:eastAsiaTheme="minorEastAsia" w:csTheme="minorBidi"/>
           <w:sz w:val="22"/>
-        </w:rPr>
-        <w:t>Eliminate the common trap where students reproduce working code step-by-step from videos but fail to build independent applications afterward.</w:t>
+          <w:szCs w:val="22"/>
+        </w:rPr>
+        <w:t>Built using React and custom Vanilla CSS (featuring glassmorphism, responsive split panels, and dark-mode themes). Houses the sidebar syllabus, markdown lesson pane, monaco-editor coding pane, and visual web-preview iframe.</w:t>
       </w:r>
     </w:p>
     <w:p>
       <w:pPr>
         <w:pStyle w:val="ListBullet"/>
         <w:spacing w:after="80" w:line="276" w:lineRule="auto"/>
-      </w:pPr>
-      <w:r>
-        <w:rPr>
-          <w:rFonts w:ascii="Arial" w:hAnsi="Arial"/>
+        <w:ind w:left="360" w:hanging="360"/>
+      </w:pPr>
+      <w:r>
+        <w:rPr>
+          <w:rFonts w:ascii="Arial" w:hAnsi="Arial" w:eastAsia="ＭＳ 明朝" w:cs="Mangal" w:eastAsiaTheme="minorEastAsia" w:csTheme="minorBidi"/>
           <w:b/>
+          <w:bCs/>
           <w:sz w:val="22"/>
-        </w:rPr>
-        <w:t xml:space="preserve">Active 'Teach-Then-Build' Pedagogy: </w:t>
-      </w:r>
-      <w:r>
-        <w:rPr>
-          <w:rFonts w:ascii="Arial" w:hAnsi="Arial"/>
+          <w:szCs w:val="22"/>
+        </w:rPr>
+        <w:t xml:space="preserve">Business Logic Layer (Express BFF): </w:t>
+      </w:r>
+      <w:r>
+        <w:rPr>
+          <w:rFonts w:ascii="Arial" w:hAnsi="Arial" w:eastAsia="ＭＳ 明朝" w:cs="Mangal" w:eastAsiaTheme="minorEastAsia" w:csTheme="minorBidi"/>
           <w:sz w:val="22"/>
-        </w:rPr>
-        <w:t>Enforce a sequence where the educational concept is taught first, followed by hands-on execution by the learner, preventing the AI from writing the code for the student.</w:t>
+          <w:szCs w:val="22"/>
+        </w:rPr>
+        <w:t>Handles user authentication, rate-limiting, progress logging, and routes API requests. Separates prompts, parsing utilities, and module compilers.</w:t>
       </w:r>
     </w:p>
     <w:p>
       <w:pPr>
         <w:pStyle w:val="ListBullet"/>
         <w:spacing w:after="80" w:line="276" w:lineRule="auto"/>
-      </w:pPr>
-      <w:r>
-        <w:rPr>
-          <w:rFonts w:ascii="Arial" w:hAnsi="Arial"/>
+        <w:ind w:left="360" w:hanging="360"/>
+      </w:pPr>
+      <w:r>
+        <w:rPr>
+          <w:rFonts w:ascii="Arial" w:hAnsi="Arial" w:eastAsia="ＭＳ 明朝" w:cs="Mangal" w:eastAsiaTheme="minorEastAsia" w:csTheme="minorBidi"/>
           <w:b/>
+          <w:bCs/>
           <w:sz w:val="22"/>
-        </w:rPr>
-        <w:t xml:space="preserve">Dynamic, Screen-Based Curricula: </w:t>
-      </w:r>
-      <w:r>
-        <w:rPr>
-          <w:rFonts w:ascii="Arial" w:hAnsi="Arial"/>
+          <w:szCs w:val="22"/>
+        </w:rPr>
+        <w:t xml:space="preserve">AI Generation Engine: </w:t>
+      </w:r>
+      <w:r>
+        <w:rPr>
+          <w:rFonts w:ascii="Arial" w:hAnsi="Arial" w:eastAsia="ＭＳ 明朝" w:cs="Mangal" w:eastAsiaTheme="minorEastAsia" w:csTheme="minorBidi"/>
           <w:sz w:val="22"/>
-        </w:rPr>
-        <w:t>Generate a structured, non-linear roadmap based on a user's natural language project description, teaching relevant concepts in synchronization with physical frontend layout screens.</w:t>
+          <w:szCs w:val="22"/>
+        </w:rPr>
+        <w:t>Manages API integration with Anthropic Claude or OpenAI GPT-4, utilizing Redis job queues to process long-running course generation requests asynchronously.</w:t>
       </w:r>
     </w:p>
     <w:p>
       <w:pPr>
         <w:pStyle w:val="ListBullet"/>
         <w:spacing w:after="80" w:line="276" w:lineRule="auto"/>
-      </w:pPr>
-      <w:r>
-        <w:rPr>
-          <w:rFonts w:ascii="Arial" w:hAnsi="Arial"/>
+        <w:ind w:left="360" w:hanging="360"/>
+      </w:pPr>
+      <w:r>
+        <w:rPr>
+          <w:rFonts w:ascii="Arial" w:hAnsi="Arial" w:eastAsia="ＭＳ 明朝" w:cs="Mangal" w:eastAsiaTheme="minorEastAsia" w:csTheme="minorBidi"/>
           <w:b/>
+          <w:bCs/>
           <w:sz w:val="22"/>
-        </w:rPr>
-        <w:t xml:space="preserve">Automated Progression Gates: </w:t>
-      </w:r>
-      <w:r>
-        <w:rPr>
-          <w:rFonts w:ascii="Arial" w:hAnsi="Arial"/>
+          <w:szCs w:val="22"/>
+        </w:rPr>
+        <w:t xml:space="preserve">Secure Code Execution Layer: </w:t>
+      </w:r>
+      <w:r>
+        <w:rPr>
+          <w:rFonts w:ascii="Arial" w:hAnsi="Arial" w:eastAsia="ＭＳ 明朝" w:cs="Mangal" w:eastAsiaTheme="minorEastAsia" w:csTheme="minorBidi"/>
           <w:sz w:val="22"/>
-        </w:rPr>
-        <w:t>Incorporate client-side and server-side unit-testing sandboxes that validate student submissions, ensuring core requirements are met before unlocking subsequent syllabus modules.</w:t>
+          <w:szCs w:val="22"/>
+        </w:rPr>
+        <w:t>Uses client-side WebContainers to execute compiler actions safely in the browser, paired with a backend Node.js sandbox that reruns test suites to prevent client-side progress spoofing.</w:t>
       </w:r>
     </w:p>
     <w:p>
       <w:pPr>
+        <w:pStyle w:val="ListBullet"/>
+        <w:spacing w:after="80" w:line="276" w:lineRule="auto"/>
+        <w:ind w:left="360" w:hanging="360"/>
+      </w:pPr>
+      <w:r>
+        <w:rPr>
+          <w:rFonts w:ascii="Arial" w:hAnsi="Arial" w:eastAsia="ＭＳ 明朝" w:cs="Mangal" w:eastAsiaTheme="minorEastAsia" w:csTheme="minorBidi"/>
+          <w:b/>
+          <w:bCs/>
+          <w:sz w:val="22"/>
+          <w:szCs w:val="22"/>
+        </w:rPr>
+        <w:t xml:space="preserve">Database Layer (PostgreSQL &amp; Redis): </w:t>
+      </w:r>
+      <w:r>
+        <w:rPr>
+          <w:rFonts w:ascii="Arial" w:hAnsi="Arial" w:eastAsia="ＭＳ 明朝" w:cs="Mangal" w:eastAsiaTheme="minorEastAsia" w:csTheme="minorBidi"/>
+          <w:sz w:val="22"/>
+          <w:szCs w:val="22"/>
+        </w:rPr>
+        <w:t>Features relational models linking Users, Projects, Pages, Components, Modules, and ProgressRecords, alongside Redis cache for queue management.</w:t>
+      </w:r>
+    </w:p>
+    <w:p>
+      <w:pPr>
         <w:keepNext/>
         <w:spacing w:before="360" w:after="120"/>
       </w:pPr>
       <w:r>
         <w:rPr>
-          <w:rFonts w:ascii="Arial" w:hAnsi="Arial"/>
+          <w:rFonts w:ascii="Arial" w:hAnsi="Arial" w:eastAsia="ＭＳ 明朝" w:cs="Mangal" w:eastAsiaTheme="minorEastAsia" w:csTheme="minorBidi"/>
           <w:b/>
+          <w:bCs/>
           <w:sz w:val="24"/>
-        </w:rPr>
-        <w:t>3. PROJECT DESCRIPTION:-</w:t>
+          <w:szCs w:val="22"/>
+        </w:rPr>
+        <w:t>6. SOFTWARE REQUIREMENT:-</w:t>
       </w:r>
     </w:p>
     <w:p>
       <w:pPr>
-        <w:spacing w:after="120" w:line="276" w:lineRule="auto"/>
-      </w:pPr>
-      <w:r>
-        <w:rPr>
-          <w:rFonts w:ascii="Arial" w:hAnsi="Arial"/>
+        <w:pStyle w:val="ListBullet"/>
+        <w:spacing w:after="80" w:line="276" w:lineRule="auto"/>
+        <w:ind w:left="360" w:hanging="360"/>
+      </w:pPr>
+      <w:r>
+        <w:rPr>
+          <w:rFonts w:ascii="Arial" w:hAnsi="Arial" w:eastAsia="ＭＳ 明朝" w:cs="Mangal" w:eastAsiaTheme="minorEastAsia" w:csTheme="minorBidi"/>
+          <w:b/>
+          <w:bCs/>
           <w:sz w:val="22"/>
-        </w:rPr>
-        <w:t>Ascent.ai is an educational web portal that transforms how programming languages and full-stack frameworks are taught. Unlike traditional learning management systems that present static, predefined course flows, Ascent.ai treats the student's personal project idea as the root of the entire curriculum. Upon inputting a direct prompt (e.g., 'E-commerce platform using React') or selecting options via a guided wizard (project archetype, styling frameworks, database choices), the backend orchestrates a comprehensive learning roadmap.</w:t>
+          <w:szCs w:val="22"/>
+        </w:rPr>
+        <w:t xml:space="preserve">Operating System: </w:t>
+      </w:r>
+      <w:r>
+        <w:rPr>
+          <w:rFonts w:ascii="Arial" w:hAnsi="Arial" w:eastAsia="ＭＳ 明朝" w:cs="Mangal" w:eastAsiaTheme="minorEastAsia" w:csTheme="minorBidi"/>
+          <w:sz w:val="22"/>
+          <w:szCs w:val="22"/>
+        </w:rPr>
+        <w:t>Cross-Platform compatibility (Windows 10/11, macOS, Linux).</w:t>
       </w:r>
     </w:p>
     <w:p>
       <w:pPr>
-        <w:spacing w:after="120" w:line="276" w:lineRule="auto"/>
-      </w:pPr>
-      <w:r>
-        <w:rPr>
-          <w:rFonts w:ascii="Arial" w:hAnsi="Arial"/>
+        <w:pStyle w:val="ListBullet"/>
+        <w:spacing w:after="80" w:line="276" w:lineRule="auto"/>
+        <w:ind w:left="360" w:hanging="360"/>
+      </w:pPr>
+      <w:r>
+        <w:rPr>
+          <w:rFonts w:ascii="Arial" w:hAnsi="Arial" w:eastAsia="ＭＳ 明朝" w:cs="Mangal" w:eastAsiaTheme="minorEastAsia" w:csTheme="minorBidi"/>
+          <w:b/>
+          <w:bCs/>
           <w:sz w:val="22"/>
-        </w:rPr>
-        <w:t>The project is structured around 'vertical-slice development,' ensuring that learners construct a working prototype early in the cycle and deepen it over time. Progression follows a strict difficulty ladder within each page or screen:</w:t>
+          <w:szCs w:val="22"/>
+        </w:rPr>
+        <w:t xml:space="preserve">Runtime Environment: </w:t>
+      </w:r>
+      <w:r>
+        <w:rPr>
+          <w:rFonts w:ascii="Arial" w:hAnsi="Arial" w:eastAsia="ＭＳ 明朝" w:cs="Mangal" w:eastAsiaTheme="minorEastAsia" w:csTheme="minorBidi"/>
+          <w:sz w:val="22"/>
+          <w:szCs w:val="22"/>
+        </w:rPr>
+        <w:t>Node.js (v18.x or above) and Python 3.10.x.</w:t>
       </w:r>
     </w:p>
     <w:p>
       <w:pPr>
         <w:pStyle w:val="ListBullet"/>
         <w:spacing w:after="80" w:line="276" w:lineRule="auto"/>
-      </w:pPr>
-      <w:r>
-        <w:rPr>
-          <w:rFonts w:ascii="Arial" w:hAnsi="Arial"/>
+        <w:ind w:left="360" w:hanging="360"/>
+      </w:pPr>
+      <w:r>
+        <w:rPr>
+          <w:rFonts w:ascii="Arial" w:hAnsi="Arial" w:eastAsia="ＭＳ 明朝" w:cs="Mangal" w:eastAsiaTheme="minorEastAsia" w:csTheme="minorBidi"/>
           <w:b/>
+          <w:bCs/>
           <w:sz w:val="22"/>
-        </w:rPr>
-        <w:t xml:space="preserve">Visual Scaffolding: </w:t>
-      </w:r>
-      <w:r>
-        <w:rPr>
-          <w:rFonts w:ascii="Arial" w:hAnsi="Arial"/>
+          <w:szCs w:val="22"/>
+        </w:rPr>
+        <w:t xml:space="preserve">Backend Framework: </w:t>
+      </w:r>
+      <w:r>
+        <w:rPr>
+          <w:rFonts w:ascii="Arial" w:hAnsi="Arial" w:eastAsia="ＭＳ 明朝" w:cs="Mangal" w:eastAsiaTheme="minorEastAsia" w:csTheme="minorBidi"/>
           <w:sz w:val="22"/>
-        </w:rPr>
-        <w:t>The user begins by implementing a static mockup of the target page (e.g., hardcoded list rendering for a product dashboard) to understand UI/UX component structures.</w:t>
+          <w:szCs w:val="22"/>
+        </w:rPr>
+        <w:t>Express.js with TypeScript support.</w:t>
       </w:r>
     </w:p>
     <w:p>
       <w:pPr>
         <w:pStyle w:val="ListBullet"/>
         <w:spacing w:after="80" w:line="276" w:lineRule="auto"/>
-      </w:pPr>
-      <w:r>
-        <w:rPr>
-          <w:rFonts w:ascii="Arial" w:hAnsi="Arial"/>
+        <w:ind w:left="360" w:hanging="360"/>
+      </w:pPr>
+      <w:r>
+        <w:rPr>
+          <w:rFonts w:ascii="Arial" w:hAnsi="Arial" w:eastAsia="ＭＳ 明朝" w:cs="Mangal" w:eastAsiaTheme="minorEastAsia" w:csTheme="minorBidi"/>
           <w:b/>
+          <w:bCs/>
           <w:sz w:val="22"/>
-        </w:rPr>
-        <w:t xml:space="preserve">Dynamic State &amp; Integration: </w:t>
-      </w:r>
-      <w:r>
-        <w:rPr>
-          <w:rFonts w:ascii="Arial" w:hAnsi="Arial"/>
+          <w:szCs w:val="22"/>
+        </w:rPr>
+        <w:t xml:space="preserve">Frontend Library: </w:t>
+      </w:r>
+      <w:r>
+        <w:rPr>
+          <w:rFonts w:ascii="Arial" w:hAnsi="Arial" w:eastAsia="ＭＳ 明朝" w:cs="Mangal" w:eastAsiaTheme="minorEastAsia" w:csTheme="minorBidi"/>
           <w:sz w:val="22"/>
-        </w:rPr>
-        <w:t>The module introduces reactivity, hooks, and dynamic data integration (e.g., wiring mock state hooks, managing lists, and handling user inputs).</w:t>
+          <w:szCs w:val="22"/>
+        </w:rPr>
+        <w:t>React 19.x with Vite compilation server.</w:t>
       </w:r>
     </w:p>
     <w:p>
       <w:pPr>
         <w:pStyle w:val="ListBullet"/>
         <w:spacing w:after="80" w:line="276" w:lineRule="auto"/>
-      </w:pPr>
-      <w:r>
-        <w:rPr>
-          <w:rFonts w:ascii="Arial" w:hAnsi="Arial"/>
+        <w:ind w:left="360" w:hanging="360"/>
+      </w:pPr>
+      <w:r>
+        <w:rPr>
+          <w:rFonts w:ascii="Arial" w:hAnsi="Arial" w:eastAsia="ＭＳ 明朝" w:cs="Mangal" w:eastAsiaTheme="minorEastAsia" w:csTheme="minorBidi"/>
           <w:b/>
+          <w:bCs/>
           <w:sz w:val="22"/>
-        </w:rPr>
-        <w:t xml:space="preserve">Robustness &amp; Validation: </w:t>
-      </w:r>
-      <w:r>
-        <w:rPr>
-          <w:rFonts w:ascii="Arial" w:hAnsi="Arial"/>
+          <w:szCs w:val="22"/>
+        </w:rPr>
+        <w:t xml:space="preserve">Database Management: </w:t>
+      </w:r>
+      <w:r>
+        <w:rPr>
+          <w:rFonts w:ascii="Arial" w:hAnsi="Arial" w:eastAsia="ＭＳ 明朝" w:cs="Mangal" w:eastAsiaTheme="minorEastAsia" w:csTheme="minorBidi"/>
           <w:sz w:val="22"/>
-        </w:rPr>
-        <w:t>The module wraps the features in network logic, handling loading spinners, error states, and edge-case validations.</w:t>
+          <w:szCs w:val="22"/>
+        </w:rPr>
+        <w:t>PostgreSQL (v15.0 or above) and Redis (v7.0 or above).</w:t>
       </w:r>
     </w:p>
     <w:p>
       <w:pPr>
-        <w:spacing w:after="120" w:line="276" w:lineRule="auto"/>
-      </w:pPr>
-      <w:r>
-        <w:rPr>
-          <w:rFonts w:ascii="Arial" w:hAnsi="Arial"/>
+        <w:pStyle w:val="ListBullet"/>
+        <w:spacing w:after="80" w:line="276" w:lineRule="auto"/>
+        <w:ind w:left="360" w:hanging="360"/>
+      </w:pPr>
+      <w:r>
+        <w:rPr>
+          <w:rFonts w:ascii="Arial" w:hAnsi="Arial" w:eastAsia="ＭＳ 明朝" w:cs="Mangal" w:eastAsiaTheme="minorEastAsia" w:csTheme="minorBidi"/>
+          <w:b/>
+          <w:bCs/>
           <w:sz w:val="22"/>
-        </w:rPr>
-        <w:t>The web app utilizes an in-browser coding environment (such as StackBlitz WebContainers or CodeSandbox Sandpack) which executes live code changes, provides instant visual feedback, and runs automated tests that gate module completion. The project loops through this lifecycle screen by screen until the entire planned project is complete.</w:t>
+          <w:szCs w:val="22"/>
+        </w:rPr>
+        <w:t xml:space="preserve">Third-Party Integrations: </w:t>
+      </w:r>
+      <w:r>
+        <w:rPr>
+          <w:rFonts w:ascii="Arial" w:hAnsi="Arial" w:eastAsia="ＭＳ 明朝" w:cs="Mangal" w:eastAsiaTheme="minorEastAsia" w:csTheme="minorBidi"/>
+          <w:sz w:val="22"/>
+          <w:szCs w:val="22"/>
+        </w:rPr>
+        <w:t>Anthropic/OpenAI API Keys; StackBlitz WebContainers SDK / Sandpack SDK.</w:t>
       </w:r>
     </w:p>
     <w:p>
@@ -934,967 +1427,642 @@
       </w:pPr>
       <w:r>
         <w:rPr>
-          <w:rFonts w:ascii="Arial" w:hAnsi="Arial"/>
+          <w:rFonts w:ascii="Arial" w:hAnsi="Arial" w:eastAsia="ＭＳ 明朝" w:cs="Mangal" w:eastAsiaTheme="minorEastAsia" w:csTheme="minorBidi"/>
           <w:b/>
+          <w:bCs/>
           <w:sz w:val="24"/>
-        </w:rPr>
-        <w:t>4. SYSTEM OVERVIEW:-</w:t>
+          <w:szCs w:val="22"/>
+        </w:rPr>
+        <w:t>7. HARDWARE REQUIREMENT:-</w:t>
       </w:r>
     </w:p>
     <w:p>
       <w:pPr>
-        <w:spacing w:after="120" w:line="276" w:lineRule="auto"/>
-      </w:pPr>
-      <w:r>
-        <w:rPr>
-          <w:rFonts w:ascii="Arial" w:hAnsi="Arial"/>
+        <w:pStyle w:val="ListBullet"/>
+        <w:spacing w:after="80" w:line="276" w:lineRule="auto"/>
+        <w:ind w:left="360" w:hanging="360"/>
+      </w:pPr>
+      <w:r>
+        <w:rPr>
+          <w:rFonts w:ascii="Arial" w:hAnsi="Arial" w:eastAsia="ＭＳ 明朝" w:cs="Mangal" w:eastAsiaTheme="minorEastAsia" w:csTheme="minorBidi"/>
+          <w:b/>
+          <w:bCs/>
           <w:sz w:val="22"/>
-        </w:rPr>
-        <w:t>The system data flow and processing loop is designed as a series of interconnected services managed within a single workspace. The key processes include:</w:t>
+          <w:szCs w:val="22"/>
+        </w:rPr>
+        <w:t xml:space="preserve">Processor: </w:t>
+      </w:r>
+      <w:r>
+        <w:rPr>
+          <w:rFonts w:ascii="Arial" w:hAnsi="Arial" w:eastAsia="ＭＳ 明朝" w:cs="Mangal" w:eastAsiaTheme="minorEastAsia" w:csTheme="minorBidi"/>
+          <w:sz w:val="22"/>
+          <w:szCs w:val="22"/>
+        </w:rPr>
+        <w:t>Multi-core CPU (Intel Core i5/AMD Ryzen 5, 2.4 GHz minimum or equivalent).</w:t>
       </w:r>
     </w:p>
     <w:p>
       <w:pPr>
         <w:pStyle w:val="ListBullet"/>
         <w:spacing w:after="80" w:line="276" w:lineRule="auto"/>
-      </w:pPr>
-      <w:r>
-        <w:rPr>
-          <w:rFonts w:ascii="Arial" w:hAnsi="Arial"/>
+        <w:ind w:left="360" w:hanging="360"/>
+      </w:pPr>
+      <w:r>
+        <w:rPr>
+          <w:rFonts w:ascii="Arial" w:hAnsi="Arial" w:eastAsia="ＭＳ 明朝" w:cs="Mangal" w:eastAsiaTheme="minorEastAsia" w:csTheme="minorBidi"/>
           <w:b/>
+          <w:bCs/>
           <w:sz w:val="22"/>
-        </w:rPr>
-        <w:t xml:space="preserve">Input Intake Handler: </w:t>
-      </w:r>
-      <w:r>
-        <w:rPr>
-          <w:rFonts w:ascii="Arial" w:hAnsi="Arial"/>
+          <w:szCs w:val="22"/>
+        </w:rPr>
+        <w:t xml:space="preserve">System Memory (RAM): </w:t>
+      </w:r>
+      <w:r>
+        <w:rPr>
+          <w:rFonts w:ascii="Arial" w:hAnsi="Arial" w:eastAsia="ＭＳ 明朝" w:cs="Mangal" w:eastAsiaTheme="minorEastAsia" w:csTheme="minorBidi"/>
           <w:sz w:val="22"/>
-        </w:rPr>
-        <w:t>Captures the user prompt or guided wizard configuration, validating options and preparing metadata (target language, frameworks).</w:t>
+          <w:szCs w:val="22"/>
+        </w:rPr>
+        <w:t>8 GB minimum (16 GB highly recommended to run Docker containers, in-browser sandboxes, and developer pipelines simultaneously).</w:t>
       </w:r>
     </w:p>
     <w:p>
       <w:pPr>
         <w:pStyle w:val="ListBullet"/>
         <w:spacing w:after="80" w:line="276" w:lineRule="auto"/>
-      </w:pPr>
-      <w:r>
-        <w:rPr>
-          <w:rFonts w:ascii="Arial" w:hAnsi="Arial"/>
+        <w:ind w:left="360" w:hanging="360"/>
+      </w:pPr>
+      <w:r>
+        <w:rPr>
+          <w:rFonts w:ascii="Arial" w:hAnsi="Arial" w:eastAsia="ＭＳ 明朝" w:cs="Mangal" w:eastAsiaTheme="minorEastAsia" w:csTheme="minorBidi"/>
           <w:b/>
+          <w:bCs/>
           <w:sz w:val="22"/>
-        </w:rPr>
-        <w:t xml:space="preserve">Roadmap Planner &amp; Orchestrator: </w:t>
-      </w:r>
-      <w:r>
-        <w:rPr>
-          <w:rFonts w:ascii="Arial" w:hAnsi="Arial"/>
+          <w:szCs w:val="22"/>
+        </w:rPr>
+        <w:t xml:space="preserve">Storage: </w:t>
+      </w:r>
+      <w:r>
+        <w:rPr>
+          <w:rFonts w:ascii="Arial" w:hAnsi="Arial" w:eastAsia="ＭＳ 明朝" w:cs="Mangal" w:eastAsiaTheme="minorEastAsia" w:csTheme="minorBidi"/>
           <w:sz w:val="22"/>
-        </w:rPr>
-        <w:t>Communicates with the Large Language Model service to plan the application screens and structure the sequence of lessons.</w:t>
+          <w:szCs w:val="22"/>
+        </w:rPr>
+        <w:t>SSD with at least 5 GB of free space for node_modules and local project storage.</w:t>
       </w:r>
     </w:p>
     <w:p>
       <w:pPr>
         <w:pStyle w:val="ListBullet"/>
         <w:spacing w:after="80" w:line="276" w:lineRule="auto"/>
-      </w:pPr>
-      <w:r>
-        <w:rPr>
-          <w:rFonts w:ascii="Arial" w:hAnsi="Arial"/>
+        <w:ind w:left="360" w:hanging="360"/>
+      </w:pPr>
+      <w:r>
+        <w:rPr>
+          <w:rFonts w:ascii="Arial" w:hAnsi="Arial" w:eastAsia="ＭＳ 明朝" w:cs="Mangal" w:eastAsiaTheme="minorEastAsia" w:csTheme="minorBidi"/>
           <w:b/>
+          <w:bCs/>
           <w:sz w:val="22"/>
-        </w:rPr>
-        <w:t xml:space="preserve">Webpage Generator: </w:t>
-      </w:r>
-      <w:r>
-        <w:rPr>
-          <w:rFonts w:ascii="Arial" w:hAnsi="Arial"/>
+          <w:szCs w:val="22"/>
+        </w:rPr>
+        <w:t xml:space="preserve">Network Interface: </w:t>
+      </w:r>
+      <w:r>
+        <w:rPr>
+          <w:rFonts w:ascii="Arial" w:hAnsi="Arial" w:eastAsia="ＭＳ 明朝" w:cs="Mangal" w:eastAsiaTheme="minorEastAsia" w:csTheme="minorBidi"/>
           <w:sz w:val="22"/>
-        </w:rPr>
-        <w:t>Creates the starter folder layout, HTML/JSX scaffolding, and descriptions of the visual output for the active screen.</w:t>
+          <w:szCs w:val="22"/>
+        </w:rPr>
+        <w:t>Broadband internet connection with a minimum download speed of 10 Mbps for stable API communication and dependency compilation.</w:t>
       </w:r>
     </w:p>
     <w:p>
       <w:pPr>
+        <w:keepNext/>
+        <w:spacing w:before="360" w:after="120"/>
+      </w:pPr>
+      <w:r>
+        <w:rPr>
+          <w:rFonts w:ascii="Arial" w:hAnsi="Arial" w:eastAsia="ＭＳ 明朝" w:cs="Mangal" w:eastAsiaTheme="minorEastAsia" w:csTheme="minorBidi"/>
+          <w:b/>
+          <w:bCs/>
+          <w:sz w:val="24"/>
+          <w:szCs w:val="22"/>
+        </w:rPr>
+        <w:t>8. ADVANTAGES:-</w:t>
+      </w:r>
+    </w:p>
+    <w:p>
+      <w:pPr>
         <w:pStyle w:val="ListBullet"/>
         <w:spacing w:after="80" w:line="276" w:lineRule="auto"/>
-      </w:pPr>
-      <w:r>
-        <w:rPr>
-          <w:rFonts w:ascii="Arial" w:hAnsi="Arial"/>
+        <w:ind w:left="360" w:hanging="360"/>
+      </w:pPr>
+      <w:r>
+        <w:rPr>
+          <w:rFonts w:ascii="Arial" w:hAnsi="Arial" w:eastAsia="ＭＳ 明朝" w:cs="Mangal" w:eastAsiaTheme="minorEastAsia" w:csTheme="minorBidi"/>
           <w:b/>
+          <w:bCs/>
           <w:sz w:val="22"/>
-        </w:rPr>
-        <w:t xml:space="preserve">Component Decomposer: </w:t>
-      </w:r>
-      <w:r>
-        <w:rPr>
-          <w:rFonts w:ascii="Arial" w:hAnsi="Arial"/>
+          <w:szCs w:val="22"/>
+        </w:rPr>
+        <w:t xml:space="preserve">Active Pedagogy over Passive Reading: </w:t>
+      </w:r>
+      <w:r>
+        <w:rPr>
+          <w:rFonts w:ascii="Arial" w:hAnsi="Arial" w:eastAsia="ＭＳ 明朝" w:cs="Mangal" w:eastAsiaTheme="minorEastAsia" w:csTheme="minorBidi"/>
           <w:sz w:val="22"/>
-        </w:rPr>
-        <w:t>Scans the generated layout structure and extracts teachable DOM units (buttons, lists, search inputs, tables) to map them to learning objectives.</w:t>
+          <w:szCs w:val="22"/>
+        </w:rPr>
+        <w:t>Drives high cognitive retention by requiring learners to construct 100% of the implementation code themselves, avoiding passive tutorial replication.</w:t>
       </w:r>
     </w:p>
     <w:p>
       <w:pPr>
         <w:pStyle w:val="ListBullet"/>
         <w:spacing w:after="80" w:line="276" w:lineRule="auto"/>
-      </w:pPr>
-      <w:r>
-        <w:rPr>
-          <w:rFonts w:ascii="Arial" w:hAnsi="Arial"/>
+        <w:ind w:left="360" w:hanging="360"/>
+      </w:pPr>
+      <w:r>
+        <w:rPr>
+          <w:rFonts w:ascii="Arial" w:hAnsi="Arial" w:eastAsia="ＭＳ 明朝" w:cs="Mangal" w:eastAsiaTheme="minorEastAsia" w:csTheme="minorBidi"/>
           <w:b/>
+          <w:bCs/>
           <w:sz w:val="22"/>
-        </w:rPr>
-        <w:t xml:space="preserve">Module compiler: </w:t>
-      </w:r>
-      <w:r>
-        <w:rPr>
-          <w:rFonts w:ascii="Arial" w:hAnsi="Arial"/>
+          <w:szCs w:val="22"/>
+        </w:rPr>
+        <w:t xml:space="preserve">Highly Personalized Syllabus: </w:t>
+      </w:r>
+      <w:r>
+        <w:rPr>
+          <w:rFonts w:ascii="Arial" w:hAnsi="Arial" w:eastAsia="ＭＳ 明朝" w:cs="Mangal" w:eastAsiaTheme="minorEastAsia" w:csTheme="minorBidi"/>
           <w:sz w:val="22"/>
-        </w:rPr>
-        <w:t>Generates conceptual explanations, step-by-step instructions, and automated test specifications for each component.</w:t>
+          <w:szCs w:val="22"/>
+        </w:rPr>
+        <w:t>Enables open-ended prompt choices instead of restricting learners to pre-designed, generic coding paths.</w:t>
       </w:r>
     </w:p>
     <w:p>
       <w:pPr>
         <w:pStyle w:val="ListBullet"/>
         <w:spacing w:after="80" w:line="276" w:lineRule="auto"/>
-      </w:pPr>
-      <w:r>
-        <w:rPr>
-          <w:rFonts w:ascii="Arial" w:hAnsi="Arial"/>
+        <w:ind w:left="360" w:hanging="360"/>
+      </w:pPr>
+      <w:r>
+        <w:rPr>
+          <w:rFonts w:ascii="Arial" w:hAnsi="Arial" w:eastAsia="ＭＳ 明朝" w:cs="Mangal" w:eastAsiaTheme="minorEastAsia" w:csTheme="minorBidi"/>
           <w:b/>
+          <w:bCs/>
           <w:sz w:val="22"/>
-        </w:rPr>
-        <w:t xml:space="preserve">Sandbox Code Editor &amp; Evaluator: </w:t>
-      </w:r>
-      <w:r>
-        <w:rPr>
-          <w:rFonts w:ascii="Arial" w:hAnsi="Arial"/>
+          <w:szCs w:val="22"/>
+        </w:rPr>
+        <w:t xml:space="preserve">Gatekeeping via Automated Testing: </w:t>
+      </w:r>
+      <w:r>
+        <w:rPr>
+          <w:rFonts w:ascii="Arial" w:hAnsi="Arial" w:eastAsia="ＭＳ 明朝" w:cs="Mangal" w:eastAsiaTheme="minorEastAsia" w:csTheme="minorBidi"/>
           <w:sz w:val="22"/>
-        </w:rPr>
-        <w:t>Hosts the visual coding workspace, compiling code in real-time, executing client-side test assertions, and querying the backend server to securely log progress records.</w:t>
+          <w:szCs w:val="22"/>
+        </w:rPr>
+        <w:t>Uses unit tests to check syntax correctness, ensuring progress is gated based on working code, not eyeballed evaluations.</w:t>
       </w:r>
     </w:p>
     <w:p>
       <w:pPr>
+        <w:pStyle w:val="ListBullet"/>
+        <w:spacing w:after="80" w:line="276" w:lineRule="auto"/>
+        <w:ind w:left="360" w:hanging="360"/>
+      </w:pPr>
+      <w:r>
+        <w:rPr>
+          <w:rFonts w:ascii="Arial" w:hAnsi="Arial" w:eastAsia="ＭＳ 明朝" w:cs="Mangal" w:eastAsiaTheme="minorEastAsia" w:csTheme="minorBidi"/>
+          <w:b/>
+          <w:bCs/>
+          <w:sz w:val="22"/>
+          <w:szCs w:val="22"/>
+        </w:rPr>
+        <w:t xml:space="preserve">Vertical-Slice Progress Motivation: </w:t>
+      </w:r>
+      <w:r>
+        <w:rPr>
+          <w:rFonts w:ascii="Arial" w:hAnsi="Arial" w:eastAsia="ＭＳ 明朝" w:cs="Mangal" w:eastAsiaTheme="minorEastAsia" w:csTheme="minorBidi"/>
+          <w:sz w:val="22"/>
+          <w:szCs w:val="22"/>
+        </w:rPr>
+        <w:t>Delivers visual feedback by keeping sections organized around tangible screen panels, helping learners maintain interest.</w:t>
+      </w:r>
+    </w:p>
+    <w:p>
+      <w:pPr>
+        <w:pStyle w:val="ListBullet"/>
+        <w:spacing w:after="80" w:line="276" w:lineRule="auto"/>
+        <w:ind w:left="360" w:hanging="360"/>
+      </w:pPr>
+      <w:r>
+        <w:rPr>
+          <w:rFonts w:ascii="Arial" w:hAnsi="Arial" w:eastAsia="ＭＳ 明朝" w:cs="Mangal" w:eastAsiaTheme="minorEastAsia" w:csTheme="minorBidi"/>
+          <w:b/>
+          <w:bCs/>
+          <w:sz w:val="22"/>
+          <w:szCs w:val="22"/>
+        </w:rPr>
+        <w:t xml:space="preserve">Secure Verification Loop: </w:t>
+      </w:r>
+      <w:r>
+        <w:rPr>
+          <w:rFonts w:ascii="Arial" w:hAnsi="Arial" w:eastAsia="ＭＳ 明朝" w:cs="Mangal" w:eastAsiaTheme="minorEastAsia" w:csTheme="minorBidi"/>
+          <w:sz w:val="22"/>
+          <w:szCs w:val="22"/>
+        </w:rPr>
+        <w:t>Combines client sandboxes with server-side validation to ensure academic honesty and robustness.</w:t>
+      </w:r>
+    </w:p>
+    <w:p>
+      <w:pPr>
         <w:keepNext/>
         <w:spacing w:before="360" w:after="120"/>
       </w:pPr>
       <w:r>
         <w:rPr>
-          <w:rFonts w:ascii="Arial" w:hAnsi="Arial"/>
+          <w:rFonts w:ascii="Arial" w:hAnsi="Arial" w:eastAsia="ＭＳ 明朝" w:cs="Mangal" w:eastAsiaTheme="minorEastAsia" w:csTheme="minorBidi"/>
           <w:b/>
+          <w:bCs/>
           <w:sz w:val="24"/>
-        </w:rPr>
-        <w:t>5. SYSTEM ARCHITECTURE:-</w:t>
+          <w:szCs w:val="22"/>
+        </w:rPr>
+        <w:t>9. APPLICATIONS:-</w:t>
       </w:r>
     </w:p>
     <w:p>
       <w:pPr>
-        <w:spacing w:after="120" w:line="276" w:lineRule="auto"/>
-      </w:pPr>
-      <w:r>
-        <w:rPr>
-          <w:rFonts w:ascii="Arial" w:hAnsi="Arial"/>
+        <w:pStyle w:val="ListBullet"/>
+        <w:spacing w:after="80" w:line="276" w:lineRule="auto"/>
+        <w:ind w:left="360" w:hanging="360"/>
+      </w:pPr>
+      <w:r>
+        <w:rPr>
+          <w:rFonts w:ascii="Arial" w:hAnsi="Arial" w:eastAsia="ＭＳ 明朝" w:cs="Mangal" w:eastAsiaTheme="minorEastAsia" w:csTheme="minorBidi"/>
+          <w:b/>
+          <w:bCs/>
           <w:sz w:val="22"/>
-        </w:rPr>
-        <w:t>Ascent.ai is built using a Modular Monolith architecture to ensure low deployment overhead during prototyping while maintaining clear separation of boundaries for microservices scaling. The architecture is decomposed into the following layers:</w:t>
+          <w:szCs w:val="22"/>
+        </w:rPr>
+        <w:t xml:space="preserve">Academic Minor &amp; Major Projects: </w:t>
+      </w:r>
+      <w:r>
+        <w:rPr>
+          <w:rFonts w:ascii="Arial" w:hAnsi="Arial" w:eastAsia="ＭＳ 明朝" w:cs="Mangal" w:eastAsiaTheme="minorEastAsia" w:csTheme="minorBidi"/>
+          <w:sz w:val="22"/>
+          <w:szCs w:val="22"/>
+        </w:rPr>
+        <w:t>Provides students in engineering colleges with a guided tool to develop their academic deliverables while simultaneously learning their stack.</w:t>
       </w:r>
     </w:p>
     <w:p>
       <w:pPr>
         <w:pStyle w:val="ListBullet"/>
         <w:spacing w:after="80" w:line="276" w:lineRule="auto"/>
-      </w:pPr>
-      <w:r>
-        <w:rPr>
-          <w:rFonts w:ascii="Arial" w:hAnsi="Arial"/>
+        <w:ind w:left="360" w:hanging="360"/>
+      </w:pPr>
+      <w:r>
+        <w:rPr>
+          <w:rFonts w:ascii="Arial" w:hAnsi="Arial" w:eastAsia="ＭＳ 明朝" w:cs="Mangal" w:eastAsiaTheme="minorEastAsia" w:csTheme="minorBidi"/>
           <w:b/>
+          <w:bCs/>
           <w:sz w:val="22"/>
-        </w:rPr>
-        <w:t xml:space="preserve">User Interface Layer (Presentation): </w:t>
-      </w:r>
-      <w:r>
-        <w:rPr>
-          <w:rFonts w:ascii="Arial" w:hAnsi="Arial"/>
+          <w:szCs w:val="22"/>
+        </w:rPr>
+        <w:t xml:space="preserve">Career Shift &amp; Professional Upskilling: </w:t>
+      </w:r>
+      <w:r>
+        <w:rPr>
+          <w:rFonts w:ascii="Arial" w:hAnsi="Arial" w:eastAsia="ＭＳ 明朝" w:cs="Mangal" w:eastAsiaTheme="minorEastAsia" w:csTheme="minorBidi"/>
           <w:sz w:val="22"/>
-        </w:rPr>
-        <w:t>Built using React and custom Vanilla CSS (featuring glassmorphism, responsive split panels, and dark-mode themes). Houses the sidebar syllabus, markdown lesson pane, monaco-editor coding pane, and visual web-preview iframe.</w:t>
+          <w:szCs w:val="22"/>
+        </w:rPr>
+        <w:t>Helps junior developers learn modern web development patterns by building actual portfolio-ready systems.</w:t>
       </w:r>
     </w:p>
     <w:p>
       <w:pPr>
         <w:pStyle w:val="ListBullet"/>
         <w:spacing w:after="80" w:line="276" w:lineRule="auto"/>
-      </w:pPr>
-      <w:r>
-        <w:rPr>
-          <w:rFonts w:ascii="Arial" w:hAnsi="Arial"/>
+        <w:ind w:left="360" w:hanging="360"/>
+      </w:pPr>
+      <w:r>
+        <w:rPr>
+          <w:rFonts w:ascii="Arial" w:hAnsi="Arial" w:eastAsia="ＭＳ 明朝" w:cs="Mangal" w:eastAsiaTheme="minorEastAsia" w:csTheme="minorBidi"/>
           <w:b/>
+          <w:bCs/>
           <w:sz w:val="22"/>
-        </w:rPr>
-        <w:t xml:space="preserve">Business Logic Layer (Express BFF): </w:t>
-      </w:r>
-      <w:r>
-        <w:rPr>
-          <w:rFonts w:ascii="Arial" w:hAnsi="Arial"/>
+          <w:szCs w:val="22"/>
+        </w:rPr>
+        <w:t xml:space="preserve">Interactive Coding Bootcamps: </w:t>
+      </w:r>
+      <w:r>
+        <w:rPr>
+          <w:rFonts w:ascii="Arial" w:hAnsi="Arial" w:eastAsia="ＭＳ 明朝" w:cs="Mangal" w:eastAsiaTheme="minorEastAsia" w:csTheme="minorBidi"/>
           <w:sz w:val="22"/>
-        </w:rPr>
-        <w:t>Handles user authentication, rate-limiting, progress logging, and routes API requests. Separates prompts, parsing utilities, and module compilers.</w:t>
+          <w:szCs w:val="22"/>
+        </w:rPr>
+        <w:t>Acts as a virtual lab environment for coding bootcamps to scale lesson generation and automated test verification.</w:t>
       </w:r>
     </w:p>
     <w:p>
       <w:pPr>
         <w:pStyle w:val="ListBullet"/>
         <w:spacing w:after="80" w:line="276" w:lineRule="auto"/>
-      </w:pPr>
-      <w:r>
-        <w:rPr>
-          <w:rFonts w:ascii="Arial" w:hAnsi="Arial"/>
+        <w:ind w:left="360" w:hanging="360"/>
+      </w:pPr>
+      <w:r>
+        <w:rPr>
+          <w:rFonts w:ascii="Arial" w:hAnsi="Arial" w:eastAsia="ＭＳ 明朝" w:cs="Mangal" w:eastAsiaTheme="minorEastAsia" w:csTheme="minorBidi"/>
           <w:b/>
+          <w:bCs/>
           <w:sz w:val="22"/>
-        </w:rPr>
-        <w:t xml:space="preserve">AI Generation Engine: </w:t>
-      </w:r>
-      <w:r>
-        <w:rPr>
-          <w:rFonts w:ascii="Arial" w:hAnsi="Arial"/>
+          <w:szCs w:val="22"/>
+        </w:rPr>
+        <w:t xml:space="preserve">Rapid Scaffolding &amp; Prototyping: </w:t>
+      </w:r>
+      <w:r>
+        <w:rPr>
+          <w:rFonts w:ascii="Arial" w:hAnsi="Arial" w:eastAsia="ＭＳ 明朝" w:cs="Mangal" w:eastAsiaTheme="minorEastAsia" w:csTheme="minorBidi"/>
           <w:sz w:val="22"/>
-        </w:rPr>
-        <w:t>Manages API integration with Anthropic Claude or OpenAI GPT-4, utilizing Redis job queues to process long-running course generation requests asynchronously.</w:t>
+          <w:szCs w:val="22"/>
+        </w:rPr>
+        <w:t>Can be utilized by developers to plan complex screen files, structures, and schemas based on custom system roadmaps.</w:t>
       </w:r>
     </w:p>
     <w:p>
       <w:pPr>
+        <w:keepNext/>
+        <w:spacing w:before="360" w:after="120"/>
+      </w:pPr>
+      <w:r>
+        <w:rPr>
+          <w:rFonts w:ascii="Arial" w:hAnsi="Arial" w:eastAsia="ＭＳ 明朝" w:cs="Mangal" w:eastAsiaTheme="minorEastAsia" w:csTheme="minorBidi"/>
+          <w:b/>
+          <w:bCs/>
+          <w:sz w:val="24"/>
+          <w:szCs w:val="22"/>
+        </w:rPr>
+        <w:t>10. FUTURE SCOPE OF THE PROJECT:-</w:t>
+      </w:r>
+    </w:p>
+    <w:p>
+      <w:pPr>
         <w:pStyle w:val="ListBullet"/>
         <w:spacing w:after="80" w:line="276" w:lineRule="auto"/>
-      </w:pPr>
-      <w:r>
-        <w:rPr>
-          <w:rFonts w:ascii="Arial" w:hAnsi="Arial"/>
+        <w:ind w:left="360" w:hanging="360"/>
+      </w:pPr>
+      <w:r>
+        <w:rPr>
+          <w:rFonts w:ascii="Arial" w:hAnsi="Arial" w:eastAsia="ＭＳ 明朝" w:cs="Mangal" w:eastAsiaTheme="minorEastAsia" w:csTheme="minorBidi"/>
           <w:b/>
+          <w:bCs/>
           <w:sz w:val="22"/>
-        </w:rPr>
-        <w:t xml:space="preserve">Secure Code Execution Layer: </w:t>
-      </w:r>
-      <w:r>
-        <w:rPr>
-          <w:rFonts w:ascii="Arial" w:hAnsi="Arial"/>
+          <w:szCs w:val="22"/>
+        </w:rPr>
+        <w:t xml:space="preserve">Adaptive Difficulty Controller: </w:t>
+      </w:r>
+      <w:r>
+        <w:rPr>
+          <w:rFonts w:ascii="Arial" w:hAnsi="Arial" w:eastAsia="ＭＳ 明朝" w:cs="Mangal" w:eastAsiaTheme="minorEastAsia" w:csTheme="minorBidi"/>
           <w:sz w:val="22"/>
-        </w:rPr>
-        <w:t>Uses client-side WebContainers to execute compiler actions safely in the browser, paired with a backend Node.js sandbox that reruns test suites to prevent client-side progress spoofing.</w:t>
+          <w:szCs w:val="22"/>
+        </w:rPr>
+        <w:t>Implement an LLM feedback loop that analyzes student errors, styling mistakes, and completion speeds to dynamically modify hints and curriculum pacing.</w:t>
       </w:r>
     </w:p>
     <w:p>
       <w:pPr>
         <w:pStyle w:val="ListBullet"/>
         <w:spacing w:after="80" w:line="276" w:lineRule="auto"/>
-      </w:pPr>
-      <w:r>
-        <w:rPr>
-          <w:rFonts w:ascii="Arial" w:hAnsi="Arial"/>
+        <w:ind w:left="360" w:hanging="360"/>
+      </w:pPr>
+      <w:r>
+        <w:rPr>
+          <w:rFonts w:ascii="Arial" w:hAnsi="Arial" w:eastAsia="ＭＳ 明朝" w:cs="Mangal" w:eastAsiaTheme="minorEastAsia" w:csTheme="minorBidi"/>
           <w:b/>
+          <w:bCs/>
           <w:sz w:val="22"/>
-        </w:rPr>
-        <w:t xml:space="preserve">Database Layer (PostgreSQL &amp; Redis): </w:t>
-      </w:r>
-      <w:r>
-        <w:rPr>
-          <w:rFonts w:ascii="Arial" w:hAnsi="Arial"/>
+          <w:szCs w:val="22"/>
+        </w:rPr>
+        <w:t xml:space="preserve">Hybrid Content Architecture: </w:t>
+      </w:r>
+      <w:r>
+        <w:rPr>
+          <w:rFonts w:ascii="Arial" w:hAnsi="Arial" w:eastAsia="ＭＳ 明朝" w:cs="Mangal" w:eastAsiaTheme="minorEastAsia" w:csTheme="minorBidi"/>
           <w:sz w:val="22"/>
-        </w:rPr>
-        <w:t>Features relational models linking Users, Projects, Pages, Components, Modules, and ProgressRecords, alongside Redis cache for queue management.</w:t>
+          <w:szCs w:val="22"/>
+        </w:rPr>
+        <w:t>Combine an open-source library of pre-compiled, verified modules with generative components to reduce API hosting costs and improve explanation accuracy.</w:t>
       </w:r>
     </w:p>
     <w:p>
       <w:pPr>
+        <w:pStyle w:val="ListBullet"/>
+        <w:spacing w:after="80" w:line="276" w:lineRule="auto"/>
+        <w:ind w:left="360" w:hanging="360"/>
+      </w:pPr>
+      <w:r>
+        <w:rPr>
+          <w:rFonts w:ascii="Arial" w:hAnsi="Arial" w:eastAsia="ＭＳ 明朝" w:cs="Mangal" w:eastAsiaTheme="minorEastAsia" w:csTheme="minorBidi"/>
+          <w:b/>
+          <w:bCs/>
+          <w:sz w:val="22"/>
+          <w:szCs w:val="22"/>
+        </w:rPr>
+        <w:t xml:space="preserve">Collaborative Multiplayer Coding: </w:t>
+      </w:r>
+      <w:r>
+        <w:rPr>
+          <w:rFonts w:ascii="Arial" w:hAnsi="Arial" w:eastAsia="ＭＳ 明朝" w:cs="Mangal" w:eastAsiaTheme="minorEastAsia" w:csTheme="minorBidi"/>
+          <w:sz w:val="22"/>
+          <w:szCs w:val="22"/>
+        </w:rPr>
+        <w:t>Integrate WebRTC-based live coding rooms, allowing multiple students or student-mentor teams to collaborate in the same sandbox.</w:t>
+      </w:r>
+    </w:p>
+    <w:p>
+      <w:pPr>
+        <w:pStyle w:val="ListBullet"/>
+        <w:spacing w:after="80" w:line="276" w:lineRule="auto"/>
+        <w:ind w:left="360" w:hanging="360"/>
+      </w:pPr>
+      <w:r>
+        <w:rPr>
+          <w:rFonts w:ascii="Arial" w:hAnsi="Arial" w:eastAsia="ＭＳ 明朝" w:cs="Mangal" w:eastAsiaTheme="minorEastAsia" w:csTheme="minorBidi"/>
+          <w:b/>
+          <w:bCs/>
+          <w:sz w:val="22"/>
+          <w:szCs w:val="22"/>
+        </w:rPr>
+        <w:t xml:space="preserve">Automated Git Sync &amp; Cloud Deployment: </w:t>
+      </w:r>
+      <w:r>
+        <w:rPr>
+          <w:rFonts w:ascii="Arial" w:hAnsi="Arial" w:eastAsia="ＭＳ 明朝" w:cs="Mangal" w:eastAsiaTheme="minorEastAsia" w:csTheme="minorBidi"/>
+          <w:sz w:val="22"/>
+          <w:szCs w:val="22"/>
+        </w:rPr>
+        <w:t>Extend the sandbox to commit progress directly to GitHub and deploy the final build to hosting providers (Vercel, Netlify, Render).</w:t>
+      </w:r>
+    </w:p>
+    <w:p>
+      <w:pPr>
         <w:keepNext/>
         <w:spacing w:before="360" w:after="120"/>
       </w:pPr>
       <w:r>
         <w:rPr>
-          <w:rFonts w:ascii="Arial" w:hAnsi="Arial"/>
+          <w:rFonts w:ascii="Arial" w:hAnsi="Arial" w:eastAsia="ＭＳ 明朝" w:cs="Mangal" w:eastAsiaTheme="minorEastAsia" w:csTheme="minorBidi"/>
           <w:b/>
+          <w:bCs/>
           <w:sz w:val="24"/>
-        </w:rPr>
-        <w:t>6. SOFTWARE REQUIREMENT:-</w:t>
+          <w:szCs w:val="22"/>
+        </w:rPr>
+        <w:t>11. CONCLUSION:-</w:t>
       </w:r>
     </w:p>
     <w:p>
       <w:pPr>
+        <w:spacing w:after="120" w:line="276" w:lineRule="auto"/>
+      </w:pPr>
+      <w:r>
+        <w:rPr>
+          <w:rFonts w:ascii="Arial" w:hAnsi="Arial" w:eastAsia="ＭＳ 明朝" w:cs="Mangal" w:eastAsiaTheme="minorEastAsia" w:csTheme="minorBidi"/>
+          <w:sz w:val="22"/>
+          <w:szCs w:val="22"/>
+        </w:rPr>
+        <w:t>Ascent.ai presents a project-based approach to programming education. By structuring the learning path directly around the student's personal project prompt, it ensures that every coding concept has a concrete application and immediate utility. The vertical-slice progression, paired with visual feedback and automated testing gates, prevents passive copying and guarantees that the learner develops a deep, working understanding of full-stack engineering.</w:t>
+      </w:r>
+    </w:p>
+    <w:p>
+      <w:pPr>
+        <w:spacing w:after="120" w:line="276" w:lineRule="auto"/>
+      </w:pPr>
+      <w:r>
+        <w:rPr>
+          <w:rFonts w:ascii="Arial" w:hAnsi="Arial" w:eastAsia="ＭＳ 明朝" w:cs="Mangal" w:eastAsiaTheme="minorEastAsia" w:csTheme="minorBidi"/>
+          <w:sz w:val="22"/>
+          <w:szCs w:val="22"/>
+        </w:rPr>
+        <w:t>Ultimately, Ascent.ai shifts the focus of computer science education from certificates to working, explainable software. It bridges the gap between learning programming languages and compiling real, interactive systems, making it an excellent candidate for academic minor projects and self-guided engineering laboratories.</w:t>
+      </w:r>
+    </w:p>
+    <w:p>
+      <w:pPr>
+        <w:keepNext/>
+        <w:spacing w:before="360" w:after="120"/>
+      </w:pPr>
+      <w:r>
+        <w:rPr>
+          <w:rFonts w:ascii="Arial" w:hAnsi="Arial" w:eastAsia="ＭＳ 明朝" w:cs="Mangal" w:eastAsiaTheme="minorEastAsia" w:csTheme="minorBidi"/>
+          <w:b/>
+          <w:bCs/>
+          <w:sz w:val="24"/>
+          <w:szCs w:val="22"/>
+        </w:rPr>
+        <w:t>12. REFERENCES:-</w:t>
+      </w:r>
+    </w:p>
+    <w:p>
+      <w:pPr>
         <w:pStyle w:val="ListBullet"/>
         <w:spacing w:after="80" w:line="276" w:lineRule="auto"/>
-      </w:pPr>
-      <w:r>
-        <w:rPr>
-          <w:rFonts w:ascii="Arial" w:hAnsi="Arial"/>
+        <w:ind w:left="360" w:hanging="360"/>
+      </w:pPr>
+      <w:r>
+        <w:rPr>
+          <w:rFonts w:ascii="Arial" w:hAnsi="Arial" w:eastAsia="ＭＳ 明朝" w:cs="Mangal" w:eastAsiaTheme="minorEastAsia" w:csTheme="minorBidi"/>
           <w:b/>
+          <w:bCs/>
           <w:sz w:val="22"/>
-        </w:rPr>
-        <w:t xml:space="preserve">Operating System: </w:t>
-      </w:r>
-      <w:r>
-        <w:rPr>
-          <w:rFonts w:ascii="Arial" w:hAnsi="Arial"/>
+          <w:szCs w:val="22"/>
+        </w:rPr>
+        <w:t xml:space="preserve">Active Pedagogy in CS Education: </w:t>
+      </w:r>
+      <w:r>
+        <w:rPr>
+          <w:rFonts w:ascii="Arial" w:hAnsi="Arial" w:eastAsia="ＭＳ 明朝" w:cs="Mangal" w:eastAsiaTheme="minorEastAsia" w:csTheme="minorBidi"/>
           <w:sz w:val="22"/>
-        </w:rPr>
-        <w:t>Cross-Platform compatibility (Windows 10/11, macOS, Linux).</w:t>
+          <w:szCs w:val="22"/>
+        </w:rPr>
+        <w:t>Prince, M. (2004). 'Does Active Learning Work? A Review of the Research.' Journal of Engineering Education, 93(3), 223-231.</w:t>
       </w:r>
     </w:p>
     <w:p>
       <w:pPr>
         <w:pStyle w:val="ListBullet"/>
         <w:spacing w:after="80" w:line="276" w:lineRule="auto"/>
-      </w:pPr>
-      <w:r>
-        <w:rPr>
-          <w:rFonts w:ascii="Arial" w:hAnsi="Arial"/>
+        <w:ind w:left="360" w:hanging="360"/>
+      </w:pPr>
+      <w:r>
+        <w:rPr>
+          <w:rFonts w:ascii="Arial" w:hAnsi="Arial" w:eastAsia="ＭＳ 明朝" w:cs="Mangal" w:eastAsiaTheme="minorEastAsia" w:csTheme="minorBidi"/>
           <w:b/>
+          <w:bCs/>
           <w:sz w:val="22"/>
-        </w:rPr>
-        <w:t xml:space="preserve">Runtime Environment: </w:t>
-      </w:r>
-      <w:r>
-        <w:rPr>
-          <w:rFonts w:ascii="Arial" w:hAnsi="Arial"/>
+          <w:szCs w:val="22"/>
+        </w:rPr>
+        <w:t xml:space="preserve">Reference Models: </w:t>
+      </w:r>
+      <w:r>
+        <w:rPr>
+          <w:rFonts w:ascii="Arial" w:hAnsi="Arial" w:eastAsia="ＭＳ 明朝" w:cs="Mangal" w:eastAsiaTheme="minorEastAsia" w:csTheme="minorBidi"/>
           <w:sz w:val="22"/>
-        </w:rPr>
-        <w:t>Node.js (v18.x or above) and Python 3.10.x.</w:t>
+          <w:szCs w:val="22"/>
+        </w:rPr>
+        <w:t>CodeCrafters System Architecture (Git-based automated tests); Boot.dev Socratic tutoring methods.</w:t>
       </w:r>
     </w:p>
     <w:p>
       <w:pPr>
         <w:pStyle w:val="ListBullet"/>
         <w:spacing w:after="80" w:line="276" w:lineRule="auto"/>
-      </w:pPr>
-      <w:r>
-        <w:rPr>
-          <w:rFonts w:ascii="Arial" w:hAnsi="Arial"/>
+        <w:ind w:left="360" w:hanging="360"/>
+      </w:pPr>
+      <w:r>
+        <w:rPr>
+          <w:rFonts w:ascii="Arial" w:hAnsi="Arial" w:eastAsia="ＭＳ 明朝" w:cs="Mangal" w:eastAsiaTheme="minorEastAsia" w:csTheme="minorBidi"/>
           <w:b/>
+          <w:bCs/>
           <w:sz w:val="22"/>
-        </w:rPr>
-        <w:t xml:space="preserve">Backend Framework: </w:t>
-      </w:r>
-      <w:r>
-        <w:rPr>
-          <w:rFonts w:ascii="Arial" w:hAnsi="Arial"/>
+          <w:szCs w:val="22"/>
+        </w:rPr>
+        <w:t xml:space="preserve">In-Browser Execution: </w:t>
+      </w:r>
+      <w:r>
+        <w:rPr>
+          <w:rFonts w:ascii="Arial" w:hAnsi="Arial" w:eastAsia="ＭＳ 明朝" w:cs="Mangal" w:eastAsiaTheme="minorEastAsia" w:csTheme="minorBidi"/>
           <w:sz w:val="22"/>
-        </w:rPr>
-        <w:t>Express.js with TypeScript support.</w:t>
+          <w:szCs w:val="22"/>
+        </w:rPr>
+        <w:t>StackBlitz WebContainers SDK documentation (Run Node.js directly in Web Assembly browsers).</w:t>
       </w:r>
     </w:p>
     <w:p>
       <w:pPr>
         <w:pStyle w:val="ListBullet"/>
         <w:spacing w:after="80" w:line="276" w:lineRule="auto"/>
-      </w:pPr>
-      <w:r>
-        <w:rPr>
-          <w:rFonts w:ascii="Arial" w:hAnsi="Arial"/>
+        <w:ind w:left="360" w:hanging="360"/>
+      </w:pPr>
+      <w:r>
+        <w:rPr>
+          <w:rFonts w:ascii="Arial" w:hAnsi="Arial" w:eastAsia="ＭＳ 明朝" w:cs="Mangal" w:eastAsiaTheme="minorEastAsia" w:csTheme="minorBidi"/>
           <w:b/>
+          <w:bCs/>
           <w:sz w:val="22"/>
-        </w:rPr>
-        <w:t xml:space="preserve">Frontend Library: </w:t>
-      </w:r>
-      <w:r>
-        <w:rPr>
-          <w:rFonts w:ascii="Arial" w:hAnsi="Arial"/>
+          <w:szCs w:val="22"/>
+        </w:rPr>
+        <w:t xml:space="preserve">AI-Generated Education Systems: </w:t>
+      </w:r>
+      <w:r>
+        <w:rPr>
+          <w:rFonts w:ascii="Arial" w:hAnsi="Arial" w:eastAsia="ＭＳ 明朝" w:cs="Mangal" w:eastAsiaTheme="minorEastAsia" w:csTheme="minorBidi"/>
           <w:sz w:val="22"/>
-        </w:rPr>
-        <w:t>React 19.x with Vite compilation server.</w:t>
-      </w:r>
-    </w:p>
-    <w:p>
-      <w:pPr>
-        <w:pStyle w:val="ListBullet"/>
-        <w:spacing w:after="80" w:line="276" w:lineRule="auto"/>
-      </w:pPr>
-      <w:r>
-        <w:rPr>
-          <w:rFonts w:ascii="Arial" w:hAnsi="Arial"/>
-          <w:b/>
-          <w:sz w:val="22"/>
-        </w:rPr>
-        <w:t xml:space="preserve">Database Management: </w:t>
-      </w:r>
-      <w:r>
-        <w:rPr>
-          <w:rFonts w:ascii="Arial" w:hAnsi="Arial"/>
-          <w:sz w:val="22"/>
-        </w:rPr>
-        <w:t>PostgreSQL (v15.0 or above) and Redis (v7.0 or above).</w:t>
-      </w:r>
-    </w:p>
-    <w:p>
-      <w:pPr>
-        <w:pStyle w:val="ListBullet"/>
-        <w:spacing w:after="80" w:line="276" w:lineRule="auto"/>
-      </w:pPr>
-      <w:r>
-        <w:rPr>
-          <w:rFonts w:ascii="Arial" w:hAnsi="Arial"/>
-          <w:b/>
-          <w:sz w:val="22"/>
-        </w:rPr>
-        <w:t xml:space="preserve">Third-Party Integrations: </w:t>
-      </w:r>
-      <w:r>
-        <w:rPr>
-          <w:rFonts w:ascii="Arial" w:hAnsi="Arial"/>
-          <w:sz w:val="22"/>
-        </w:rPr>
-        <w:t>Anthropic/OpenAI API Keys; StackBlitz WebContainers SDK / Sandpack SDK.</w:t>
-      </w:r>
-    </w:p>
-    <w:p>
-      <w:pPr>
-        <w:keepNext/>
-        <w:spacing w:before="360" w:after="120"/>
-      </w:pPr>
-      <w:r>
-        <w:rPr>
-          <w:rFonts w:ascii="Arial" w:hAnsi="Arial"/>
-          <w:b/>
-          <w:sz w:val="24"/>
-        </w:rPr>
-        <w:t>7. HARDWARE REQUIREMENT:-</w:t>
-      </w:r>
-    </w:p>
-    <w:p>
-      <w:pPr>
-        <w:pStyle w:val="ListBullet"/>
-        <w:spacing w:after="80" w:line="276" w:lineRule="auto"/>
-      </w:pPr>
-      <w:r>
-        <w:rPr>
-          <w:rFonts w:ascii="Arial" w:hAnsi="Arial"/>
-          <w:b/>
-          <w:sz w:val="22"/>
-        </w:rPr>
-        <w:t xml:space="preserve">Processor: </w:t>
-      </w:r>
-      <w:r>
-        <w:rPr>
-          <w:rFonts w:ascii="Arial" w:hAnsi="Arial"/>
-          <w:sz w:val="22"/>
-        </w:rPr>
-        <w:t>Multi-core CPU (Intel Core i5/AMD Ryzen 5, 2.4 GHz minimum or equivalent).</w:t>
-      </w:r>
-    </w:p>
-    <w:p>
-      <w:pPr>
-        <w:pStyle w:val="ListBullet"/>
-        <w:spacing w:after="80" w:line="276" w:lineRule="auto"/>
-      </w:pPr>
-      <w:r>
-        <w:rPr>
-          <w:rFonts w:ascii="Arial" w:hAnsi="Arial"/>
-          <w:b/>
-          <w:sz w:val="22"/>
-        </w:rPr>
-        <w:t xml:space="preserve">System Memory (RAM): </w:t>
-      </w:r>
-      <w:r>
-        <w:rPr>
-          <w:rFonts w:ascii="Arial" w:hAnsi="Arial"/>
-          <w:sz w:val="22"/>
-        </w:rPr>
-        <w:t>8 GB minimum (16 GB highly recommended to run Docker containers, in-browser sandboxes, and developer pipelines simultaneously).</w:t>
-      </w:r>
-    </w:p>
-    <w:p>
-      <w:pPr>
-        <w:pStyle w:val="ListBullet"/>
-        <w:spacing w:after="80" w:line="276" w:lineRule="auto"/>
-      </w:pPr>
-      <w:r>
-        <w:rPr>
-          <w:rFonts w:ascii="Arial" w:hAnsi="Arial"/>
-          <w:b/>
-          <w:sz w:val="22"/>
-        </w:rPr>
-        <w:t xml:space="preserve">Storage: </w:t>
-      </w:r>
-      <w:r>
-        <w:rPr>
-          <w:rFonts w:ascii="Arial" w:hAnsi="Arial"/>
-          <w:sz w:val="22"/>
-        </w:rPr>
-        <w:t>SSD with at least 5 GB of free space for node_modules and local project storage.</w:t>
-      </w:r>
-    </w:p>
-    <w:p>
-      <w:pPr>
-        <w:pStyle w:val="ListBullet"/>
-        <w:spacing w:after="80" w:line="276" w:lineRule="auto"/>
-      </w:pPr>
-      <w:r>
-        <w:rPr>
-          <w:rFonts w:ascii="Arial" w:hAnsi="Arial"/>
-          <w:b/>
-          <w:sz w:val="22"/>
-        </w:rPr>
-        <w:t xml:space="preserve">Network Interface: </w:t>
-      </w:r>
-      <w:r>
-        <w:rPr>
-          <w:rFonts w:ascii="Arial" w:hAnsi="Arial"/>
-          <w:sz w:val="22"/>
-        </w:rPr>
-        <w:t>Broadband internet connection with a minimum download speed of 10 Mbps for stable API communication and dependency compilation.</w:t>
-      </w:r>
-    </w:p>
-    <w:p>
-      <w:pPr>
-        <w:keepNext/>
-        <w:spacing w:before="360" w:after="120"/>
-      </w:pPr>
-      <w:r>
-        <w:rPr>
-          <w:rFonts w:ascii="Arial" w:hAnsi="Arial"/>
-          <w:b/>
-          <w:sz w:val="24"/>
-        </w:rPr>
-        <w:t>8. ADVANTAGES:-</w:t>
-      </w:r>
-    </w:p>
-    <w:p>
-      <w:pPr>
-        <w:pStyle w:val="ListBullet"/>
-        <w:spacing w:after="80" w:line="276" w:lineRule="auto"/>
-      </w:pPr>
-      <w:r>
-        <w:rPr>
-          <w:rFonts w:ascii="Arial" w:hAnsi="Arial"/>
-          <w:b/>
-          <w:sz w:val="22"/>
-        </w:rPr>
-        <w:t xml:space="preserve">Active Pedagogy over Passive Reading: </w:t>
-      </w:r>
-      <w:r>
-        <w:rPr>
-          <w:rFonts w:ascii="Arial" w:hAnsi="Arial"/>
-          <w:sz w:val="22"/>
-        </w:rPr>
-        <w:t>Drives high cognitive retention by requiring learners to construct 100% of the implementation code themselves, avoiding passive tutorial replication.</w:t>
-      </w:r>
-    </w:p>
-    <w:p>
-      <w:pPr>
-        <w:pStyle w:val="ListBullet"/>
-        <w:spacing w:after="80" w:line="276" w:lineRule="auto"/>
-      </w:pPr>
-      <w:r>
-        <w:rPr>
-          <w:rFonts w:ascii="Arial" w:hAnsi="Arial"/>
-          <w:b/>
-          <w:sz w:val="22"/>
-        </w:rPr>
-        <w:t xml:space="preserve">Highly Personalized Syllabus: </w:t>
-      </w:r>
-      <w:r>
-        <w:rPr>
-          <w:rFonts w:ascii="Arial" w:hAnsi="Arial"/>
-          <w:sz w:val="22"/>
-        </w:rPr>
-        <w:t>Enables open-ended prompt choices instead of restricting learners to pre-designed, generic coding paths.</w:t>
-      </w:r>
-    </w:p>
-    <w:p>
-      <w:pPr>
-        <w:pStyle w:val="ListBullet"/>
-        <w:spacing w:after="80" w:line="276" w:lineRule="auto"/>
-      </w:pPr>
-      <w:r>
-        <w:rPr>
-          <w:rFonts w:ascii="Arial" w:hAnsi="Arial"/>
-          <w:b/>
-          <w:sz w:val="22"/>
-        </w:rPr>
-        <w:t xml:space="preserve">Gatekeeping via Automated Testing: </w:t>
-      </w:r>
-      <w:r>
-        <w:rPr>
-          <w:rFonts w:ascii="Arial" w:hAnsi="Arial"/>
-          <w:sz w:val="22"/>
-        </w:rPr>
-        <w:t>Uses unit tests to check syntax correctness, ensuring progress is gated based on working code, not eyeballed evaluations.</w:t>
-      </w:r>
-    </w:p>
-    <w:p>
-      <w:pPr>
-        <w:pStyle w:val="ListBullet"/>
-        <w:spacing w:after="80" w:line="276" w:lineRule="auto"/>
-      </w:pPr>
-      <w:r>
-        <w:rPr>
-          <w:rFonts w:ascii="Arial" w:hAnsi="Arial"/>
-          <w:b/>
-          <w:sz w:val="22"/>
-        </w:rPr>
-        <w:t xml:space="preserve">Vertical-Slice Progress Motivation: </w:t>
-      </w:r>
-      <w:r>
-        <w:rPr>
-          <w:rFonts w:ascii="Arial" w:hAnsi="Arial"/>
-          <w:sz w:val="22"/>
-        </w:rPr>
-        <w:t>Delivers visual feedback by keeping sections organized around tangible screen panels, helping learners maintain interest.</w:t>
-      </w:r>
-    </w:p>
-    <w:p>
-      <w:pPr>
-        <w:pStyle w:val="ListBullet"/>
-        <w:spacing w:after="80" w:line="276" w:lineRule="auto"/>
-      </w:pPr>
-      <w:r>
-        <w:rPr>
-          <w:rFonts w:ascii="Arial" w:hAnsi="Arial"/>
-          <w:b/>
-          <w:sz w:val="22"/>
-        </w:rPr>
-        <w:t xml:space="preserve">Secure Verification Loop: </w:t>
-      </w:r>
-      <w:r>
-        <w:rPr>
-          <w:rFonts w:ascii="Arial" w:hAnsi="Arial"/>
-          <w:sz w:val="22"/>
-        </w:rPr>
-        <w:t>Combines client sandboxes with server-side validation to ensure academic honesty and robustness.</w:t>
-      </w:r>
-    </w:p>
-    <w:p>
-      <w:pPr>
-        <w:keepNext/>
-        <w:spacing w:before="360" w:after="120"/>
-      </w:pPr>
-      <w:r>
-        <w:rPr>
-          <w:rFonts w:ascii="Arial" w:hAnsi="Arial"/>
-          <w:b/>
-          <w:sz w:val="24"/>
-        </w:rPr>
-        <w:t>9. APPLICATIONS:-</w:t>
-      </w:r>
-    </w:p>
-    <w:p>
-      <w:pPr>
-        <w:pStyle w:val="ListBullet"/>
-        <w:spacing w:after="80" w:line="276" w:lineRule="auto"/>
-      </w:pPr>
-      <w:r>
-        <w:rPr>
-          <w:rFonts w:ascii="Arial" w:hAnsi="Arial"/>
-          <w:b/>
-          <w:sz w:val="22"/>
-        </w:rPr>
-        <w:t xml:space="preserve">Academic Minor &amp; Major Projects: </w:t>
-      </w:r>
-      <w:r>
-        <w:rPr>
-          <w:rFonts w:ascii="Arial" w:hAnsi="Arial"/>
-          <w:sz w:val="22"/>
-        </w:rPr>
-        <w:t>Provides students in engineering colleges with a guided tool to develop their academic deliverables while simultaneously learning their stack.</w:t>
-      </w:r>
-    </w:p>
-    <w:p>
-      <w:pPr>
-        <w:pStyle w:val="ListBullet"/>
-        <w:spacing w:after="80" w:line="276" w:lineRule="auto"/>
-      </w:pPr>
-      <w:r>
-        <w:rPr>
-          <w:rFonts w:ascii="Arial" w:hAnsi="Arial"/>
-          <w:b/>
-          <w:sz w:val="22"/>
-        </w:rPr>
-        <w:t xml:space="preserve">Career Shift &amp; Professional Upskilling: </w:t>
-      </w:r>
-      <w:r>
-        <w:rPr>
-          <w:rFonts w:ascii="Arial" w:hAnsi="Arial"/>
-          <w:sz w:val="22"/>
-        </w:rPr>
-        <w:t>Helps junior developers learn modern web development patterns by building actual portfolio-ready systems.</w:t>
-      </w:r>
-    </w:p>
-    <w:p>
-      <w:pPr>
-        <w:pStyle w:val="ListBullet"/>
-        <w:spacing w:after="80" w:line="276" w:lineRule="auto"/>
-      </w:pPr>
-      <w:r>
-        <w:rPr>
-          <w:rFonts w:ascii="Arial" w:hAnsi="Arial"/>
-          <w:b/>
-          <w:sz w:val="22"/>
-        </w:rPr>
-        <w:t xml:space="preserve">Interactive Coding Bootcamps: </w:t>
-      </w:r>
-      <w:r>
-        <w:rPr>
-          <w:rFonts w:ascii="Arial" w:hAnsi="Arial"/>
-          <w:sz w:val="22"/>
-        </w:rPr>
-        <w:t>Acts as a virtual lab environment for coding bootcamps to scale lesson generation and automated test verification.</w:t>
-      </w:r>
-    </w:p>
-    <w:p>
-      <w:pPr>
-        <w:pStyle w:val="ListBullet"/>
-        <w:spacing w:after="80" w:line="276" w:lineRule="auto"/>
-      </w:pPr>
-      <w:r>
-        <w:rPr>
-          <w:rFonts w:ascii="Arial" w:hAnsi="Arial"/>
-          <w:b/>
-          <w:sz w:val="22"/>
-        </w:rPr>
-        <w:t xml:space="preserve">Rapid Scaffolding &amp; Prototyping: </w:t>
-      </w:r>
-      <w:r>
-        <w:rPr>
-          <w:rFonts w:ascii="Arial" w:hAnsi="Arial"/>
-          <w:sz w:val="22"/>
-        </w:rPr>
-        <w:t>Can be utilized by developers to plan complex screen files, structures, and schemas based on custom system roadmaps.</w:t>
-      </w:r>
-    </w:p>
-    <w:p>
-      <w:pPr>
-        <w:keepNext/>
-        <w:spacing w:before="360" w:after="120"/>
-      </w:pPr>
-      <w:r>
-        <w:rPr>
-          <w:rFonts w:ascii="Arial" w:hAnsi="Arial"/>
-          <w:b/>
-          <w:sz w:val="24"/>
-        </w:rPr>
-        <w:t>10. FUTURE SCOPE OF THE PROJECT:-</w:t>
-      </w:r>
-    </w:p>
-    <w:p>
-      <w:pPr>
-        <w:pStyle w:val="ListBullet"/>
-        <w:spacing w:after="80" w:line="276" w:lineRule="auto"/>
-      </w:pPr>
-      <w:r>
-        <w:rPr>
-          <w:rFonts w:ascii="Arial" w:hAnsi="Arial"/>
-          <w:b/>
-          <w:sz w:val="22"/>
-        </w:rPr>
-        <w:t xml:space="preserve">Adaptive Difficulty Controller: </w:t>
-      </w:r>
-      <w:r>
-        <w:rPr>
-          <w:rFonts w:ascii="Arial" w:hAnsi="Arial"/>
-          <w:sz w:val="22"/>
-        </w:rPr>
-        <w:t>Implement an LLM feedback loop that analyzes student errors, styling mistakes, and completion speeds to dynamically modify hints and curriculum pacing.</w:t>
-      </w:r>
-    </w:p>
-    <w:p>
-      <w:pPr>
-        <w:pStyle w:val="ListBullet"/>
-        <w:spacing w:after="80" w:line="276" w:lineRule="auto"/>
-      </w:pPr>
-      <w:r>
-        <w:rPr>
-          <w:rFonts w:ascii="Arial" w:hAnsi="Arial"/>
-          <w:b/>
-          <w:sz w:val="22"/>
-        </w:rPr>
-        <w:t xml:space="preserve">Hybrid Content Architecture: </w:t>
-      </w:r>
-      <w:r>
-        <w:rPr>
-          <w:rFonts w:ascii="Arial" w:hAnsi="Arial"/>
-          <w:sz w:val="22"/>
-        </w:rPr>
-        <w:t>Combine an open-source library of pre-compiled, verified modules with generative components to reduce API hosting costs and improve explanation accuracy.</w:t>
-      </w:r>
-    </w:p>
-    <w:p>
-      <w:pPr>
-        <w:pStyle w:val="ListBullet"/>
-        <w:spacing w:after="80" w:line="276" w:lineRule="auto"/>
-      </w:pPr>
-      <w:r>
-        <w:rPr>
-          <w:rFonts w:ascii="Arial" w:hAnsi="Arial"/>
-          <w:b/>
-          <w:sz w:val="22"/>
-        </w:rPr>
-        <w:t xml:space="preserve">Collaborative Multiplayer Coding: </w:t>
-      </w:r>
-      <w:r>
-        <w:rPr>
-          <w:rFonts w:ascii="Arial" w:hAnsi="Arial"/>
-          <w:sz w:val="22"/>
-        </w:rPr>
-        <w:t>Integrate WebRTC-based live coding rooms, allowing multiple students or student-mentor teams to collaborate in the same sandbox.</w:t>
-      </w:r>
-    </w:p>
-    <w:p>
-      <w:pPr>
-        <w:pStyle w:val="ListBullet"/>
-        <w:spacing w:after="80" w:line="276" w:lineRule="auto"/>
-      </w:pPr>
-      <w:r>
-        <w:rPr>
-          <w:rFonts w:ascii="Arial" w:hAnsi="Arial"/>
-          <w:b/>
-          <w:sz w:val="22"/>
-        </w:rPr>
-        <w:t xml:space="preserve">Automated Git Sync &amp; Cloud Deployment: </w:t>
-      </w:r>
-      <w:r>
-        <w:rPr>
-          <w:rFonts w:ascii="Arial" w:hAnsi="Arial"/>
-          <w:sz w:val="22"/>
-        </w:rPr>
-        <w:t>Extend the sandbox to commit progress directly to GitHub and deploy the final build to hosting providers (Vercel, Netlify, Render).</w:t>
-      </w:r>
-    </w:p>
-    <w:p>
-      <w:pPr>
-        <w:keepNext/>
-        <w:spacing w:before="360" w:after="120"/>
-      </w:pPr>
-      <w:r>
-        <w:rPr>
-          <w:rFonts w:ascii="Arial" w:hAnsi="Arial"/>
-          <w:b/>
-          <w:sz w:val="24"/>
-        </w:rPr>
-        <w:t>11. CONCLUSION:-</w:t>
-      </w:r>
-    </w:p>
-    <w:p>
-      <w:pPr>
-        <w:spacing w:after="120" w:line="276" w:lineRule="auto"/>
-      </w:pPr>
-      <w:r>
-        <w:rPr>
-          <w:rFonts w:ascii="Arial" w:hAnsi="Arial"/>
-          <w:sz w:val="22"/>
-        </w:rPr>
-        <w:t>Ascent.ai presents a project-based approach to programming education. By structuring the learning path directly around the student's personal project prompt, it ensures that every coding concept has a concrete application and immediate utility. The vertical-slice progression, paired with visual feedback and automated testing gates, prevents passive copying and guarantees that the learner develops a deep, working understanding of full-stack engineering.</w:t>
-      </w:r>
-    </w:p>
-    <w:p>
-      <w:pPr>
-        <w:spacing w:after="120" w:line="276" w:lineRule="auto"/>
-      </w:pPr>
-      <w:r>
-        <w:rPr>
-          <w:rFonts w:ascii="Arial" w:hAnsi="Arial"/>
-          <w:sz w:val="22"/>
-        </w:rPr>
-        <w:t>Ultimately, Ascent.ai shifts the focus of computer science education from certificates to working, explainable software. It bridges the gap between learning programming languages and compiling real, interactive systems, making it an excellent candidate for academic minor projects and self-guided engineering laboratories.</w:t>
-      </w:r>
-    </w:p>
-    <w:p>
-      <w:pPr>
-        <w:keepNext/>
-        <w:spacing w:before="360" w:after="120"/>
-      </w:pPr>
-      <w:r>
-        <w:rPr>
-          <w:rFonts w:ascii="Arial" w:hAnsi="Arial"/>
-          <w:b/>
-          <w:sz w:val="24"/>
-        </w:rPr>
-        <w:t>12. REFERENCES:-</w:t>
-      </w:r>
-    </w:p>
-    <w:p>
-      <w:pPr>
-        <w:pStyle w:val="ListBullet"/>
-        <w:spacing w:after="80" w:line="276" w:lineRule="auto"/>
-      </w:pPr>
-      <w:r>
-        <w:rPr>
-          <w:rFonts w:ascii="Arial" w:hAnsi="Arial"/>
-          <w:b/>
-          <w:sz w:val="22"/>
-        </w:rPr>
-        <w:t xml:space="preserve">Active Pedagogy in CS Education: </w:t>
-      </w:r>
-      <w:r>
-        <w:rPr>
-          <w:rFonts w:ascii="Arial" w:hAnsi="Arial"/>
-          <w:sz w:val="22"/>
-        </w:rPr>
-        <w:t>Prince, M. (2004). 'Does Active Learning Work? A Review of the Research.' Journal of Engineering Education, 93(3), 223-231.</w:t>
-      </w:r>
-    </w:p>
-    <w:p>
-      <w:pPr>
-        <w:pStyle w:val="ListBullet"/>
-        <w:spacing w:after="80" w:line="276" w:lineRule="auto"/>
-      </w:pPr>
-      <w:r>
-        <w:rPr>
-          <w:rFonts w:ascii="Arial" w:hAnsi="Arial"/>
-          <w:b/>
-          <w:sz w:val="22"/>
-        </w:rPr>
-        <w:t xml:space="preserve">Reference Models: </w:t>
-      </w:r>
-      <w:r>
-        <w:rPr>
-          <w:rFonts w:ascii="Arial" w:hAnsi="Arial"/>
-          <w:sz w:val="22"/>
-        </w:rPr>
-        <w:t>CodeCrafters System Architecture (Git-based automated tests); Boot.dev Socratic tutoring methods.</w:t>
-      </w:r>
-    </w:p>
-    <w:p>
-      <w:pPr>
-        <w:pStyle w:val="ListBullet"/>
-        <w:spacing w:after="80" w:line="276" w:lineRule="auto"/>
-      </w:pPr>
-      <w:r>
-        <w:rPr>
-          <w:rFonts w:ascii="Arial" w:hAnsi="Arial"/>
-          <w:b/>
-          <w:sz w:val="22"/>
-        </w:rPr>
-        <w:t xml:space="preserve">In-Browser Execution: </w:t>
-      </w:r>
-      <w:r>
-        <w:rPr>
-          <w:rFonts w:ascii="Arial" w:hAnsi="Arial"/>
-          <w:sz w:val="22"/>
-        </w:rPr>
-        <w:t>StackBlitz WebContainers SDK documentation (Run Node.js directly in Web Assembly browsers).</w:t>
-      </w:r>
-    </w:p>
-    <w:p>
-      <w:pPr>
-        <w:pStyle w:val="ListBullet"/>
-        <w:spacing w:after="80" w:line="276" w:lineRule="auto"/>
-      </w:pPr>
-      <w:r>
-        <w:rPr>
-          <w:rFonts w:ascii="Arial" w:hAnsi="Arial"/>
-          <w:b/>
-          <w:sz w:val="22"/>
-        </w:rPr>
-        <w:t xml:space="preserve">AI-Generated Education Systems: </w:t>
-      </w:r>
-      <w:r>
-        <w:rPr>
-          <w:rFonts w:ascii="Arial" w:hAnsi="Arial"/>
-          <w:sz w:val="22"/>
+          <w:szCs w:val="22"/>
         </w:rPr>
         <w:t>Codecademy AI Builder concept briefs (Reverse-engineering syllabus paths from AI prototypes).</w:t>
       </w:r>
@@ -1902,7 +2070,6 @@
     <w:sectPr>
       <w:pgSz w:w="12240" w:h="15840"/>
       <w:pgMar w:top="1008" w:right="1224" w:bottom="1008" w:left="1224" w:header="720" w:footer="720" w:gutter="0"/>
-      <w:cols w:space="720"/>
       <w:docGrid w:linePitch="360"/>
     </w:sectPr>
   </w:body>

</xml_diff>